<commit_message>
Expand golf estate business plan: security/gatehouse, BQ per duplex, hospital+school, investor proposition (25 pages)
</commit_message>
<xml_diff>
--- a/golf-estate/The_77_Golf_and_Country_Estate_Business_Plan.docx
+++ b/golf-estate/The_77_Golf_and_Country_Estate_Business_Plan.docx
@@ -274,7 +274,7 @@
           <w:sz w:val="24"/>
           <w:szCs w:val="24"/>
         </w:rPr>
-        <w:t xml:space="preserve">5. Development Phasing &amp; Timeline</w:t>
+        <w:t xml:space="preserve">5. World-Class Amenities, Security &amp; Infrastructure</w:t>
       </w:r>
     </w:p>
     <w:p>
@@ -290,7 +290,7 @@
           <w:sz w:val="24"/>
           <w:szCs w:val="24"/>
         </w:rPr>
-        <w:t xml:space="preserve">6. Market Analysis &amp; Target Buyers</w:t>
+        <w:t xml:space="preserve">6. International &amp; Local Investor Proposition</w:t>
       </w:r>
     </w:p>
     <w:p>
@@ -306,7 +306,7 @@
           <w:sz w:val="24"/>
           <w:szCs w:val="24"/>
         </w:rPr>
-        <w:t xml:space="preserve">7. Financial Plan</w:t>
+        <w:t xml:space="preserve">7. Development Phasing &amp; Timeline</w:t>
       </w:r>
     </w:p>
     <w:p>
@@ -322,7 +322,7 @@
           <w:sz w:val="24"/>
           <w:szCs w:val="24"/>
         </w:rPr>
-        <w:t xml:space="preserve">8. Profitability Analysis</w:t>
+        <w:t xml:space="preserve">8. Market Analysis &amp; Target Buyers</w:t>
       </w:r>
     </w:p>
     <w:p>
@@ -338,7 +338,7 @@
           <w:sz w:val="24"/>
           <w:szCs w:val="24"/>
         </w:rPr>
-        <w:t xml:space="preserve">9. Legal, Regulatory &amp; Land Title Framework</w:t>
+        <w:t xml:space="preserve">9. Financial Plan</w:t>
       </w:r>
     </w:p>
     <w:p>
@@ -354,7 +354,7 @@
           <w:sz w:val="24"/>
           <w:szCs w:val="24"/>
         </w:rPr>
-        <w:t xml:space="preserve">10. Marketing &amp; Sales Strategy</w:t>
+        <w:t xml:space="preserve">10. Profitability Analysis</w:t>
       </w:r>
     </w:p>
     <w:p>
@@ -370,7 +370,7 @@
           <w:sz w:val="24"/>
           <w:szCs w:val="24"/>
         </w:rPr>
-        <w:t xml:space="preserve">11. Organizational Structure &amp; Management</w:t>
+        <w:t xml:space="preserve">11. Legal, Regulatory &amp; Land Title Framework</w:t>
       </w:r>
     </w:p>
     <w:p>
@@ -386,7 +386,7 @@
           <w:sz w:val="24"/>
           <w:szCs w:val="24"/>
         </w:rPr>
-        <w:t xml:space="preserve">12. SWOT Analysis</w:t>
+        <w:t xml:space="preserve">12. Marketing &amp; Sales Strategy</w:t>
       </w:r>
     </w:p>
     <w:p>
@@ -402,7 +402,7 @@
           <w:sz w:val="24"/>
           <w:szCs w:val="24"/>
         </w:rPr>
-        <w:t xml:space="preserve">13. Risk Analysis &amp; Mitigation</w:t>
+        <w:t xml:space="preserve">13. Organizational Structure &amp; Management</w:t>
       </w:r>
     </w:p>
     <w:p>
@@ -418,7 +418,7 @@
           <w:sz w:val="24"/>
           <w:szCs w:val="24"/>
         </w:rPr>
-        <w:t xml:space="preserve">14. Exit Strategy &amp; Long-Term Value Creation</w:t>
+        <w:t xml:space="preserve">14. SWOT Analysis</w:t>
       </w:r>
     </w:p>
     <w:p>
@@ -434,7 +434,39 @@
           <w:sz w:val="24"/>
           <w:szCs w:val="24"/>
         </w:rPr>
-        <w:t xml:space="preserve">15. Implementation Roadmap &amp; Conclusion</w:t>
+        <w:t xml:space="preserve">15. Risk Analysis &amp; Mitigation</w:t>
+      </w:r>
+    </w:p>
+    <w:p>
+      <w:pPr>
+        <w:tabs>
+          <w:tab w:val="right" w:pos="9026"/>
+        </w:tabs>
+        <w:spacing w:after="140"/>
+      </w:pPr>
+      <w:r>
+        <w:rPr>
+          <w:color w:val="0F2A3D"/>
+          <w:sz w:val="24"/>
+          <w:szCs w:val="24"/>
+        </w:rPr>
+        <w:t xml:space="preserve">16. Exit Strategy &amp; Long-Term Value Creation</w:t>
+      </w:r>
+    </w:p>
+    <w:p>
+      <w:pPr>
+        <w:tabs>
+          <w:tab w:val="right" w:pos="9026"/>
+        </w:tabs>
+        <w:spacing w:after="140"/>
+      </w:pPr>
+      <w:r>
+        <w:rPr>
+          <w:color w:val="0F2A3D"/>
+          <w:sz w:val="24"/>
+          <w:szCs w:val="24"/>
+        </w:rPr>
+        <w:t xml:space="preserve">17. Implementation Roadmap &amp; Conclusion</w:t>
       </w:r>
     </w:p>
     <w:p>
@@ -855,7 +887,7 @@
                 <w:sz w:val="20"/>
                 <w:szCs w:val="20"/>
               </w:rPr>
-              <w:t xml:space="preserve">100 units — 4-bedroom, 500 sqm plots</w:t>
+              <w:t xml:space="preserve">100 units — 4-bedroom, 500 sqm plots, each with a 2-bedroom self-contained BQ</w:t>
             </w:r>
           </w:p>
         </w:tc>
@@ -1835,7 +1867,7 @@
                 <w:sz w:val="20"/>
                 <w:szCs w:val="20"/>
               </w:rPr>
-              <w:t xml:space="preserve">Phase 3 — Hospital &amp; Apartments</w:t>
+              <w:t xml:space="preserve">Phase 3 — Hospital, School &amp; Apartments</w:t>
             </w:r>
           </w:p>
         </w:tc>
@@ -2174,7 +2206,7 @@
         <w:spacing w:after="90"/>
       </w:pPr>
       <w:r>
-        <w:t xml:space="preserve">Private back garden</w:t>
+        <w:t xml:space="preserve">A 2-bedroom, fully self-contained servant quarters (BQ) per duplex, with its own kitchenette, bathroom and private entrance, separate from the main house</w:t>
       </w:r>
     </w:p>
     <w:p>
@@ -2187,7 +2219,7 @@
         <w:spacing w:after="90"/>
       </w:pPr>
       <w:r>
-        <w:t xml:space="preserve">Landscaped front lawn</w:t>
+        <w:t xml:space="preserve">Private back garden</w:t>
       </w:r>
     </w:p>
     <w:p>
@@ -2200,7 +2232,36 @@
         <w:spacing w:after="90"/>
       </w:pPr>
       <w:r>
+        <w:t xml:space="preserve">Landscaped front lawn</w:t>
+      </w:r>
+    </w:p>
+    <w:p>
+      <w:pPr>
+        <w:pStyle w:val="ListParagraph"/>
+        <w:numPr>
+          <w:ilvl w:val="0"/>
+          <w:numId w:val="2"/>
+        </w:numPr>
+        <w:spacing w:after="90"/>
+      </w:pPr>
+      <w:r>
         <w:t xml:space="preserve">Direct or near-direct frontage onto the golf course where plot layout allows</w:t>
+      </w:r>
+    </w:p>
+    <w:p>
+      <w:pPr>
+        <w:spacing w:after="160" w:line="300"/>
+        <w:jc w:val="both"/>
+      </w:pPr>
+      <w:r>
+        <w:rPr>
+          <w:i/>
+          <w:iCs/>
+          <w:color w:val="6B6B6B"/>
+          <w:sz w:val="18"/>
+          <w:szCs w:val="18"/>
+        </w:rPr>
+        <w:t xml:space="preserve">Fitting a 2-bedroom self-contained BQ onto the same 500 sqm plot as the main 4-bedroom duplex is achievable with careful massing (a compact single-storey BQ block to the rear or side of the plot), but it will meaningfully reduce garden/lawn area versus a BQ-free layout. This trade-off should be confirmed with the architect at detailed design stage; if more generous outdoor space is required, the plot size may need to increase beyond 500 sqm for some or all units.</w:t>
       </w:r>
     </w:p>
     <w:p>
@@ -2289,7 +2350,7 @@
         <w:spacing w:after="120" w:before="200"/>
       </w:pPr>
       <w:r>
-        <w:t xml:space="preserve">4.4 Phase 3 — Hospital, Apartments &amp; Expansion</w:t>
+        <w:t xml:space="preserve">4.4 Phase 3 — Hospital, School &amp; Expansion</w:t>
       </w:r>
     </w:p>
     <w:p>
@@ -2298,7 +2359,7 @@
         <w:jc w:val="both"/>
       </w:pPr>
       <w:r>
-        <w:t xml:space="preserve">A private hospital/wellness facility and additional apartment blocks complete the estate's four-pillar concept, extending the addressable market to healthcare users and smaller-household buyers not served by the Phase 1 duplex product.</w:t>
+        <w:t xml:space="preserve">A private hospital/wellness facility, an international-standard school, and additional apartment blocks complete the estate's four-pillar concept, extending the addressable market to healthcare users, families with school-age children, and smaller-household buyers not served by the Phase 1 duplex product. Together with the golf course, clubhouse and hotel, this gives the estate the full amenity set expected of a world-class luxury community rather than a purely residential development.</w:t>
       </w:r>
     </w:p>
     <w:p>
@@ -2312,7 +2373,7 @@
         <w:spacing w:after="160" w:before="120"/>
       </w:pPr>
       <w:r>
-        <w:t xml:space="preserve">5. Development Phasing &amp; Timeline</w:t>
+        <w:t xml:space="preserve">5. World-Class Amenities, Security &amp; Infrastructure</w:t>
       </w:r>
     </w:p>
     <w:p>
@@ -2321,7 +2382,7 @@
         <w:jc w:val="both"/>
       </w:pPr>
       <w:r>
-        <w:t xml:space="preserve">The project is deliberately phased to reduce upfront capital exposure and let early property and land sales finance later construction — rather than requiring the full development cost upfront.</w:t>
+        <w:t xml:space="preserve">To compete for both international and local capital, the estate is designed to match the amenity and security standard of benchmark luxury golf estates globally, not just the local Abuja market.</w:t>
       </w:r>
     </w:p>
     <w:p>
@@ -2330,52 +2391,46 @@
         <w:spacing w:after="120" w:before="200"/>
       </w:pPr>
       <w:r>
-        <w:t xml:space="preserve">Phase 1 (Months 0–12)</w:t>
-      </w:r>
-    </w:p>
-    <w:p>
-      <w:pPr>
-        <w:spacing w:after="160" w:line="300"/>
-        <w:jc w:val="both"/>
-      </w:pPr>
-      <w:r>
-        <w:t xml:space="preserve">Golf course construction, clubhouse, site infrastructure (roads, drainage, power, water) and the first tranche of luxury duplexes. Site-and-serviced plots are marketed and sold in parallel to generate early cash flow.</w:t>
-      </w:r>
-    </w:p>
-    <w:p>
-      <w:pPr>
-        <w:pStyle w:val="Heading2"/>
-        <w:spacing w:after="120" w:before="200"/>
-      </w:pPr>
-      <w:r>
-        <w:t xml:space="preserve">Phase 2 (Months 10–22)</w:t>
-      </w:r>
-    </w:p>
-    <w:p>
-      <w:pPr>
-        <w:spacing w:after="160" w:line="300"/>
-        <w:jc w:val="both"/>
-      </w:pPr>
-      <w:r>
-        <w:t xml:space="preserve">Development of the boutique hotel and shopping village, funded substantially from Phase 1 land sale proceeds and initial duplex handovers.</w:t>
-      </w:r>
-    </w:p>
-    <w:p>
-      <w:pPr>
-        <w:pStyle w:val="Heading2"/>
-        <w:spacing w:after="120" w:before="200"/>
-      </w:pPr>
-      <w:r>
-        <w:t xml:space="preserve">Phase 3 (Months 20–34)</w:t>
-      </w:r>
-    </w:p>
-    <w:p>
-      <w:pPr>
-        <w:spacing w:after="160" w:line="300"/>
-        <w:jc w:val="both"/>
-      </w:pPr>
-      <w:r>
-        <w:t xml:space="preserve">Hospital/wellness facility, additional apartment blocks and any further expansion, funded from cumulative estate revenue and operating income from Phase 2 hospitality/retail assets.</w:t>
+        <w:t xml:space="preserve">5.1 Perimeter Security &amp; Access Control</w:t>
+      </w:r>
+    </w:p>
+    <w:p>
+      <w:pPr>
+        <w:pStyle w:val="ListParagraph"/>
+        <w:numPr>
+          <w:ilvl w:val="0"/>
+          <w:numId w:val="2"/>
+        </w:numPr>
+        <w:spacing w:after="90"/>
+      </w:pPr>
+      <w:r>
+        <w:t xml:space="preserve">Full perimeter wall and fencing around the entire 77-hectare site, with anti-climb detailing and CCTV coverage.</w:t>
+      </w:r>
+    </w:p>
+    <w:p>
+      <w:pPr>
+        <w:pStyle w:val="ListParagraph"/>
+        <w:numPr>
+          <w:ilvl w:val="0"/>
+          <w:numId w:val="2"/>
+        </w:numPr>
+        <w:spacing w:after="90"/>
+      </w:pPr>
+      <w:r>
+        <w:t xml:space="preserve">A landmark, architecturally distinctive gatehouse at the main entrance, manned 24/7, with visitor registration, vehicle screening and a dedicated staff/service entrance separate from the resident/visitor gate.</w:t>
+      </w:r>
+    </w:p>
+    <w:p>
+      <w:pPr>
+        <w:pStyle w:val="ListParagraph"/>
+        <w:numPr>
+          <w:ilvl w:val="0"/>
+          <w:numId w:val="2"/>
+        </w:numPr>
+        <w:spacing w:after="90"/>
+      </w:pPr>
+      <w:r>
+        <w:t xml:space="preserve">Estate-wide security patrols, perimeter lighting and a central security control room linked to the clubhouse, hotel and residential zones.</w:t>
       </w:r>
     </w:p>
     <w:p>
@@ -2386,9 +2441,9 @@
       <w:r>
         <w:drawing>
           <wp:inline distT="0" distB="0" distL="0" distR="0">
-            <wp:extent cx="4381500" cy="2476500"/>
+            <wp:extent cx="4000500" cy="2857500"/>
             <wp:effectExtent t="0" r="0" b="0" l="0"/>
-            <wp:docPr id="1" name="Phased development timeline" descr="Phased development timeline" title="Phased development timeline"/>
+            <wp:docPr id="1" name="Conceptual render of the estate gatehouse and entrance" descr="Conceptual render of the estate gatehouse and entrance" title="Conceptual render of the estate gatehouse and entrance"/>
             <wp:cNvGraphicFramePr>
               <a:graphicFrameLocks xmlns:a="http://schemas.openxmlformats.org/drawingml/2006/main" noChangeAspect="1"/>
             </wp:cNvGraphicFramePr>
@@ -2411,7 +2466,7 @@
                   <pic:spPr bwMode="auto">
                     <a:xfrm>
                       <a:off x="0" y="0"/>
-                      <a:ext cx="4381500" cy="2476500"/>
+                      <a:ext cx="4000500" cy="2857500"/>
                     </a:xfrm>
                     <a:prstGeom prst="rect">
                       <a:avLst/>
@@ -2437,21 +2492,7 @@
           <w:sz w:val="18"/>
           <w:szCs w:val="18"/>
         </w:rPr>
-        <w:t xml:space="preserve">Figure 3 — Indicative phased development timeline (months from project launch)</w:t>
-      </w:r>
-    </w:p>
-    <w:p>
-      <w:r>
-        <w:br w:type="page"/>
-      </w:r>
-    </w:p>
-    <w:p>
-      <w:pPr>
-        <w:pStyle w:val="Heading1"/>
-        <w:spacing w:after="160" w:before="120"/>
-      </w:pPr>
-      <w:r>
-        <w:t xml:space="preserve">6. Market Analysis &amp; Target Buyers</w:t>
+        <w:t xml:space="preserve">Figure 7 — Conceptual render of the estate's gatehouse and main entrance (indicative only)</w:t>
       </w:r>
     </w:p>
     <w:p>
@@ -2460,7 +2501,7 @@
         <w:spacing w:after="120" w:before="200"/>
       </w:pPr>
       <w:r>
-        <w:t xml:space="preserve">6.1 Demand Drivers</w:t>
+        <w:t xml:space="preserve">5.2 Parking &amp; Vertical Infrastructure</w:t>
       </w:r>
     </w:p>
     <w:p>
@@ -2473,7 +2514,7 @@
         <w:spacing w:after="90"/>
       </w:pPr>
       <w:r>
-        <w:t xml:space="preserve">Abuja's persistent housing deficit at the upper end of the market, particularly for large-format, secure, amenity-rich residences.</w:t>
+        <w:t xml:space="preserve">Basement car parking beneath the clubhouse, hotel and shopping village, reducing surface parking footprint and preserving landscaped and recreational areas at ground level.</w:t>
       </w:r>
     </w:p>
     <w:p>
@@ -2486,7 +2527,16 @@
         <w:spacing w:after="90"/>
       </w:pPr>
       <w:r>
-        <w:t xml:space="preserve">Scarcity of genuine golf-anchored residential estates in Nigeria, limiting direct like-for-like competition.</w:t>
+        <w:t xml:space="preserve">Each duplex retains a minimum of 2 dedicated surface parking spaces as specified in Section 4.2, in addition to estate-wide visitor parking near the gatehouse and clubhouse.</w:t>
+      </w:r>
+    </w:p>
+    <w:p>
+      <w:pPr>
+        <w:pStyle w:val="Heading2"/>
+        <w:spacing w:after="120" w:before="200"/>
+      </w:pPr>
+      <w:r>
+        <w:t xml:space="preserve">5.3 Full Lifestyle &amp; Community Amenity Set</w:t>
       </w:r>
     </w:p>
     <w:p>
@@ -2499,7 +2549,7 @@
         <w:spacing w:after="90"/>
       </w:pPr>
       <w:r>
-        <w:t xml:space="preserve">Growing demand among Nigerian diaspora, senior professionals and business owners for a lifestyle-led, gated community within reach of the capital.</w:t>
+        <w:t xml:space="preserve">Golf course, clubhouse, practice range and pro-shop (Phase 1).</w:t>
       </w:r>
     </w:p>
     <w:p>
@@ -2512,16 +2562,7 @@
         <w:spacing w:after="90"/>
       </w:pPr>
       <w:r>
-        <w:t xml:space="preserve">Bwari's expanding infrastructure and relative land availability compared to the congested FCT core.</w:t>
-      </w:r>
-    </w:p>
-    <w:p>
-      <w:pPr>
-        <w:pStyle w:val="Heading2"/>
-        <w:spacing w:after="120" w:before="200"/>
-      </w:pPr>
-      <w:r>
-        <w:t xml:space="preserve">6.2 Target Buyer Segments</w:t>
+        <w:t xml:space="preserve">Boutique hotel and open-air shopping village (Phase 2).</w:t>
       </w:r>
     </w:p>
     <w:p>
@@ -2534,7 +2575,7 @@
         <w:spacing w:after="90"/>
       </w:pPr>
       <w:r>
-        <w:t xml:space="preserve">High-net-worth individuals and senior executives resident in Abuja seeking a premium, secure, lifestyle-oriented address.</w:t>
+        <w:t xml:space="preserve">Private hospital/wellness facility and an international-standard school (Phase 3), so residents' healthcare and education needs are met within the estate.</w:t>
       </w:r>
     </w:p>
     <w:p>
@@ -2547,7 +2588,7 @@
         <w:spacing w:after="90"/>
       </w:pPr>
       <w:r>
-        <w:t xml:space="preserve">Nigerian diaspora investors purchasing a home or investment property for eventual return or rental income.</w:t>
+        <w:t xml:space="preserve">Swimming pool, gymnasium/spa, sports courts, children's play areas, jogging and cycling trails, and an event/banquet centre for weddings and functions.</w:t>
       </w:r>
     </w:p>
     <w:p>
@@ -2560,7 +2601,48 @@
         <w:spacing w:after="90"/>
       </w:pPr>
       <w:r>
-        <w:t xml:space="preserve">Land and site-and-service plot investors seeking capital appreciation within a master-planned, amenity-backed estate.</w:t>
+        <w:t xml:space="preserve">Estate-wide landscaping, green buffers and a dedicated facilities-management team for ongoing maintenance, security and utilities once phases are handed over.</w:t>
+      </w:r>
+    </w:p>
+    <w:p>
+      <w:pPr>
+        <w:spacing w:after="160" w:line="300"/>
+        <w:jc w:val="both"/>
+      </w:pPr>
+      <w:r>
+        <w:t xml:space="preserve">This full amenity set is what elevates the project from a residential estate with a golf course attached, to a genuine self-contained, world-class luxury destination — the positioning basis for the investor proposition in Section 6.</w:t>
+      </w:r>
+    </w:p>
+    <w:p>
+      <w:r>
+        <w:br w:type="page"/>
+      </w:r>
+    </w:p>
+    <w:p>
+      <w:pPr>
+        <w:pStyle w:val="Heading1"/>
+        <w:spacing w:after="160" w:before="120"/>
+      </w:pPr>
+      <w:r>
+        <w:t xml:space="preserve">6. International &amp; Local Investor Proposition</w:t>
+      </w:r>
+    </w:p>
+    <w:p>
+      <w:pPr>
+        <w:spacing w:after="160" w:line="300"/>
+        <w:jc w:val="both"/>
+      </w:pPr>
+      <w:r>
+        <w:t xml:space="preserve">The estate is being brought to market to attract both international and local capital, and the proposition is deliberately built to appeal to both audiences at once rather than treating them as separate products.</w:t>
+      </w:r>
+    </w:p>
+    <w:p>
+      <w:pPr>
+        <w:pStyle w:val="Heading2"/>
+        <w:spacing w:after="120" w:before="200"/>
+      </w:pPr>
+      <w:r>
+        <w:t xml:space="preserve">6.1 For International Investors &amp; Diaspora</w:t>
       </w:r>
     </w:p>
     <w:p>
@@ -2573,7 +2655,7 @@
         <w:spacing w:after="90"/>
       </w:pPr>
       <w:r>
-        <w:t xml:space="preserve">Golf and leisure enthusiasts drawn to the clubhouse, hotel and recreational offering.</w:t>
+        <w:t xml:space="preserve">A globally-benchmarked lifestyle asset in Nigeria's capital region — golf course, hotel, international school and hospital — comparable in amenity standard to golf estates diaspora investors already know from the UK, US, UAE and South Africa.</w:t>
       </w:r>
     </w:p>
     <w:p>
@@ -2586,7 +2668,20 @@
         <w:spacing w:after="90"/>
       </w:pPr>
       <w:r>
-        <w:t xml:space="preserve">Corporate and retail tenants for the Phase 2 shopping village, and healthcare users for the Phase 3 hospital.</w:t>
+        <w:t xml:space="preserve">A tangible, income-generating real asset (land, villas, hospitality and retail income) as a diversification option outside of equities and venture-style risk.</w:t>
+      </w:r>
+    </w:p>
+    <w:p>
+      <w:pPr>
+        <w:pStyle w:val="ListParagraph"/>
+        <w:numPr>
+          <w:ilvl w:val="0"/>
+          <w:numId w:val="2"/>
+        </w:numPr>
+        <w:spacing w:after="90"/>
+      </w:pPr>
+      <w:r>
+        <w:t xml:space="preserve">Full self-contained security and infrastructure (Section 5) addressing the safety and reliability concerns that are typically the biggest hesitation for diaspora and foreign buyers investing in Nigerian real estate.</w:t>
       </w:r>
     </w:p>
     <w:p>
@@ -2595,7 +2690,68 @@
         <w:spacing w:after="120" w:before="200"/>
       </w:pPr>
       <w:r>
-        <w:t xml:space="preserve">6.3 Positioning</w:t>
+        <w:t xml:space="preserve">6.2 For Local Investors &amp; High-Net-Worth Nigerians</w:t>
+      </w:r>
+    </w:p>
+    <w:p>
+      <w:pPr>
+        <w:pStyle w:val="ListParagraph"/>
+        <w:numPr>
+          <w:ilvl w:val="0"/>
+          <w:numId w:val="2"/>
+        </w:numPr>
+        <w:spacing w:after="90"/>
+      </w:pPr>
+      <w:r>
+        <w:t xml:space="preserve">A rare, credible golf-anchored address in the FCT, at a stage (pre-construction/early Phase 1) where site-and-serviced land and early duplex releases are priced ahead of the value uplift that comes once the golf course, clubhouse and hotel are visibly under construction.</w:t>
+      </w:r>
+    </w:p>
+    <w:p>
+      <w:pPr>
+        <w:pStyle w:val="ListParagraph"/>
+        <w:numPr>
+          <w:ilvl w:val="0"/>
+          <w:numId w:val="2"/>
+        </w:numPr>
+        <w:spacing w:after="90"/>
+      </w:pPr>
+      <w:r>
+        <w:t xml:space="preserve">A four-pillar community (Live/Work/Heal/Relax) that reduces dependence on off-estate infrastructure for healthcare, schooling, retail and hospitality — a strong differentiator versus purely residential estates in the same corridor.</w:t>
+      </w:r>
+    </w:p>
+    <w:p>
+      <w:pPr>
+        <w:pStyle w:val="Heading2"/>
+        <w:spacing w:after="120" w:before="200"/>
+      </w:pPr>
+      <w:r>
+        <w:t xml:space="preserve">6.3 Structuring the Ask</w:t>
+      </w:r>
+    </w:p>
+    <w:p>
+      <w:pPr>
+        <w:pStyle w:val="ListParagraph"/>
+        <w:numPr>
+          <w:ilvl w:val="0"/>
+          <w:numId w:val="2"/>
+        </w:numPr>
+        <w:spacing w:after="90"/>
+      </w:pPr>
+      <w:r>
+        <w:t xml:space="preserve">Direct plot and duplex sales (Section 7) remain the primary entry point for both audiences.</w:t>
+      </w:r>
+    </w:p>
+    <w:p>
+      <w:pPr>
+        <w:pStyle w:val="ListParagraph"/>
+        <w:numPr>
+          <w:ilvl w:val="0"/>
+          <w:numId w:val="2"/>
+        </w:numPr>
+        <w:spacing w:after="90"/>
+      </w:pPr>
+      <w:r>
+        <w:t xml:space="preserve">A structured investment/partnership route (equity or profit-share in the Phase 2/3 income-producing assets — hotel, shopping village, hospital, school) can be offered to institutional or larger-ticket international and local investors who want exposure to the estate's recurring income rather than a single unit or plot.</w:t>
       </w:r>
     </w:p>
     <w:p>
@@ -2604,7 +2760,7 @@
         <w:jc w:val="both"/>
       </w:pPr>
       <w:r>
-        <w:t xml:space="preserve">The estate is positioned above conventional gated-estate competitors in Abuja on the strength of its golf-course anchor and integrated four-pillar (Live/Work/Heal/Relax) concept, rather than competing purely on unit price. This supports premium pricing on both the serviced land parcels and the finished duplex units relative to standard residential-only estates in the same corridor.</w:t>
+        <w:t xml:space="preserve">This dual-track approach lets the project raise capital broadly across retail buyers (plots/duplexes) and larger investors (Phase 2/3 income assets) without relying on any single investor class to reach the ₦50 billion Phase 1 revenue target in Section 7.</w:t>
       </w:r>
     </w:p>
     <w:p>
@@ -2618,7 +2774,7 @@
         <w:spacing w:after="160" w:before="120"/>
       </w:pPr>
       <w:r>
-        <w:t xml:space="preserve">7. Financial Plan</w:t>
+        <w:t xml:space="preserve">7. Development Phasing &amp; Timeline</w:t>
       </w:r>
     </w:p>
     <w:p>
@@ -2627,7 +2783,7 @@
         <w:jc w:val="both"/>
       </w:pPr>
       <w:r>
-        <w:t xml:space="preserve">The financial plan below is built directly from the parameters supplied for this business case. Figures marked with an asterisk (*) are illustrative estimates included to complete the cost picture and should be firmed up with a full quantity-surveyor costing and site infrastructure design before financial close.</w:t>
+        <w:t xml:space="preserve">The project is deliberately phased to reduce upfront capital exposure and let early property and land sales finance later construction — rather than requiring the full development cost upfront.</w:t>
       </w:r>
     </w:p>
     <w:p>
@@ -2636,19 +2792,65 @@
         <w:spacing w:after="120" w:before="200"/>
       </w:pPr>
       <w:r>
-        <w:t xml:space="preserve">7.1 Cost Structure</w:t>
-      </w:r>
-    </w:p>
-    <w:p>
-      <w:pPr>
+        <w:t xml:space="preserve">Phase 1 (Months 0–12)</w:t>
+      </w:r>
+    </w:p>
+    <w:p>
+      <w:pPr>
+        <w:spacing w:after="160" w:line="300"/>
+        <w:jc w:val="both"/>
+      </w:pPr>
+      <w:r>
+        <w:t xml:space="preserve">Golf course construction, clubhouse, site infrastructure (roads, drainage, power, water) and the first tranche of luxury duplexes. Site-and-serviced plots are marketed and sold in parallel to generate early cash flow.</w:t>
+      </w:r>
+    </w:p>
+    <w:p>
+      <w:pPr>
+        <w:pStyle w:val="Heading2"/>
+        <w:spacing w:after="120" w:before="200"/>
+      </w:pPr>
+      <w:r>
+        <w:t xml:space="preserve">Phase 2 (Months 10–22)</w:t>
+      </w:r>
+    </w:p>
+    <w:p>
+      <w:pPr>
+        <w:spacing w:after="160" w:line="300"/>
+        <w:jc w:val="both"/>
+      </w:pPr>
+      <w:r>
+        <w:t xml:space="preserve">Development of the boutique hotel and shopping village, funded substantially from Phase 1 land sale proceeds and initial duplex handovers.</w:t>
+      </w:r>
+    </w:p>
+    <w:p>
+      <w:pPr>
+        <w:pStyle w:val="Heading2"/>
+        <w:spacing w:after="120" w:before="200"/>
+      </w:pPr>
+      <w:r>
+        <w:t xml:space="preserve">Phase 3 (Months 20–34)</w:t>
+      </w:r>
+    </w:p>
+    <w:p>
+      <w:pPr>
+        <w:spacing w:after="160" w:line="300"/>
+        <w:jc w:val="both"/>
+      </w:pPr>
+      <w:r>
+        <w:t xml:space="preserve">Hospital/wellness facility, additional apartment blocks and any further expansion, funded from cumulative estate revenue and operating income from Phase 2 hospitality/retail assets.</w:t>
+      </w:r>
+    </w:p>
+    <w:p>
+      <w:pPr>
+        <w:spacing w:before="200"/>
         <w:jc w:val="center"/>
       </w:pPr>
       <w:r>
         <w:drawing>
           <wp:inline distT="0" distB="0" distL="0" distR="0">
-            <wp:extent cx="4381500" cy="3048000"/>
+            <wp:extent cx="4381500" cy="2476500"/>
             <wp:effectExtent t="0" r="0" b="0" l="0"/>
-            <wp:docPr id="1" name="Cost structure bar chart" descr="Cost structure bar chart" title="Cost structure bar chart"/>
+            <wp:docPr id="1" name="Phased development timeline" descr="Phased development timeline" title="Phased development timeline"/>
             <wp:cNvGraphicFramePr>
               <a:graphicFrameLocks xmlns:a="http://schemas.openxmlformats.org/drawingml/2006/main" noChangeAspect="1"/>
             </wp:cNvGraphicFramePr>
@@ -2671,7 +2873,7 @@
                   <pic:spPr bwMode="auto">
                     <a:xfrm>
                       <a:off x="0" y="0"/>
-                      <a:ext cx="4381500" cy="3048000"/>
+                      <a:ext cx="4381500" cy="2476500"/>
                     </a:xfrm>
                     <a:prstGeom prst="rect">
                       <a:avLst/>
@@ -2697,836 +2899,174 @@
           <w:sz w:val="18"/>
           <w:szCs w:val="18"/>
         </w:rPr>
-        <w:t xml:space="preserve">Figure 4 — Illustrative total development cost structure</w:t>
-      </w:r>
-    </w:p>
-    <w:tbl>
-      <w:tblPr>
-        <w:tblW w:type="dxa" w:w="10080"/>
-        <w:tblBorders>
-          <w:top w:val="single" w:color="auto" w:sz="4"/>
-          <w:left w:val="single" w:color="auto" w:sz="4"/>
-          <w:bottom w:val="single" w:color="auto" w:sz="4"/>
-          <w:right w:val="single" w:color="auto" w:sz="4"/>
-          <w:insideH w:val="single" w:color="auto" w:sz="4"/>
-          <w:insideV w:val="single" w:color="auto" w:sz="4"/>
-        </w:tblBorders>
-      </w:tblPr>
-      <w:tblGrid>
-        <w:gridCol w:w="6480"/>
-        <w:gridCol w:w="3600"/>
-      </w:tblGrid>
-      <w:tr>
-        <w:tc>
-          <w:tcPr>
-            <w:tcW w:type="dxa" w:w="6480"/>
-            <w:tcBorders>
-              <w:top w:val="single" w:color="CCCCCC" w:sz="2"/>
-              <w:left w:val="single" w:color="CCCCCC" w:sz="2"/>
-              <w:bottom w:val="single" w:color="CCCCCC" w:sz="2"/>
-              <w:right w:val="single" w:color="CCCCCC" w:sz="2"/>
-            </w:tcBorders>
-            <w:shd w:fill="E8F0EA" w:val="clear"/>
-            <w:tcMar>
-              <w:top w:type="dxa" w:w="80"/>
-              <w:left w:type="dxa" w:w="120"/>
-              <w:bottom w:type="dxa" w:w="80"/>
-              <w:right w:type="dxa" w:w="120"/>
-            </w:tcMar>
-            <w:vAlign w:val="center"/>
-          </w:tcPr>
-          <w:p>
-            <w:pPr>
-              <w:jc w:val="left"/>
-            </w:pPr>
-            <w:r>
-              <w:rPr>
-                <w:b/>
-                <w:bCs/>
-                <w:color w:val="0F2A3D"/>
-                <w:sz w:val="20"/>
-                <w:szCs w:val="20"/>
-              </w:rPr>
-              <w:t xml:space="preserve">Cost Item</w:t>
-            </w:r>
-          </w:p>
-        </w:tc>
-        <w:tc>
-          <w:tcPr>
-            <w:tcW w:type="dxa" w:w="3600"/>
-            <w:tcBorders>
-              <w:top w:val="single" w:color="CCCCCC" w:sz="2"/>
-              <w:left w:val="single" w:color="CCCCCC" w:sz="2"/>
-              <w:bottom w:val="single" w:color="CCCCCC" w:sz="2"/>
-              <w:right w:val="single" w:color="CCCCCC" w:sz="2"/>
-            </w:tcBorders>
-            <w:shd w:fill="E8F0EA" w:val="clear"/>
-            <w:tcMar>
-              <w:top w:type="dxa" w:w="80"/>
-              <w:left w:type="dxa" w:w="120"/>
-              <w:bottom w:type="dxa" w:w="80"/>
-              <w:right w:type="dxa" w:w="120"/>
-            </w:tcMar>
-            <w:vAlign w:val="center"/>
-          </w:tcPr>
-          <w:p>
-            <w:pPr>
-              <w:jc w:val="left"/>
-            </w:pPr>
-            <w:r>
-              <w:rPr>
-                <w:b w:val="false"/>
-                <w:bCs w:val="false"/>
-                <w:color w:val="0F2A3D"/>
-                <w:sz w:val="20"/>
-                <w:szCs w:val="20"/>
-              </w:rPr>
-              <w:t xml:space="preserve">Amount</w:t>
-            </w:r>
-          </w:p>
-        </w:tc>
-      </w:tr>
-      <w:tr>
-        <w:tc>
-          <w:tcPr>
-            <w:tcW w:type="dxa" w:w="6480"/>
-            <w:tcBorders>
-              <w:top w:val="single" w:color="CCCCCC" w:sz="2"/>
-              <w:left w:val="single" w:color="CCCCCC" w:sz="2"/>
-              <w:bottom w:val="single" w:color="CCCCCC" w:sz="2"/>
-              <w:right w:val="single" w:color="CCCCCC" w:sz="2"/>
-            </w:tcBorders>
-            <w:shd w:fill="FFFFFF" w:val="clear"/>
-            <w:tcMar>
-              <w:top w:type="dxa" w:w="80"/>
-              <w:left w:type="dxa" w:w="120"/>
-              <w:bottom w:type="dxa" w:w="80"/>
-              <w:right w:type="dxa" w:w="120"/>
-            </w:tcMar>
-            <w:vAlign w:val="center"/>
-          </w:tcPr>
-          <w:p>
-            <w:pPr>
-              <w:jc w:val="left"/>
-            </w:pPr>
-            <w:r>
-              <w:rPr>
-                <w:b/>
-                <w:bCs/>
-                <w:color w:val="0F2A3D"/>
-                <w:sz w:val="20"/>
-                <w:szCs w:val="20"/>
-              </w:rPr>
-              <w:t xml:space="preserve">Land Acquisition (77 ha)</w:t>
-            </w:r>
-          </w:p>
-        </w:tc>
-        <w:tc>
-          <w:tcPr>
-            <w:tcW w:type="dxa" w:w="3600"/>
-            <w:tcBorders>
-              <w:top w:val="single" w:color="CCCCCC" w:sz="2"/>
-              <w:left w:val="single" w:color="CCCCCC" w:sz="2"/>
-              <w:bottom w:val="single" w:color="CCCCCC" w:sz="2"/>
-              <w:right w:val="single" w:color="CCCCCC" w:sz="2"/>
-            </w:tcBorders>
-            <w:shd w:fill="FFFFFF" w:val="clear"/>
-            <w:tcMar>
-              <w:top w:type="dxa" w:w="80"/>
-              <w:left w:type="dxa" w:w="120"/>
-              <w:bottom w:type="dxa" w:w="80"/>
-              <w:right w:type="dxa" w:w="120"/>
-            </w:tcMar>
-            <w:vAlign w:val="center"/>
-          </w:tcPr>
-          <w:p>
-            <w:pPr>
-              <w:jc w:val="left"/>
-            </w:pPr>
-            <w:r>
-              <w:rPr>
-                <w:b w:val="false"/>
-                <w:bCs w:val="false"/>
-                <w:color w:val="0F2A3D"/>
-                <w:sz w:val="20"/>
-                <w:szCs w:val="20"/>
-              </w:rPr>
-              <w:t xml:space="preserve">₦2.5 billion</w:t>
-            </w:r>
-          </w:p>
-        </w:tc>
-      </w:tr>
-      <w:tr>
-        <w:tc>
-          <w:tcPr>
-            <w:tcW w:type="dxa" w:w="6480"/>
-            <w:tcBorders>
-              <w:top w:val="single" w:color="CCCCCC" w:sz="2"/>
-              <w:left w:val="single" w:color="CCCCCC" w:sz="2"/>
-              <w:bottom w:val="single" w:color="CCCCCC" w:sz="2"/>
-              <w:right w:val="single" w:color="CCCCCC" w:sz="2"/>
-            </w:tcBorders>
-            <w:shd w:fill="F7F7F7" w:val="clear"/>
-            <w:tcMar>
-              <w:top w:type="dxa" w:w="80"/>
-              <w:left w:type="dxa" w:w="120"/>
-              <w:bottom w:type="dxa" w:w="80"/>
-              <w:right w:type="dxa" w:w="120"/>
-            </w:tcMar>
-            <w:vAlign w:val="center"/>
-          </w:tcPr>
-          <w:p>
-            <w:pPr>
-              <w:jc w:val="left"/>
-            </w:pPr>
-            <w:r>
-              <w:rPr>
-                <w:b/>
-                <w:bCs/>
-                <w:color w:val="0F2A3D"/>
-                <w:sz w:val="20"/>
-                <w:szCs w:val="20"/>
-              </w:rPr>
-              <w:t xml:space="preserve">Duplex Construction — 100 units × ₦150M (to carcass level)</w:t>
-            </w:r>
-          </w:p>
-        </w:tc>
-        <w:tc>
-          <w:tcPr>
-            <w:tcW w:type="dxa" w:w="3600"/>
-            <w:tcBorders>
-              <w:top w:val="single" w:color="CCCCCC" w:sz="2"/>
-              <w:left w:val="single" w:color="CCCCCC" w:sz="2"/>
-              <w:bottom w:val="single" w:color="CCCCCC" w:sz="2"/>
-              <w:right w:val="single" w:color="CCCCCC" w:sz="2"/>
-            </w:tcBorders>
-            <w:shd w:fill="F7F7F7" w:val="clear"/>
-            <w:tcMar>
-              <w:top w:type="dxa" w:w="80"/>
-              <w:left w:type="dxa" w:w="120"/>
-              <w:bottom w:type="dxa" w:w="80"/>
-              <w:right w:type="dxa" w:w="120"/>
-            </w:tcMar>
-            <w:vAlign w:val="center"/>
-          </w:tcPr>
-          <w:p>
-            <w:pPr>
-              <w:jc w:val="left"/>
-            </w:pPr>
-            <w:r>
-              <w:rPr>
-                <w:b w:val="false"/>
-                <w:bCs w:val="false"/>
-                <w:color w:val="0F2A3D"/>
-                <w:sz w:val="20"/>
-                <w:szCs w:val="20"/>
-              </w:rPr>
-              <w:t xml:space="preserve">₦15 billion</w:t>
-            </w:r>
-          </w:p>
-        </w:tc>
-      </w:tr>
-      <w:tr>
-        <w:tc>
-          <w:tcPr>
-            <w:tcW w:type="dxa" w:w="6480"/>
-            <w:tcBorders>
-              <w:top w:val="single" w:color="CCCCCC" w:sz="2"/>
-              <w:left w:val="single" w:color="CCCCCC" w:sz="2"/>
-              <w:bottom w:val="single" w:color="CCCCCC" w:sz="2"/>
-              <w:right w:val="single" w:color="CCCCCC" w:sz="2"/>
-            </w:tcBorders>
-            <w:shd w:fill="FFFFFF" w:val="clear"/>
-            <w:tcMar>
-              <w:top w:type="dxa" w:w="80"/>
-              <w:left w:type="dxa" w:w="120"/>
-              <w:bottom w:type="dxa" w:w="80"/>
-              <w:right w:type="dxa" w:w="120"/>
-            </w:tcMar>
-            <w:vAlign w:val="center"/>
-          </w:tcPr>
-          <w:p>
-            <w:pPr>
-              <w:jc w:val="left"/>
-            </w:pPr>
-            <w:r>
-              <w:rPr>
-                <w:b/>
-                <w:bCs/>
-                <w:color w:val="0F2A3D"/>
-                <w:sz w:val="20"/>
-                <w:szCs w:val="20"/>
-              </w:rPr>
-              <w:t xml:space="preserve">Subtotal — Stated Costs</w:t>
-            </w:r>
-          </w:p>
-        </w:tc>
-        <w:tc>
-          <w:tcPr>
-            <w:tcW w:type="dxa" w:w="3600"/>
-            <w:tcBorders>
-              <w:top w:val="single" w:color="CCCCCC" w:sz="2"/>
-              <w:left w:val="single" w:color="CCCCCC" w:sz="2"/>
-              <w:bottom w:val="single" w:color="CCCCCC" w:sz="2"/>
-              <w:right w:val="single" w:color="CCCCCC" w:sz="2"/>
-            </w:tcBorders>
-            <w:shd w:fill="FFFFFF" w:val="clear"/>
-            <w:tcMar>
-              <w:top w:type="dxa" w:w="80"/>
-              <w:left w:type="dxa" w:w="120"/>
-              <w:bottom w:type="dxa" w:w="80"/>
-              <w:right w:type="dxa" w:w="120"/>
-            </w:tcMar>
-            <w:vAlign w:val="center"/>
-          </w:tcPr>
-          <w:p>
-            <w:pPr>
-              <w:jc w:val="left"/>
-            </w:pPr>
-            <w:r>
-              <w:rPr>
-                <w:b w:val="false"/>
-                <w:bCs w:val="false"/>
-                <w:color w:val="0F2A3D"/>
-                <w:sz w:val="20"/>
-                <w:szCs w:val="20"/>
-              </w:rPr>
-              <w:t xml:space="preserve">₦17.5 billion</w:t>
-            </w:r>
-          </w:p>
-        </w:tc>
-      </w:tr>
-      <w:tr>
-        <w:tc>
-          <w:tcPr>
-            <w:tcW w:type="dxa" w:w="6480"/>
-            <w:tcBorders>
-              <w:top w:val="single" w:color="CCCCCC" w:sz="2"/>
-              <w:left w:val="single" w:color="CCCCCC" w:sz="2"/>
-              <w:bottom w:val="single" w:color="CCCCCC" w:sz="2"/>
-              <w:right w:val="single" w:color="CCCCCC" w:sz="2"/>
-            </w:tcBorders>
-            <w:shd w:fill="F7F7F7" w:val="clear"/>
-            <w:tcMar>
-              <w:top w:type="dxa" w:w="80"/>
-              <w:left w:type="dxa" w:w="120"/>
-              <w:bottom w:type="dxa" w:w="80"/>
-              <w:right w:type="dxa" w:w="120"/>
-            </w:tcMar>
-            <w:vAlign w:val="center"/>
-          </w:tcPr>
-          <w:p>
-            <w:pPr>
-              <w:jc w:val="left"/>
-            </w:pPr>
-            <w:r>
-              <w:rPr>
-                <w:b/>
-                <w:bCs/>
-                <w:color w:val="0F2A3D"/>
-                <w:sz w:val="20"/>
-                <w:szCs w:val="20"/>
-              </w:rPr>
-              <w:t xml:space="preserve">Golf Course, Clubhouse, Site Infrastructure &amp; Contingency*</w:t>
-            </w:r>
-          </w:p>
-        </w:tc>
-        <w:tc>
-          <w:tcPr>
-            <w:tcW w:type="dxa" w:w="3600"/>
-            <w:tcBorders>
-              <w:top w:val="single" w:color="CCCCCC" w:sz="2"/>
-              <w:left w:val="single" w:color="CCCCCC" w:sz="2"/>
-              <w:bottom w:val="single" w:color="CCCCCC" w:sz="2"/>
-              <w:right w:val="single" w:color="CCCCCC" w:sz="2"/>
-            </w:tcBorders>
-            <w:shd w:fill="F7F7F7" w:val="clear"/>
-            <w:tcMar>
-              <w:top w:type="dxa" w:w="80"/>
-              <w:left w:type="dxa" w:w="120"/>
-              <w:bottom w:type="dxa" w:w="80"/>
-              <w:right w:type="dxa" w:w="120"/>
-            </w:tcMar>
-            <w:vAlign w:val="center"/>
-          </w:tcPr>
-          <w:p>
-            <w:pPr>
-              <w:jc w:val="left"/>
-            </w:pPr>
-            <w:r>
-              <w:rPr>
-                <w:b w:val="false"/>
-                <w:bCs w:val="false"/>
-                <w:color w:val="0F2A3D"/>
-                <w:sz w:val="20"/>
-                <w:szCs w:val="20"/>
-              </w:rPr>
-              <w:t xml:space="preserve">up to ₦24.17 billion</w:t>
-            </w:r>
-          </w:p>
-        </w:tc>
-      </w:tr>
-      <w:tr>
-        <w:tc>
-          <w:tcPr>
-            <w:tcW w:type="dxa" w:w="6480"/>
-            <w:tcBorders>
-              <w:top w:val="single" w:color="CCCCCC" w:sz="2"/>
-              <w:left w:val="single" w:color="CCCCCC" w:sz="2"/>
-              <w:bottom w:val="single" w:color="CCCCCC" w:sz="2"/>
-              <w:right w:val="single" w:color="CCCCCC" w:sz="2"/>
-            </w:tcBorders>
-            <w:shd w:fill="FFFFFF" w:val="clear"/>
-            <w:tcMar>
-              <w:top w:type="dxa" w:w="80"/>
-              <w:left w:type="dxa" w:w="120"/>
-              <w:bottom w:type="dxa" w:w="80"/>
-              <w:right w:type="dxa" w:w="120"/>
-            </w:tcMar>
-            <w:vAlign w:val="center"/>
-          </w:tcPr>
-          <w:p>
-            <w:pPr>
-              <w:jc w:val="left"/>
-            </w:pPr>
-            <w:r>
-              <w:rPr>
-                <w:b/>
-                <w:bCs/>
-                <w:color w:val="0F2A3D"/>
-                <w:sz w:val="20"/>
-                <w:szCs w:val="20"/>
-              </w:rPr>
-              <w:t xml:space="preserve">Maximum Total Cost while still clearing the 20% ROI floor</w:t>
-            </w:r>
-          </w:p>
-        </w:tc>
-        <w:tc>
-          <w:tcPr>
-            <w:tcW w:type="dxa" w:w="3600"/>
-            <w:tcBorders>
-              <w:top w:val="single" w:color="CCCCCC" w:sz="2"/>
-              <w:left w:val="single" w:color="CCCCCC" w:sz="2"/>
-              <w:bottom w:val="single" w:color="CCCCCC" w:sz="2"/>
-              <w:right w:val="single" w:color="CCCCCC" w:sz="2"/>
-            </w:tcBorders>
-            <w:shd w:fill="FFFFFF" w:val="clear"/>
-            <w:tcMar>
-              <w:top w:type="dxa" w:w="80"/>
-              <w:left w:type="dxa" w:w="120"/>
-              <w:bottom w:type="dxa" w:w="80"/>
-              <w:right w:type="dxa" w:w="120"/>
-            </w:tcMar>
-            <w:vAlign w:val="center"/>
-          </w:tcPr>
-          <w:p>
-            <w:pPr>
-              <w:jc w:val="left"/>
-            </w:pPr>
-            <w:r>
-              <w:rPr>
-                <w:b w:val="false"/>
-                <w:bCs w:val="false"/>
-                <w:color w:val="0F2A3D"/>
-                <w:sz w:val="20"/>
-                <w:szCs w:val="20"/>
-              </w:rPr>
-              <w:t xml:space="preserve">₦41.67 billion</w:t>
-            </w:r>
-          </w:p>
-        </w:tc>
-      </w:tr>
-    </w:tbl>
+        <w:t xml:space="preserve">Figure 3 — Indicative phased development timeline (months from project launch)</w:t>
+      </w:r>
+    </w:p>
+    <w:p>
+      <w:r>
+        <w:br w:type="page"/>
+      </w:r>
+    </w:p>
+    <w:p>
+      <w:pPr>
+        <w:pStyle w:val="Heading1"/>
+        <w:spacing w:after="160" w:before="120"/>
+      </w:pPr>
+      <w:r>
+        <w:t xml:space="preserve">8. Market Analysis &amp; Target Buyers</w:t>
+      </w:r>
+    </w:p>
     <w:p>
       <w:pPr>
         <w:pStyle w:val="Heading2"/>
         <w:spacing w:after="120" w:before="200"/>
       </w:pPr>
       <w:r>
-        <w:t xml:space="preserve">7.2 Revenue Plan</w:t>
-      </w:r>
-    </w:p>
-    <w:tbl>
-      <w:tblPr>
-        <w:tblW w:type="dxa" w:w="10080"/>
-        <w:tblBorders>
-          <w:top w:val="single" w:color="auto" w:sz="4"/>
-          <w:left w:val="single" w:color="auto" w:sz="4"/>
-          <w:bottom w:val="single" w:color="auto" w:sz="4"/>
-          <w:right w:val="single" w:color="auto" w:sz="4"/>
-          <w:insideH w:val="single" w:color="auto" w:sz="4"/>
-          <w:insideV w:val="single" w:color="auto" w:sz="4"/>
-        </w:tblBorders>
-      </w:tblPr>
-      <w:tblGrid>
-        <w:gridCol w:w="6480"/>
-        <w:gridCol w:w="3600"/>
-      </w:tblGrid>
-      <w:tr>
-        <w:tc>
-          <w:tcPr>
-            <w:tcW w:type="dxa" w:w="6480"/>
-            <w:tcBorders>
-              <w:top w:val="single" w:color="CCCCCC" w:sz="2"/>
-              <w:left w:val="single" w:color="CCCCCC" w:sz="2"/>
-              <w:bottom w:val="single" w:color="CCCCCC" w:sz="2"/>
-              <w:right w:val="single" w:color="CCCCCC" w:sz="2"/>
-            </w:tcBorders>
-            <w:shd w:fill="E8F0EA" w:val="clear"/>
-            <w:tcMar>
-              <w:top w:type="dxa" w:w="80"/>
-              <w:left w:type="dxa" w:w="120"/>
-              <w:bottom w:type="dxa" w:w="80"/>
-              <w:right w:type="dxa" w:w="120"/>
-            </w:tcMar>
-            <w:vAlign w:val="center"/>
-          </w:tcPr>
-          <w:p>
-            <w:pPr>
-              <w:jc w:val="left"/>
-            </w:pPr>
-            <w:r>
-              <w:rPr>
-                <w:b/>
-                <w:bCs/>
-                <w:color w:val="0F2A3D"/>
-                <w:sz w:val="20"/>
-                <w:szCs w:val="20"/>
-              </w:rPr>
-              <w:t xml:space="preserve">Revenue Item</w:t>
-            </w:r>
-          </w:p>
-        </w:tc>
-        <w:tc>
-          <w:tcPr>
-            <w:tcW w:type="dxa" w:w="3600"/>
-            <w:tcBorders>
-              <w:top w:val="single" w:color="CCCCCC" w:sz="2"/>
-              <w:left w:val="single" w:color="CCCCCC" w:sz="2"/>
-              <w:bottom w:val="single" w:color="CCCCCC" w:sz="2"/>
-              <w:right w:val="single" w:color="CCCCCC" w:sz="2"/>
-            </w:tcBorders>
-            <w:shd w:fill="E8F0EA" w:val="clear"/>
-            <w:tcMar>
-              <w:top w:type="dxa" w:w="80"/>
-              <w:left w:type="dxa" w:w="120"/>
-              <w:bottom w:type="dxa" w:w="80"/>
-              <w:right w:type="dxa" w:w="120"/>
-            </w:tcMar>
-            <w:vAlign w:val="center"/>
-          </w:tcPr>
-          <w:p>
-            <w:pPr>
-              <w:jc w:val="left"/>
-            </w:pPr>
-            <w:r>
-              <w:rPr>
-                <w:b w:val="false"/>
-                <w:bCs w:val="false"/>
-                <w:color w:val="0F2A3D"/>
-                <w:sz w:val="20"/>
-                <w:szCs w:val="20"/>
-              </w:rPr>
-              <w:t xml:space="preserve">Amount</w:t>
-            </w:r>
-          </w:p>
-        </w:tc>
-      </w:tr>
-      <w:tr>
-        <w:tc>
-          <w:tcPr>
-            <w:tcW w:type="dxa" w:w="6480"/>
-            <w:tcBorders>
-              <w:top w:val="single" w:color="CCCCCC" w:sz="2"/>
-              <w:left w:val="single" w:color="CCCCCC" w:sz="2"/>
-              <w:bottom w:val="single" w:color="CCCCCC" w:sz="2"/>
-              <w:right w:val="single" w:color="CCCCCC" w:sz="2"/>
-            </w:tcBorders>
-            <w:shd w:fill="FFFFFF" w:val="clear"/>
-            <w:tcMar>
-              <w:top w:type="dxa" w:w="80"/>
-              <w:left w:type="dxa" w:w="120"/>
-              <w:bottom w:type="dxa" w:w="80"/>
-              <w:right w:type="dxa" w:w="120"/>
-            </w:tcMar>
-            <w:vAlign w:val="center"/>
-          </w:tcPr>
-          <w:p>
-            <w:pPr>
-              <w:jc w:val="left"/>
-            </w:pPr>
-            <w:r>
-              <w:rPr>
-                <w:b/>
-                <w:bCs/>
-                <w:color w:val="0F2A3D"/>
-                <w:sz w:val="20"/>
-                <w:szCs w:val="20"/>
-              </w:rPr>
-              <w:t xml:space="preserve">Site &amp; Serviced Land Sales (Phase 1)</w:t>
-            </w:r>
-          </w:p>
-        </w:tc>
-        <w:tc>
-          <w:tcPr>
-            <w:tcW w:type="dxa" w:w="3600"/>
-            <w:tcBorders>
-              <w:top w:val="single" w:color="CCCCCC" w:sz="2"/>
-              <w:left w:val="single" w:color="CCCCCC" w:sz="2"/>
-              <w:bottom w:val="single" w:color="CCCCCC" w:sz="2"/>
-              <w:right w:val="single" w:color="CCCCCC" w:sz="2"/>
-            </w:tcBorders>
-            <w:shd w:fill="FFFFFF" w:val="clear"/>
-            <w:tcMar>
-              <w:top w:type="dxa" w:w="80"/>
-              <w:left w:type="dxa" w:w="120"/>
-              <w:bottom w:type="dxa" w:w="80"/>
-              <w:right w:type="dxa" w:w="120"/>
-            </w:tcMar>
-            <w:vAlign w:val="center"/>
-          </w:tcPr>
-          <w:p>
-            <w:pPr>
-              <w:jc w:val="left"/>
-            </w:pPr>
-            <w:r>
-              <w:rPr>
-                <w:b w:val="false"/>
-                <w:bCs w:val="false"/>
-                <w:color w:val="0F2A3D"/>
-                <w:sz w:val="20"/>
-                <w:szCs w:val="20"/>
-              </w:rPr>
-              <w:t xml:space="preserve">₦50 billion</w:t>
-            </w:r>
-          </w:p>
-        </w:tc>
-      </w:tr>
-      <w:tr>
-        <w:tc>
-          <w:tcPr>
-            <w:tcW w:type="dxa" w:w="6480"/>
-            <w:tcBorders>
-              <w:top w:val="single" w:color="CCCCCC" w:sz="2"/>
-              <w:left w:val="single" w:color="CCCCCC" w:sz="2"/>
-              <w:bottom w:val="single" w:color="CCCCCC" w:sz="2"/>
-              <w:right w:val="single" w:color="CCCCCC" w:sz="2"/>
-            </w:tcBorders>
-            <w:shd w:fill="F7F7F7" w:val="clear"/>
-            <w:tcMar>
-              <w:top w:type="dxa" w:w="80"/>
-              <w:left w:type="dxa" w:w="120"/>
-              <w:bottom w:type="dxa" w:w="80"/>
-              <w:right w:type="dxa" w:w="120"/>
-            </w:tcMar>
-            <w:vAlign w:val="center"/>
-          </w:tcPr>
-          <w:p>
-            <w:pPr>
-              <w:jc w:val="left"/>
-            </w:pPr>
-            <w:r>
-              <w:rPr>
-                <w:b/>
-                <w:bCs/>
-                <w:color w:val="0F2A3D"/>
-                <w:sz w:val="20"/>
-                <w:szCs w:val="20"/>
-              </w:rPr>
-              <w:t xml:space="preserve">Duplex Unit Sales (100 units)*</w:t>
-            </w:r>
-          </w:p>
-        </w:tc>
-        <w:tc>
-          <w:tcPr>
-            <w:tcW w:type="dxa" w:w="3600"/>
-            <w:tcBorders>
-              <w:top w:val="single" w:color="CCCCCC" w:sz="2"/>
-              <w:left w:val="single" w:color="CCCCCC" w:sz="2"/>
-              <w:bottom w:val="single" w:color="CCCCCC" w:sz="2"/>
-              <w:right w:val="single" w:color="CCCCCC" w:sz="2"/>
-            </w:tcBorders>
-            <w:shd w:fill="F7F7F7" w:val="clear"/>
-            <w:tcMar>
-              <w:top w:type="dxa" w:w="80"/>
-              <w:left w:type="dxa" w:w="120"/>
-              <w:bottom w:type="dxa" w:w="80"/>
-              <w:right w:type="dxa" w:w="120"/>
-            </w:tcMar>
-            <w:vAlign w:val="center"/>
-          </w:tcPr>
-          <w:p>
-            <w:pPr>
-              <w:jc w:val="left"/>
-            </w:pPr>
-            <w:r>
-              <w:rPr>
-                <w:b w:val="false"/>
-                <w:bCs w:val="false"/>
-                <w:color w:val="0F2A3D"/>
-                <w:sz w:val="20"/>
-                <w:szCs w:val="20"/>
-              </w:rPr>
-              <w:t xml:space="preserve">Additional upside — not included in base case</w:t>
-            </w:r>
-          </w:p>
-        </w:tc>
-      </w:tr>
-      <w:tr>
-        <w:tc>
-          <w:tcPr>
-            <w:tcW w:type="dxa" w:w="6480"/>
-            <w:tcBorders>
-              <w:top w:val="single" w:color="CCCCCC" w:sz="2"/>
-              <w:left w:val="single" w:color="CCCCCC" w:sz="2"/>
-              <w:bottom w:val="single" w:color="CCCCCC" w:sz="2"/>
-              <w:right w:val="single" w:color="CCCCCC" w:sz="2"/>
-            </w:tcBorders>
-            <w:shd w:fill="FFFFFF" w:val="clear"/>
-            <w:tcMar>
-              <w:top w:type="dxa" w:w="80"/>
-              <w:left w:type="dxa" w:w="120"/>
-              <w:bottom w:type="dxa" w:w="80"/>
-              <w:right w:type="dxa" w:w="120"/>
-            </w:tcMar>
-            <w:vAlign w:val="center"/>
-          </w:tcPr>
-          <w:p>
-            <w:pPr>
-              <w:jc w:val="left"/>
-            </w:pPr>
-            <w:r>
-              <w:rPr>
-                <w:b/>
-                <w:bCs/>
-                <w:color w:val="0F2A3D"/>
-                <w:sz w:val="20"/>
-                <w:szCs w:val="20"/>
-              </w:rPr>
-              <w:t xml:space="preserve">Phase 2 Hotel &amp; Shopping Village Income*</w:t>
-            </w:r>
-          </w:p>
-        </w:tc>
-        <w:tc>
-          <w:tcPr>
-            <w:tcW w:type="dxa" w:w="3600"/>
-            <w:tcBorders>
-              <w:top w:val="single" w:color="CCCCCC" w:sz="2"/>
-              <w:left w:val="single" w:color="CCCCCC" w:sz="2"/>
-              <w:bottom w:val="single" w:color="CCCCCC" w:sz="2"/>
-              <w:right w:val="single" w:color="CCCCCC" w:sz="2"/>
-            </w:tcBorders>
-            <w:shd w:fill="FFFFFF" w:val="clear"/>
-            <w:tcMar>
-              <w:top w:type="dxa" w:w="80"/>
-              <w:left w:type="dxa" w:w="120"/>
-              <w:bottom w:type="dxa" w:w="80"/>
-              <w:right w:type="dxa" w:w="120"/>
-            </w:tcMar>
-            <w:vAlign w:val="center"/>
-          </w:tcPr>
-          <w:p>
-            <w:pPr>
-              <w:jc w:val="left"/>
-            </w:pPr>
-            <w:r>
-              <w:rPr>
-                <w:b w:val="false"/>
-                <w:bCs w:val="false"/>
-                <w:color w:val="0F2A3D"/>
-                <w:sz w:val="20"/>
-                <w:szCs w:val="20"/>
-              </w:rPr>
-              <w:t xml:space="preserve">Additional upside — not included in base case</w:t>
-            </w:r>
-          </w:p>
-        </w:tc>
-      </w:tr>
-      <w:tr>
-        <w:tc>
-          <w:tcPr>
-            <w:tcW w:type="dxa" w:w="6480"/>
-            <w:tcBorders>
-              <w:top w:val="single" w:color="CCCCCC" w:sz="2"/>
-              <w:left w:val="single" w:color="CCCCCC" w:sz="2"/>
-              <w:bottom w:val="single" w:color="CCCCCC" w:sz="2"/>
-              <w:right w:val="single" w:color="CCCCCC" w:sz="2"/>
-            </w:tcBorders>
-            <w:shd w:fill="F7F7F7" w:val="clear"/>
-            <w:tcMar>
-              <w:top w:type="dxa" w:w="80"/>
-              <w:left w:type="dxa" w:w="120"/>
-              <w:bottom w:type="dxa" w:w="80"/>
-              <w:right w:type="dxa" w:w="120"/>
-            </w:tcMar>
-            <w:vAlign w:val="center"/>
-          </w:tcPr>
-          <w:p>
-            <w:pPr>
-              <w:jc w:val="left"/>
-            </w:pPr>
-            <w:r>
-              <w:rPr>
-                <w:b/>
-                <w:bCs/>
-                <w:color w:val="0F2A3D"/>
-                <w:sz w:val="20"/>
-                <w:szCs w:val="20"/>
-              </w:rPr>
-              <w:t xml:space="preserve">Phase 3 Hospital &amp; Apartments Income*</w:t>
-            </w:r>
-          </w:p>
-        </w:tc>
-        <w:tc>
-          <w:tcPr>
-            <w:tcW w:type="dxa" w:w="3600"/>
-            <w:tcBorders>
-              <w:top w:val="single" w:color="CCCCCC" w:sz="2"/>
-              <w:left w:val="single" w:color="CCCCCC" w:sz="2"/>
-              <w:bottom w:val="single" w:color="CCCCCC" w:sz="2"/>
-              <w:right w:val="single" w:color="CCCCCC" w:sz="2"/>
-            </w:tcBorders>
-            <w:shd w:fill="F7F7F7" w:val="clear"/>
-            <w:tcMar>
-              <w:top w:type="dxa" w:w="80"/>
-              <w:left w:type="dxa" w:w="120"/>
-              <w:bottom w:type="dxa" w:w="80"/>
-              <w:right w:type="dxa" w:w="120"/>
-            </w:tcMar>
-            <w:vAlign w:val="center"/>
-          </w:tcPr>
-          <w:p>
-            <w:pPr>
-              <w:jc w:val="left"/>
-            </w:pPr>
-            <w:r>
-              <w:rPr>
-                <w:b w:val="false"/>
-                <w:bCs w:val="false"/>
-                <w:color w:val="0F2A3D"/>
-                <w:sz w:val="20"/>
-                <w:szCs w:val="20"/>
-              </w:rPr>
-              <w:t xml:space="preserve">Additional upside — not included in base case</w:t>
-            </w:r>
-          </w:p>
-        </w:tc>
-      </w:tr>
-    </w:tbl>
+        <w:t xml:space="preserve">6.1 Demand Drivers</w:t>
+      </w:r>
+    </w:p>
+    <w:p>
+      <w:pPr>
+        <w:pStyle w:val="ListParagraph"/>
+        <w:numPr>
+          <w:ilvl w:val="0"/>
+          <w:numId w:val="2"/>
+        </w:numPr>
+        <w:spacing w:after="90"/>
+      </w:pPr>
+      <w:r>
+        <w:t xml:space="preserve">Abuja's persistent housing deficit at the upper end of the market, particularly for large-format, secure, amenity-rich residences.</w:t>
+      </w:r>
+    </w:p>
+    <w:p>
+      <w:pPr>
+        <w:pStyle w:val="ListParagraph"/>
+        <w:numPr>
+          <w:ilvl w:val="0"/>
+          <w:numId w:val="2"/>
+        </w:numPr>
+        <w:spacing w:after="90"/>
+      </w:pPr>
+      <w:r>
+        <w:t xml:space="preserve">Scarcity of genuine golf-anchored residential estates in Nigeria, limiting direct like-for-like competition.</w:t>
+      </w:r>
+    </w:p>
+    <w:p>
+      <w:pPr>
+        <w:pStyle w:val="ListParagraph"/>
+        <w:numPr>
+          <w:ilvl w:val="0"/>
+          <w:numId w:val="2"/>
+        </w:numPr>
+        <w:spacing w:after="90"/>
+      </w:pPr>
+      <w:r>
+        <w:t xml:space="preserve">Growing demand among Nigerian diaspora, senior professionals and business owners for a lifestyle-led, gated community within reach of the capital.</w:t>
+      </w:r>
+    </w:p>
+    <w:p>
+      <w:pPr>
+        <w:pStyle w:val="ListParagraph"/>
+        <w:numPr>
+          <w:ilvl w:val="0"/>
+          <w:numId w:val="2"/>
+        </w:numPr>
+        <w:spacing w:after="90"/>
+      </w:pPr>
+      <w:r>
+        <w:t xml:space="preserve">Bwari's expanding infrastructure and relative land availability compared to the congested FCT core.</w:t>
+      </w:r>
+    </w:p>
+    <w:p>
+      <w:pPr>
+        <w:pStyle w:val="Heading2"/>
+        <w:spacing w:after="120" w:before="200"/>
+      </w:pPr>
+      <w:r>
+        <w:t xml:space="preserve">6.2 Target Buyer Segments</w:t>
+      </w:r>
+    </w:p>
+    <w:p>
+      <w:pPr>
+        <w:pStyle w:val="ListParagraph"/>
+        <w:numPr>
+          <w:ilvl w:val="0"/>
+          <w:numId w:val="2"/>
+        </w:numPr>
+        <w:spacing w:after="90"/>
+      </w:pPr>
+      <w:r>
+        <w:t xml:space="preserve">High-net-worth individuals and senior executives resident in Abuja seeking a premium, secure, lifestyle-oriented address.</w:t>
+      </w:r>
+    </w:p>
+    <w:p>
+      <w:pPr>
+        <w:pStyle w:val="ListParagraph"/>
+        <w:numPr>
+          <w:ilvl w:val="0"/>
+          <w:numId w:val="2"/>
+        </w:numPr>
+        <w:spacing w:after="90"/>
+      </w:pPr>
+      <w:r>
+        <w:t xml:space="preserve">Nigerian diaspora investors purchasing a home or investment property for eventual return or rental income.</w:t>
+      </w:r>
+    </w:p>
+    <w:p>
+      <w:pPr>
+        <w:pStyle w:val="ListParagraph"/>
+        <w:numPr>
+          <w:ilvl w:val="0"/>
+          <w:numId w:val="2"/>
+        </w:numPr>
+        <w:spacing w:after="90"/>
+      </w:pPr>
+      <w:r>
+        <w:t xml:space="preserve">Land and site-and-service plot investors seeking capital appreciation within a master-planned, amenity-backed estate.</w:t>
+      </w:r>
+    </w:p>
+    <w:p>
+      <w:pPr>
+        <w:pStyle w:val="ListParagraph"/>
+        <w:numPr>
+          <w:ilvl w:val="0"/>
+          <w:numId w:val="2"/>
+        </w:numPr>
+        <w:spacing w:after="90"/>
+      </w:pPr>
+      <w:r>
+        <w:t xml:space="preserve">Golf and leisure enthusiasts drawn to the clubhouse, hotel and recreational offering.</w:t>
+      </w:r>
+    </w:p>
+    <w:p>
+      <w:pPr>
+        <w:pStyle w:val="ListParagraph"/>
+        <w:numPr>
+          <w:ilvl w:val="0"/>
+          <w:numId w:val="2"/>
+        </w:numPr>
+        <w:spacing w:after="90"/>
+      </w:pPr>
+      <w:r>
+        <w:t xml:space="preserve">Corporate and retail tenants for the Phase 2 shopping village, and healthcare/education users for the Phase 3 hospital and international school.</w:t>
+      </w:r>
+    </w:p>
+    <w:p>
+      <w:pPr>
+        <w:pStyle w:val="Heading2"/>
+        <w:spacing w:after="120" w:before="200"/>
+      </w:pPr>
+      <w:r>
+        <w:t xml:space="preserve">6.3 Positioning</w:t>
+      </w:r>
+    </w:p>
     <w:p>
       <w:pPr>
         <w:spacing w:after="160" w:line="300"/>
         <w:jc w:val="both"/>
       </w:pPr>
       <w:r>
-        <w:rPr>
-          <w:i/>
-          <w:iCs/>
-          <w:color w:val="6B6B6B"/>
-          <w:sz w:val="18"/>
-          <w:szCs w:val="18"/>
-        </w:rPr>
-        <w:t xml:space="preserve">The ₦50 billion Phase 1 land-sale revenue figure is treated as the base-case, conservative revenue line for this plan. Duplex sales and Phase 2/3 hospitality, retail and healthcare income are real, additional revenue streams but are deliberately excluded from the base-case ROI calculation in Section 8 so that the headline return is not overstated.</w:t>
+        <w:t xml:space="preserve">The estate is positioned above conventional gated-estate competitors in Abuja on the strength of its golf-course anchor and integrated four-pillar (Live/Work/Heal/Relax) concept, rather than competing purely on unit price. This supports premium pricing on both the serviced land parcels and the finished duplex units relative to standard residential-only estates in the same corridor.</w:t>
       </w:r>
     </w:p>
     <w:p>
@@ -3540,7 +3080,16 @@
         <w:spacing w:after="160" w:before="120"/>
       </w:pPr>
       <w:r>
-        <w:t xml:space="preserve">8. Profitability Analysis</w:t>
+        <w:t xml:space="preserve">9. Financial Plan</w:t>
+      </w:r>
+    </w:p>
+    <w:p>
+      <w:pPr>
+        <w:spacing w:after="160" w:line="300"/>
+        <w:jc w:val="both"/>
+      </w:pPr>
+      <w:r>
+        <w:t xml:space="preserve">The financial plan below is built directly from the parameters supplied for this business case. Figures marked with an asterisk (*) are illustrative estimates included to complete the cost picture and should be firmed up with a full quantity-surveyor costing and site infrastructure design before financial close.</w:t>
       </w:r>
     </w:p>
     <w:p>
@@ -3549,471 +3098,7 @@
         <w:spacing w:after="120" w:before="200"/>
       </w:pPr>
       <w:r>
-        <w:t xml:space="preserve">8.1 Base-Case Return (Stated Costs Only)</w:t>
-      </w:r>
-    </w:p>
-    <w:p>
-      <w:pPr>
-        <w:spacing w:after="160" w:line="300"/>
-        <w:jc w:val="both"/>
-      </w:pPr>
-      <w:r>
-        <w:t xml:space="preserve">Using only the costs explicitly stated in the brief — land acquisition (₦2.5B) and duplex construction (₦15B), total ₦17.5B — against the ₦50B Phase 1 land-sale revenue target:</w:t>
-      </w:r>
-    </w:p>
-    <w:tbl>
-      <w:tblPr>
-        <w:tblW w:type="dxa" w:w="10080"/>
-        <w:tblBorders>
-          <w:top w:val="single" w:color="auto" w:sz="4"/>
-          <w:left w:val="single" w:color="auto" w:sz="4"/>
-          <w:bottom w:val="single" w:color="auto" w:sz="4"/>
-          <w:right w:val="single" w:color="auto" w:sz="4"/>
-          <w:insideH w:val="single" w:color="auto" w:sz="4"/>
-          <w:insideV w:val="single" w:color="auto" w:sz="4"/>
-        </w:tblBorders>
-      </w:tblPr>
-      <w:tblGrid>
-        <w:gridCol w:w="6480"/>
-        <w:gridCol w:w="3600"/>
-      </w:tblGrid>
-      <w:tr>
-        <w:tc>
-          <w:tcPr>
-            <w:tcW w:type="dxa" w:w="6480"/>
-            <w:tcBorders>
-              <w:top w:val="single" w:color="CCCCCC" w:sz="2"/>
-              <w:left w:val="single" w:color="CCCCCC" w:sz="2"/>
-              <w:bottom w:val="single" w:color="CCCCCC" w:sz="2"/>
-              <w:right w:val="single" w:color="CCCCCC" w:sz="2"/>
-            </w:tcBorders>
-            <w:shd w:fill="E8F0EA" w:val="clear"/>
-            <w:tcMar>
-              <w:top w:type="dxa" w:w="80"/>
-              <w:left w:type="dxa" w:w="120"/>
-              <w:bottom w:type="dxa" w:w="80"/>
-              <w:right w:type="dxa" w:w="120"/>
-            </w:tcMar>
-            <w:vAlign w:val="center"/>
-          </w:tcPr>
-          <w:p>
-            <w:pPr>
-              <w:jc w:val="left"/>
-            </w:pPr>
-            <w:r>
-              <w:rPr>
-                <w:b/>
-                <w:bCs/>
-                <w:color w:val="0F2A3D"/>
-                <w:sz w:val="20"/>
-                <w:szCs w:val="20"/>
-              </w:rPr>
-              <w:t xml:space="preserve">Metric</w:t>
-            </w:r>
-          </w:p>
-        </w:tc>
-        <w:tc>
-          <w:tcPr>
-            <w:tcW w:type="dxa" w:w="3600"/>
-            <w:tcBorders>
-              <w:top w:val="single" w:color="CCCCCC" w:sz="2"/>
-              <w:left w:val="single" w:color="CCCCCC" w:sz="2"/>
-              <w:bottom w:val="single" w:color="CCCCCC" w:sz="2"/>
-              <w:right w:val="single" w:color="CCCCCC" w:sz="2"/>
-            </w:tcBorders>
-            <w:shd w:fill="E8F0EA" w:val="clear"/>
-            <w:tcMar>
-              <w:top w:type="dxa" w:w="80"/>
-              <w:left w:type="dxa" w:w="120"/>
-              <w:bottom w:type="dxa" w:w="80"/>
-              <w:right w:type="dxa" w:w="120"/>
-            </w:tcMar>
-            <w:vAlign w:val="center"/>
-          </w:tcPr>
-          <w:p>
-            <w:pPr>
-              <w:jc w:val="left"/>
-            </w:pPr>
-            <w:r>
-              <w:rPr>
-                <w:b w:val="false"/>
-                <w:bCs w:val="false"/>
-                <w:color w:val="0F2A3D"/>
-                <w:sz w:val="20"/>
-                <w:szCs w:val="20"/>
-              </w:rPr>
-              <w:t xml:space="preserve">Value</w:t>
-            </w:r>
-          </w:p>
-        </w:tc>
-      </w:tr>
-      <w:tr>
-        <w:tc>
-          <w:tcPr>
-            <w:tcW w:type="dxa" w:w="6480"/>
-            <w:tcBorders>
-              <w:top w:val="single" w:color="CCCCCC" w:sz="2"/>
-              <w:left w:val="single" w:color="CCCCCC" w:sz="2"/>
-              <w:bottom w:val="single" w:color="CCCCCC" w:sz="2"/>
-              <w:right w:val="single" w:color="CCCCCC" w:sz="2"/>
-            </w:tcBorders>
-            <w:shd w:fill="FFFFFF" w:val="clear"/>
-            <w:tcMar>
-              <w:top w:type="dxa" w:w="80"/>
-              <w:left w:type="dxa" w:w="120"/>
-              <w:bottom w:type="dxa" w:w="80"/>
-              <w:right w:type="dxa" w:w="120"/>
-            </w:tcMar>
-            <w:vAlign w:val="center"/>
-          </w:tcPr>
-          <w:p>
-            <w:pPr>
-              <w:jc w:val="left"/>
-            </w:pPr>
-            <w:r>
-              <w:rPr>
-                <w:b/>
-                <w:bCs/>
-                <w:color w:val="0F2A3D"/>
-                <w:sz w:val="20"/>
-                <w:szCs w:val="20"/>
-              </w:rPr>
-              <w:t xml:space="preserve">Total Stated Cost</w:t>
-            </w:r>
-          </w:p>
-        </w:tc>
-        <w:tc>
-          <w:tcPr>
-            <w:tcW w:type="dxa" w:w="3600"/>
-            <w:tcBorders>
-              <w:top w:val="single" w:color="CCCCCC" w:sz="2"/>
-              <w:left w:val="single" w:color="CCCCCC" w:sz="2"/>
-              <w:bottom w:val="single" w:color="CCCCCC" w:sz="2"/>
-              <w:right w:val="single" w:color="CCCCCC" w:sz="2"/>
-            </w:tcBorders>
-            <w:shd w:fill="FFFFFF" w:val="clear"/>
-            <w:tcMar>
-              <w:top w:type="dxa" w:w="80"/>
-              <w:left w:type="dxa" w:w="120"/>
-              <w:bottom w:type="dxa" w:w="80"/>
-              <w:right w:type="dxa" w:w="120"/>
-            </w:tcMar>
-            <w:vAlign w:val="center"/>
-          </w:tcPr>
-          <w:p>
-            <w:pPr>
-              <w:jc w:val="left"/>
-            </w:pPr>
-            <w:r>
-              <w:rPr>
-                <w:b w:val="false"/>
-                <w:bCs w:val="false"/>
-                <w:color w:val="0F2A3D"/>
-                <w:sz w:val="20"/>
-                <w:szCs w:val="20"/>
-              </w:rPr>
-              <w:t xml:space="preserve">₦17.5 billion</w:t>
-            </w:r>
-          </w:p>
-        </w:tc>
-      </w:tr>
-      <w:tr>
-        <w:tc>
-          <w:tcPr>
-            <w:tcW w:type="dxa" w:w="6480"/>
-            <w:tcBorders>
-              <w:top w:val="single" w:color="CCCCCC" w:sz="2"/>
-              <w:left w:val="single" w:color="CCCCCC" w:sz="2"/>
-              <w:bottom w:val="single" w:color="CCCCCC" w:sz="2"/>
-              <w:right w:val="single" w:color="CCCCCC" w:sz="2"/>
-            </w:tcBorders>
-            <w:shd w:fill="F7F7F7" w:val="clear"/>
-            <w:tcMar>
-              <w:top w:type="dxa" w:w="80"/>
-              <w:left w:type="dxa" w:w="120"/>
-              <w:bottom w:type="dxa" w:w="80"/>
-              <w:right w:type="dxa" w:w="120"/>
-            </w:tcMar>
-            <w:vAlign w:val="center"/>
-          </w:tcPr>
-          <w:p>
-            <w:pPr>
-              <w:jc w:val="left"/>
-            </w:pPr>
-            <w:r>
-              <w:rPr>
-                <w:b/>
-                <w:bCs/>
-                <w:color w:val="0F2A3D"/>
-                <w:sz w:val="20"/>
-                <w:szCs w:val="20"/>
-              </w:rPr>
-              <w:t xml:space="preserve">Revenue (Site &amp; Serviced Land Sales)</w:t>
-            </w:r>
-          </w:p>
-        </w:tc>
-        <w:tc>
-          <w:tcPr>
-            <w:tcW w:type="dxa" w:w="3600"/>
-            <w:tcBorders>
-              <w:top w:val="single" w:color="CCCCCC" w:sz="2"/>
-              <w:left w:val="single" w:color="CCCCCC" w:sz="2"/>
-              <w:bottom w:val="single" w:color="CCCCCC" w:sz="2"/>
-              <w:right w:val="single" w:color="CCCCCC" w:sz="2"/>
-            </w:tcBorders>
-            <w:shd w:fill="F7F7F7" w:val="clear"/>
-            <w:tcMar>
-              <w:top w:type="dxa" w:w="80"/>
-              <w:left w:type="dxa" w:w="120"/>
-              <w:bottom w:type="dxa" w:w="80"/>
-              <w:right w:type="dxa" w:w="120"/>
-            </w:tcMar>
-            <w:vAlign w:val="center"/>
-          </w:tcPr>
-          <w:p>
-            <w:pPr>
-              <w:jc w:val="left"/>
-            </w:pPr>
-            <w:r>
-              <w:rPr>
-                <w:b w:val="false"/>
-                <w:bCs w:val="false"/>
-                <w:color w:val="0F2A3D"/>
-                <w:sz w:val="20"/>
-                <w:szCs w:val="20"/>
-              </w:rPr>
-              <w:t xml:space="preserve">₦50 billion</w:t>
-            </w:r>
-          </w:p>
-        </w:tc>
-      </w:tr>
-      <w:tr>
-        <w:tc>
-          <w:tcPr>
-            <w:tcW w:type="dxa" w:w="6480"/>
-            <w:tcBorders>
-              <w:top w:val="single" w:color="CCCCCC" w:sz="2"/>
-              <w:left w:val="single" w:color="CCCCCC" w:sz="2"/>
-              <w:bottom w:val="single" w:color="CCCCCC" w:sz="2"/>
-              <w:right w:val="single" w:color="CCCCCC" w:sz="2"/>
-            </w:tcBorders>
-            <w:shd w:fill="FFFFFF" w:val="clear"/>
-            <w:tcMar>
-              <w:top w:type="dxa" w:w="80"/>
-              <w:left w:type="dxa" w:w="120"/>
-              <w:bottom w:type="dxa" w:w="80"/>
-              <w:right w:type="dxa" w:w="120"/>
-            </w:tcMar>
-            <w:vAlign w:val="center"/>
-          </w:tcPr>
-          <w:p>
-            <w:pPr>
-              <w:jc w:val="left"/>
-            </w:pPr>
-            <w:r>
-              <w:rPr>
-                <w:b/>
-                <w:bCs/>
-                <w:color w:val="0F2A3D"/>
-                <w:sz w:val="20"/>
-                <w:szCs w:val="20"/>
-              </w:rPr>
-              <w:t xml:space="preserve">Gross Profit</w:t>
-            </w:r>
-          </w:p>
-        </w:tc>
-        <w:tc>
-          <w:tcPr>
-            <w:tcW w:type="dxa" w:w="3600"/>
-            <w:tcBorders>
-              <w:top w:val="single" w:color="CCCCCC" w:sz="2"/>
-              <w:left w:val="single" w:color="CCCCCC" w:sz="2"/>
-              <w:bottom w:val="single" w:color="CCCCCC" w:sz="2"/>
-              <w:right w:val="single" w:color="CCCCCC" w:sz="2"/>
-            </w:tcBorders>
-            <w:shd w:fill="FFFFFF" w:val="clear"/>
-            <w:tcMar>
-              <w:top w:type="dxa" w:w="80"/>
-              <w:left w:type="dxa" w:w="120"/>
-              <w:bottom w:type="dxa" w:w="80"/>
-              <w:right w:type="dxa" w:w="120"/>
-            </w:tcMar>
-            <w:vAlign w:val="center"/>
-          </w:tcPr>
-          <w:p>
-            <w:pPr>
-              <w:jc w:val="left"/>
-            </w:pPr>
-            <w:r>
-              <w:rPr>
-                <w:b w:val="false"/>
-                <w:bCs w:val="false"/>
-                <w:color w:val="0F2A3D"/>
-                <w:sz w:val="20"/>
-                <w:szCs w:val="20"/>
-              </w:rPr>
-              <w:t xml:space="preserve">₦32.5 billion</w:t>
-            </w:r>
-          </w:p>
-        </w:tc>
-      </w:tr>
-      <w:tr>
-        <w:tc>
-          <w:tcPr>
-            <w:tcW w:type="dxa" w:w="6480"/>
-            <w:tcBorders>
-              <w:top w:val="single" w:color="CCCCCC" w:sz="2"/>
-              <w:left w:val="single" w:color="CCCCCC" w:sz="2"/>
-              <w:bottom w:val="single" w:color="CCCCCC" w:sz="2"/>
-              <w:right w:val="single" w:color="CCCCCC" w:sz="2"/>
-            </w:tcBorders>
-            <w:shd w:fill="F7F7F7" w:val="clear"/>
-            <w:tcMar>
-              <w:top w:type="dxa" w:w="80"/>
-              <w:left w:type="dxa" w:w="120"/>
-              <w:bottom w:type="dxa" w:w="80"/>
-              <w:right w:type="dxa" w:w="120"/>
-            </w:tcMar>
-            <w:vAlign w:val="center"/>
-          </w:tcPr>
-          <w:p>
-            <w:pPr>
-              <w:jc w:val="left"/>
-            </w:pPr>
-            <w:r>
-              <w:rPr>
-                <w:b/>
-                <w:bCs/>
-                <w:color w:val="0F2A3D"/>
-                <w:sz w:val="20"/>
-                <w:szCs w:val="20"/>
-              </w:rPr>
-              <w:t xml:space="preserve">Return on Investment</w:t>
-            </w:r>
-          </w:p>
-        </w:tc>
-        <w:tc>
-          <w:tcPr>
-            <w:tcW w:type="dxa" w:w="3600"/>
-            <w:tcBorders>
-              <w:top w:val="single" w:color="CCCCCC" w:sz="2"/>
-              <w:left w:val="single" w:color="CCCCCC" w:sz="2"/>
-              <w:bottom w:val="single" w:color="CCCCCC" w:sz="2"/>
-              <w:right w:val="single" w:color="CCCCCC" w:sz="2"/>
-            </w:tcBorders>
-            <w:shd w:fill="F7F7F7" w:val="clear"/>
-            <w:tcMar>
-              <w:top w:type="dxa" w:w="80"/>
-              <w:left w:type="dxa" w:w="120"/>
-              <w:bottom w:type="dxa" w:w="80"/>
-              <w:right w:type="dxa" w:w="120"/>
-            </w:tcMar>
-            <w:vAlign w:val="center"/>
-          </w:tcPr>
-          <w:p>
-            <w:pPr>
-              <w:jc w:val="left"/>
-            </w:pPr>
-            <w:r>
-              <w:rPr>
-                <w:b w:val="false"/>
-                <w:bCs w:val="false"/>
-                <w:color w:val="0F2A3D"/>
-                <w:sz w:val="20"/>
-                <w:szCs w:val="20"/>
-              </w:rPr>
-              <w:t xml:space="preserve">≈185.7%</w:t>
-            </w:r>
-          </w:p>
-        </w:tc>
-      </w:tr>
-      <w:tr>
-        <w:tc>
-          <w:tcPr>
-            <w:tcW w:type="dxa" w:w="6480"/>
-            <w:tcBorders>
-              <w:top w:val="single" w:color="CCCCCC" w:sz="2"/>
-              <w:left w:val="single" w:color="CCCCCC" w:sz="2"/>
-              <w:bottom w:val="single" w:color="CCCCCC" w:sz="2"/>
-              <w:right w:val="single" w:color="CCCCCC" w:sz="2"/>
-            </w:tcBorders>
-            <w:shd w:fill="FFFFFF" w:val="clear"/>
-            <w:tcMar>
-              <w:top w:type="dxa" w:w="80"/>
-              <w:left w:type="dxa" w:w="120"/>
-              <w:bottom w:type="dxa" w:w="80"/>
-              <w:right w:type="dxa" w:w="120"/>
-            </w:tcMar>
-            <w:vAlign w:val="center"/>
-          </w:tcPr>
-          <w:p>
-            <w:pPr>
-              <w:jc w:val="left"/>
-            </w:pPr>
-            <w:r>
-              <w:rPr>
-                <w:b/>
-                <w:bCs/>
-                <w:color w:val="0F2A3D"/>
-                <w:sz w:val="20"/>
-                <w:szCs w:val="20"/>
-              </w:rPr>
-              <w:t xml:space="preserve">Profit Margin (Profit / Revenue)</w:t>
-            </w:r>
-          </w:p>
-        </w:tc>
-        <w:tc>
-          <w:tcPr>
-            <w:tcW w:type="dxa" w:w="3600"/>
-            <w:tcBorders>
-              <w:top w:val="single" w:color="CCCCCC" w:sz="2"/>
-              <w:left w:val="single" w:color="CCCCCC" w:sz="2"/>
-              <w:bottom w:val="single" w:color="CCCCCC" w:sz="2"/>
-              <w:right w:val="single" w:color="CCCCCC" w:sz="2"/>
-            </w:tcBorders>
-            <w:shd w:fill="FFFFFF" w:val="clear"/>
-            <w:tcMar>
-              <w:top w:type="dxa" w:w="80"/>
-              <w:left w:type="dxa" w:w="120"/>
-              <w:bottom w:type="dxa" w:w="80"/>
-              <w:right w:type="dxa" w:w="120"/>
-            </w:tcMar>
-            <w:vAlign w:val="center"/>
-          </w:tcPr>
-          <w:p>
-            <w:pPr>
-              <w:jc w:val="left"/>
-            </w:pPr>
-            <w:r>
-              <w:rPr>
-                <w:b w:val="false"/>
-                <w:bCs w:val="false"/>
-                <w:color w:val="0F2A3D"/>
-                <w:sz w:val="20"/>
-                <w:szCs w:val="20"/>
-              </w:rPr>
-              <w:t xml:space="preserve">65%</w:t>
-            </w:r>
-          </w:p>
-        </w:tc>
-      </w:tr>
-    </w:tbl>
-    <w:p>
-      <w:pPr>
-        <w:pStyle w:val="Heading2"/>
-        <w:spacing w:after="120" w:before="200"/>
-      </w:pPr>
-      <w:r>
-        <w:t xml:space="preserve">8.2 Stress-Tested Return (Maximum Cost Buffer)</w:t>
-      </w:r>
-    </w:p>
-    <w:p>
-      <w:pPr>
-        <w:spacing w:after="160" w:line="300"/>
-        <w:jc w:val="both"/>
-      </w:pPr>
-      <w:r>
-        <w:t xml:space="preserve">To test how much room the project has for costs not itemized in the brief — golf course construction, clubhouse, roads, drainage, power, water, marketing and contingency — the analysis solves for the maximum total cost that still clears the 20% minimum ROI, holding revenue fixed at ₦50B:</w:t>
+        <w:t xml:space="preserve">9.1 Cost Structure</w:t>
       </w:r>
     </w:p>
     <w:p>
@@ -4025,7 +3110,7 @@
           <wp:inline distT="0" distB="0" distL="0" distR="0">
             <wp:extent cx="4381500" cy="3048000"/>
             <wp:effectExtent t="0" r="0" b="0" l="0"/>
-            <wp:docPr id="1" name="ROI sensitivity chart" descr="ROI sensitivity chart" title="ROI sensitivity chart"/>
+            <wp:docPr id="1" name="Cost structure bar chart" descr="Cost structure bar chart" title="Cost structure bar chart"/>
             <wp:cNvGraphicFramePr>
               <a:graphicFrameLocks xmlns:a="http://schemas.openxmlformats.org/drawingml/2006/main" noChangeAspect="1"/>
             </wp:cNvGraphicFramePr>
@@ -4074,7 +3159,1323 @@
           <w:sz w:val="18"/>
           <w:szCs w:val="18"/>
         </w:rPr>
-        <w:t xml:space="preserve">Figure 5 — Total cost vs. ROI: stated-cost scenario vs. maximum cost buffer at the 20% floor</w:t>
+        <w:t xml:space="preserve">Figure 4 — Illustrative total development cost structure</w:t>
+      </w:r>
+    </w:p>
+    <w:tbl>
+      <w:tblPr>
+        <w:tblW w:type="dxa" w:w="10080"/>
+        <w:tblBorders>
+          <w:top w:val="single" w:color="auto" w:sz="4"/>
+          <w:left w:val="single" w:color="auto" w:sz="4"/>
+          <w:bottom w:val="single" w:color="auto" w:sz="4"/>
+          <w:right w:val="single" w:color="auto" w:sz="4"/>
+          <w:insideH w:val="single" w:color="auto" w:sz="4"/>
+          <w:insideV w:val="single" w:color="auto" w:sz="4"/>
+        </w:tblBorders>
+      </w:tblPr>
+      <w:tblGrid>
+        <w:gridCol w:w="6480"/>
+        <w:gridCol w:w="3600"/>
+      </w:tblGrid>
+      <w:tr>
+        <w:tc>
+          <w:tcPr>
+            <w:tcW w:type="dxa" w:w="6480"/>
+            <w:tcBorders>
+              <w:top w:val="single" w:color="CCCCCC" w:sz="2"/>
+              <w:left w:val="single" w:color="CCCCCC" w:sz="2"/>
+              <w:bottom w:val="single" w:color="CCCCCC" w:sz="2"/>
+              <w:right w:val="single" w:color="CCCCCC" w:sz="2"/>
+            </w:tcBorders>
+            <w:shd w:fill="E8F0EA" w:val="clear"/>
+            <w:tcMar>
+              <w:top w:type="dxa" w:w="80"/>
+              <w:left w:type="dxa" w:w="120"/>
+              <w:bottom w:type="dxa" w:w="80"/>
+              <w:right w:type="dxa" w:w="120"/>
+            </w:tcMar>
+            <w:vAlign w:val="center"/>
+          </w:tcPr>
+          <w:p>
+            <w:pPr>
+              <w:jc w:val="left"/>
+            </w:pPr>
+            <w:r>
+              <w:rPr>
+                <w:b/>
+                <w:bCs/>
+                <w:color w:val="0F2A3D"/>
+                <w:sz w:val="20"/>
+                <w:szCs w:val="20"/>
+              </w:rPr>
+              <w:t xml:space="preserve">Cost Item</w:t>
+            </w:r>
+          </w:p>
+        </w:tc>
+        <w:tc>
+          <w:tcPr>
+            <w:tcW w:type="dxa" w:w="3600"/>
+            <w:tcBorders>
+              <w:top w:val="single" w:color="CCCCCC" w:sz="2"/>
+              <w:left w:val="single" w:color="CCCCCC" w:sz="2"/>
+              <w:bottom w:val="single" w:color="CCCCCC" w:sz="2"/>
+              <w:right w:val="single" w:color="CCCCCC" w:sz="2"/>
+            </w:tcBorders>
+            <w:shd w:fill="E8F0EA" w:val="clear"/>
+            <w:tcMar>
+              <w:top w:type="dxa" w:w="80"/>
+              <w:left w:type="dxa" w:w="120"/>
+              <w:bottom w:type="dxa" w:w="80"/>
+              <w:right w:type="dxa" w:w="120"/>
+            </w:tcMar>
+            <w:vAlign w:val="center"/>
+          </w:tcPr>
+          <w:p>
+            <w:pPr>
+              <w:jc w:val="left"/>
+            </w:pPr>
+            <w:r>
+              <w:rPr>
+                <w:b w:val="false"/>
+                <w:bCs w:val="false"/>
+                <w:color w:val="0F2A3D"/>
+                <w:sz w:val="20"/>
+                <w:szCs w:val="20"/>
+              </w:rPr>
+              <w:t xml:space="preserve">Amount</w:t>
+            </w:r>
+          </w:p>
+        </w:tc>
+      </w:tr>
+      <w:tr>
+        <w:tc>
+          <w:tcPr>
+            <w:tcW w:type="dxa" w:w="6480"/>
+            <w:tcBorders>
+              <w:top w:val="single" w:color="CCCCCC" w:sz="2"/>
+              <w:left w:val="single" w:color="CCCCCC" w:sz="2"/>
+              <w:bottom w:val="single" w:color="CCCCCC" w:sz="2"/>
+              <w:right w:val="single" w:color="CCCCCC" w:sz="2"/>
+            </w:tcBorders>
+            <w:shd w:fill="FFFFFF" w:val="clear"/>
+            <w:tcMar>
+              <w:top w:type="dxa" w:w="80"/>
+              <w:left w:type="dxa" w:w="120"/>
+              <w:bottom w:type="dxa" w:w="80"/>
+              <w:right w:type="dxa" w:w="120"/>
+            </w:tcMar>
+            <w:vAlign w:val="center"/>
+          </w:tcPr>
+          <w:p>
+            <w:pPr>
+              <w:jc w:val="left"/>
+            </w:pPr>
+            <w:r>
+              <w:rPr>
+                <w:b/>
+                <w:bCs/>
+                <w:color w:val="0F2A3D"/>
+                <w:sz w:val="20"/>
+                <w:szCs w:val="20"/>
+              </w:rPr>
+              <w:t xml:space="preserve">Land Acquisition (77 ha)</w:t>
+            </w:r>
+          </w:p>
+        </w:tc>
+        <w:tc>
+          <w:tcPr>
+            <w:tcW w:type="dxa" w:w="3600"/>
+            <w:tcBorders>
+              <w:top w:val="single" w:color="CCCCCC" w:sz="2"/>
+              <w:left w:val="single" w:color="CCCCCC" w:sz="2"/>
+              <w:bottom w:val="single" w:color="CCCCCC" w:sz="2"/>
+              <w:right w:val="single" w:color="CCCCCC" w:sz="2"/>
+            </w:tcBorders>
+            <w:shd w:fill="FFFFFF" w:val="clear"/>
+            <w:tcMar>
+              <w:top w:type="dxa" w:w="80"/>
+              <w:left w:type="dxa" w:w="120"/>
+              <w:bottom w:type="dxa" w:w="80"/>
+              <w:right w:type="dxa" w:w="120"/>
+            </w:tcMar>
+            <w:vAlign w:val="center"/>
+          </w:tcPr>
+          <w:p>
+            <w:pPr>
+              <w:jc w:val="left"/>
+            </w:pPr>
+            <w:r>
+              <w:rPr>
+                <w:b w:val="false"/>
+                <w:bCs w:val="false"/>
+                <w:color w:val="0F2A3D"/>
+                <w:sz w:val="20"/>
+                <w:szCs w:val="20"/>
+              </w:rPr>
+              <w:t xml:space="preserve">₦2.5 billion</w:t>
+            </w:r>
+          </w:p>
+        </w:tc>
+      </w:tr>
+      <w:tr>
+        <w:tc>
+          <w:tcPr>
+            <w:tcW w:type="dxa" w:w="6480"/>
+            <w:tcBorders>
+              <w:top w:val="single" w:color="CCCCCC" w:sz="2"/>
+              <w:left w:val="single" w:color="CCCCCC" w:sz="2"/>
+              <w:bottom w:val="single" w:color="CCCCCC" w:sz="2"/>
+              <w:right w:val="single" w:color="CCCCCC" w:sz="2"/>
+            </w:tcBorders>
+            <w:shd w:fill="F7F7F7" w:val="clear"/>
+            <w:tcMar>
+              <w:top w:type="dxa" w:w="80"/>
+              <w:left w:type="dxa" w:w="120"/>
+              <w:bottom w:type="dxa" w:w="80"/>
+              <w:right w:type="dxa" w:w="120"/>
+            </w:tcMar>
+            <w:vAlign w:val="center"/>
+          </w:tcPr>
+          <w:p>
+            <w:pPr>
+              <w:jc w:val="left"/>
+            </w:pPr>
+            <w:r>
+              <w:rPr>
+                <w:b/>
+                <w:bCs/>
+                <w:color w:val="0F2A3D"/>
+                <w:sz w:val="20"/>
+                <w:szCs w:val="20"/>
+              </w:rPr>
+              <w:t xml:space="preserve">Duplex Construction — 100 units × ₦150M (to carcass level)</w:t>
+            </w:r>
+          </w:p>
+        </w:tc>
+        <w:tc>
+          <w:tcPr>
+            <w:tcW w:type="dxa" w:w="3600"/>
+            <w:tcBorders>
+              <w:top w:val="single" w:color="CCCCCC" w:sz="2"/>
+              <w:left w:val="single" w:color="CCCCCC" w:sz="2"/>
+              <w:bottom w:val="single" w:color="CCCCCC" w:sz="2"/>
+              <w:right w:val="single" w:color="CCCCCC" w:sz="2"/>
+            </w:tcBorders>
+            <w:shd w:fill="F7F7F7" w:val="clear"/>
+            <w:tcMar>
+              <w:top w:type="dxa" w:w="80"/>
+              <w:left w:type="dxa" w:w="120"/>
+              <w:bottom w:type="dxa" w:w="80"/>
+              <w:right w:type="dxa" w:w="120"/>
+            </w:tcMar>
+            <w:vAlign w:val="center"/>
+          </w:tcPr>
+          <w:p>
+            <w:pPr>
+              <w:jc w:val="left"/>
+            </w:pPr>
+            <w:r>
+              <w:rPr>
+                <w:b w:val="false"/>
+                <w:bCs w:val="false"/>
+                <w:color w:val="0F2A3D"/>
+                <w:sz w:val="20"/>
+                <w:szCs w:val="20"/>
+              </w:rPr>
+              <w:t xml:space="preserve">₦15 billion</w:t>
+            </w:r>
+          </w:p>
+        </w:tc>
+      </w:tr>
+      <w:tr>
+        <w:tc>
+          <w:tcPr>
+            <w:tcW w:type="dxa" w:w="6480"/>
+            <w:tcBorders>
+              <w:top w:val="single" w:color="CCCCCC" w:sz="2"/>
+              <w:left w:val="single" w:color="CCCCCC" w:sz="2"/>
+              <w:bottom w:val="single" w:color="CCCCCC" w:sz="2"/>
+              <w:right w:val="single" w:color="CCCCCC" w:sz="2"/>
+            </w:tcBorders>
+            <w:shd w:fill="FFFFFF" w:val="clear"/>
+            <w:tcMar>
+              <w:top w:type="dxa" w:w="80"/>
+              <w:left w:type="dxa" w:w="120"/>
+              <w:bottom w:type="dxa" w:w="80"/>
+              <w:right w:type="dxa" w:w="120"/>
+            </w:tcMar>
+            <w:vAlign w:val="center"/>
+          </w:tcPr>
+          <w:p>
+            <w:pPr>
+              <w:jc w:val="left"/>
+            </w:pPr>
+            <w:r>
+              <w:rPr>
+                <w:b/>
+                <w:bCs/>
+                <w:color w:val="0F2A3D"/>
+                <w:sz w:val="20"/>
+                <w:szCs w:val="20"/>
+              </w:rPr>
+              <w:t xml:space="preserve">Subtotal — Stated Costs</w:t>
+            </w:r>
+          </w:p>
+        </w:tc>
+        <w:tc>
+          <w:tcPr>
+            <w:tcW w:type="dxa" w:w="3600"/>
+            <w:tcBorders>
+              <w:top w:val="single" w:color="CCCCCC" w:sz="2"/>
+              <w:left w:val="single" w:color="CCCCCC" w:sz="2"/>
+              <w:bottom w:val="single" w:color="CCCCCC" w:sz="2"/>
+              <w:right w:val="single" w:color="CCCCCC" w:sz="2"/>
+            </w:tcBorders>
+            <w:shd w:fill="FFFFFF" w:val="clear"/>
+            <w:tcMar>
+              <w:top w:type="dxa" w:w="80"/>
+              <w:left w:type="dxa" w:w="120"/>
+              <w:bottom w:type="dxa" w:w="80"/>
+              <w:right w:type="dxa" w:w="120"/>
+            </w:tcMar>
+            <w:vAlign w:val="center"/>
+          </w:tcPr>
+          <w:p>
+            <w:pPr>
+              <w:jc w:val="left"/>
+            </w:pPr>
+            <w:r>
+              <w:rPr>
+                <w:b w:val="false"/>
+                <w:bCs w:val="false"/>
+                <w:color w:val="0F2A3D"/>
+                <w:sz w:val="20"/>
+                <w:szCs w:val="20"/>
+              </w:rPr>
+              <w:t xml:space="preserve">₦17.5 billion</w:t>
+            </w:r>
+          </w:p>
+        </w:tc>
+      </w:tr>
+      <w:tr>
+        <w:tc>
+          <w:tcPr>
+            <w:tcW w:type="dxa" w:w="6480"/>
+            <w:tcBorders>
+              <w:top w:val="single" w:color="CCCCCC" w:sz="2"/>
+              <w:left w:val="single" w:color="CCCCCC" w:sz="2"/>
+              <w:bottom w:val="single" w:color="CCCCCC" w:sz="2"/>
+              <w:right w:val="single" w:color="CCCCCC" w:sz="2"/>
+            </w:tcBorders>
+            <w:shd w:fill="F7F7F7" w:val="clear"/>
+            <w:tcMar>
+              <w:top w:type="dxa" w:w="80"/>
+              <w:left w:type="dxa" w:w="120"/>
+              <w:bottom w:type="dxa" w:w="80"/>
+              <w:right w:type="dxa" w:w="120"/>
+            </w:tcMar>
+            <w:vAlign w:val="center"/>
+          </w:tcPr>
+          <w:p>
+            <w:pPr>
+              <w:jc w:val="left"/>
+            </w:pPr>
+            <w:r>
+              <w:rPr>
+                <w:b/>
+                <w:bCs/>
+                <w:color w:val="0F2A3D"/>
+                <w:sz w:val="20"/>
+                <w:szCs w:val="20"/>
+              </w:rPr>
+              <w:t xml:space="preserve">Golf Course, Clubhouse, Site Infrastructure &amp; Contingency*</w:t>
+            </w:r>
+          </w:p>
+        </w:tc>
+        <w:tc>
+          <w:tcPr>
+            <w:tcW w:type="dxa" w:w="3600"/>
+            <w:tcBorders>
+              <w:top w:val="single" w:color="CCCCCC" w:sz="2"/>
+              <w:left w:val="single" w:color="CCCCCC" w:sz="2"/>
+              <w:bottom w:val="single" w:color="CCCCCC" w:sz="2"/>
+              <w:right w:val="single" w:color="CCCCCC" w:sz="2"/>
+            </w:tcBorders>
+            <w:shd w:fill="F7F7F7" w:val="clear"/>
+            <w:tcMar>
+              <w:top w:type="dxa" w:w="80"/>
+              <w:left w:type="dxa" w:w="120"/>
+              <w:bottom w:type="dxa" w:w="80"/>
+              <w:right w:type="dxa" w:w="120"/>
+            </w:tcMar>
+            <w:vAlign w:val="center"/>
+          </w:tcPr>
+          <w:p>
+            <w:pPr>
+              <w:jc w:val="left"/>
+            </w:pPr>
+            <w:r>
+              <w:rPr>
+                <w:b w:val="false"/>
+                <w:bCs w:val="false"/>
+                <w:color w:val="0F2A3D"/>
+                <w:sz w:val="20"/>
+                <w:szCs w:val="20"/>
+              </w:rPr>
+              <w:t xml:space="preserve">up to ₦24.17 billion</w:t>
+            </w:r>
+          </w:p>
+        </w:tc>
+      </w:tr>
+      <w:tr>
+        <w:tc>
+          <w:tcPr>
+            <w:tcW w:type="dxa" w:w="6480"/>
+            <w:tcBorders>
+              <w:top w:val="single" w:color="CCCCCC" w:sz="2"/>
+              <w:left w:val="single" w:color="CCCCCC" w:sz="2"/>
+              <w:bottom w:val="single" w:color="CCCCCC" w:sz="2"/>
+              <w:right w:val="single" w:color="CCCCCC" w:sz="2"/>
+            </w:tcBorders>
+            <w:shd w:fill="FFFFFF" w:val="clear"/>
+            <w:tcMar>
+              <w:top w:type="dxa" w:w="80"/>
+              <w:left w:type="dxa" w:w="120"/>
+              <w:bottom w:type="dxa" w:w="80"/>
+              <w:right w:type="dxa" w:w="120"/>
+            </w:tcMar>
+            <w:vAlign w:val="center"/>
+          </w:tcPr>
+          <w:p>
+            <w:pPr>
+              <w:jc w:val="left"/>
+            </w:pPr>
+            <w:r>
+              <w:rPr>
+                <w:b/>
+                <w:bCs/>
+                <w:color w:val="0F2A3D"/>
+                <w:sz w:val="20"/>
+                <w:szCs w:val="20"/>
+              </w:rPr>
+              <w:t xml:space="preserve">Maximum Total Cost while still clearing the 20% ROI floor</w:t>
+            </w:r>
+          </w:p>
+        </w:tc>
+        <w:tc>
+          <w:tcPr>
+            <w:tcW w:type="dxa" w:w="3600"/>
+            <w:tcBorders>
+              <w:top w:val="single" w:color="CCCCCC" w:sz="2"/>
+              <w:left w:val="single" w:color="CCCCCC" w:sz="2"/>
+              <w:bottom w:val="single" w:color="CCCCCC" w:sz="2"/>
+              <w:right w:val="single" w:color="CCCCCC" w:sz="2"/>
+            </w:tcBorders>
+            <w:shd w:fill="FFFFFF" w:val="clear"/>
+            <w:tcMar>
+              <w:top w:type="dxa" w:w="80"/>
+              <w:left w:type="dxa" w:w="120"/>
+              <w:bottom w:type="dxa" w:w="80"/>
+              <w:right w:type="dxa" w:w="120"/>
+            </w:tcMar>
+            <w:vAlign w:val="center"/>
+          </w:tcPr>
+          <w:p>
+            <w:pPr>
+              <w:jc w:val="left"/>
+            </w:pPr>
+            <w:r>
+              <w:rPr>
+                <w:b w:val="false"/>
+                <w:bCs w:val="false"/>
+                <w:color w:val="0F2A3D"/>
+                <w:sz w:val="20"/>
+                <w:szCs w:val="20"/>
+              </w:rPr>
+              <w:t xml:space="preserve">₦41.67 billion</w:t>
+            </w:r>
+          </w:p>
+        </w:tc>
+      </w:tr>
+    </w:tbl>
+    <w:p>
+      <w:pPr>
+        <w:pStyle w:val="Heading2"/>
+        <w:spacing w:after="120" w:before="200"/>
+      </w:pPr>
+      <w:r>
+        <w:t xml:space="preserve">9.2 Revenue Plan</w:t>
+      </w:r>
+    </w:p>
+    <w:tbl>
+      <w:tblPr>
+        <w:tblW w:type="dxa" w:w="10080"/>
+        <w:tblBorders>
+          <w:top w:val="single" w:color="auto" w:sz="4"/>
+          <w:left w:val="single" w:color="auto" w:sz="4"/>
+          <w:bottom w:val="single" w:color="auto" w:sz="4"/>
+          <w:right w:val="single" w:color="auto" w:sz="4"/>
+          <w:insideH w:val="single" w:color="auto" w:sz="4"/>
+          <w:insideV w:val="single" w:color="auto" w:sz="4"/>
+        </w:tblBorders>
+      </w:tblPr>
+      <w:tblGrid>
+        <w:gridCol w:w="6480"/>
+        <w:gridCol w:w="3600"/>
+      </w:tblGrid>
+      <w:tr>
+        <w:tc>
+          <w:tcPr>
+            <w:tcW w:type="dxa" w:w="6480"/>
+            <w:tcBorders>
+              <w:top w:val="single" w:color="CCCCCC" w:sz="2"/>
+              <w:left w:val="single" w:color="CCCCCC" w:sz="2"/>
+              <w:bottom w:val="single" w:color="CCCCCC" w:sz="2"/>
+              <w:right w:val="single" w:color="CCCCCC" w:sz="2"/>
+            </w:tcBorders>
+            <w:shd w:fill="E8F0EA" w:val="clear"/>
+            <w:tcMar>
+              <w:top w:type="dxa" w:w="80"/>
+              <w:left w:type="dxa" w:w="120"/>
+              <w:bottom w:type="dxa" w:w="80"/>
+              <w:right w:type="dxa" w:w="120"/>
+            </w:tcMar>
+            <w:vAlign w:val="center"/>
+          </w:tcPr>
+          <w:p>
+            <w:pPr>
+              <w:jc w:val="left"/>
+            </w:pPr>
+            <w:r>
+              <w:rPr>
+                <w:b/>
+                <w:bCs/>
+                <w:color w:val="0F2A3D"/>
+                <w:sz w:val="20"/>
+                <w:szCs w:val="20"/>
+              </w:rPr>
+              <w:t xml:space="preserve">Revenue Item</w:t>
+            </w:r>
+          </w:p>
+        </w:tc>
+        <w:tc>
+          <w:tcPr>
+            <w:tcW w:type="dxa" w:w="3600"/>
+            <w:tcBorders>
+              <w:top w:val="single" w:color="CCCCCC" w:sz="2"/>
+              <w:left w:val="single" w:color="CCCCCC" w:sz="2"/>
+              <w:bottom w:val="single" w:color="CCCCCC" w:sz="2"/>
+              <w:right w:val="single" w:color="CCCCCC" w:sz="2"/>
+            </w:tcBorders>
+            <w:shd w:fill="E8F0EA" w:val="clear"/>
+            <w:tcMar>
+              <w:top w:type="dxa" w:w="80"/>
+              <w:left w:type="dxa" w:w="120"/>
+              <w:bottom w:type="dxa" w:w="80"/>
+              <w:right w:type="dxa" w:w="120"/>
+            </w:tcMar>
+            <w:vAlign w:val="center"/>
+          </w:tcPr>
+          <w:p>
+            <w:pPr>
+              <w:jc w:val="left"/>
+            </w:pPr>
+            <w:r>
+              <w:rPr>
+                <w:b w:val="false"/>
+                <w:bCs w:val="false"/>
+                <w:color w:val="0F2A3D"/>
+                <w:sz w:val="20"/>
+                <w:szCs w:val="20"/>
+              </w:rPr>
+              <w:t xml:space="preserve">Amount</w:t>
+            </w:r>
+          </w:p>
+        </w:tc>
+      </w:tr>
+      <w:tr>
+        <w:tc>
+          <w:tcPr>
+            <w:tcW w:type="dxa" w:w="6480"/>
+            <w:tcBorders>
+              <w:top w:val="single" w:color="CCCCCC" w:sz="2"/>
+              <w:left w:val="single" w:color="CCCCCC" w:sz="2"/>
+              <w:bottom w:val="single" w:color="CCCCCC" w:sz="2"/>
+              <w:right w:val="single" w:color="CCCCCC" w:sz="2"/>
+            </w:tcBorders>
+            <w:shd w:fill="FFFFFF" w:val="clear"/>
+            <w:tcMar>
+              <w:top w:type="dxa" w:w="80"/>
+              <w:left w:type="dxa" w:w="120"/>
+              <w:bottom w:type="dxa" w:w="80"/>
+              <w:right w:type="dxa" w:w="120"/>
+            </w:tcMar>
+            <w:vAlign w:val="center"/>
+          </w:tcPr>
+          <w:p>
+            <w:pPr>
+              <w:jc w:val="left"/>
+            </w:pPr>
+            <w:r>
+              <w:rPr>
+                <w:b/>
+                <w:bCs/>
+                <w:color w:val="0F2A3D"/>
+                <w:sz w:val="20"/>
+                <w:szCs w:val="20"/>
+              </w:rPr>
+              <w:t xml:space="preserve">Site &amp; Serviced Land Sales (Phase 1)</w:t>
+            </w:r>
+          </w:p>
+        </w:tc>
+        <w:tc>
+          <w:tcPr>
+            <w:tcW w:type="dxa" w:w="3600"/>
+            <w:tcBorders>
+              <w:top w:val="single" w:color="CCCCCC" w:sz="2"/>
+              <w:left w:val="single" w:color="CCCCCC" w:sz="2"/>
+              <w:bottom w:val="single" w:color="CCCCCC" w:sz="2"/>
+              <w:right w:val="single" w:color="CCCCCC" w:sz="2"/>
+            </w:tcBorders>
+            <w:shd w:fill="FFFFFF" w:val="clear"/>
+            <w:tcMar>
+              <w:top w:type="dxa" w:w="80"/>
+              <w:left w:type="dxa" w:w="120"/>
+              <w:bottom w:type="dxa" w:w="80"/>
+              <w:right w:type="dxa" w:w="120"/>
+            </w:tcMar>
+            <w:vAlign w:val="center"/>
+          </w:tcPr>
+          <w:p>
+            <w:pPr>
+              <w:jc w:val="left"/>
+            </w:pPr>
+            <w:r>
+              <w:rPr>
+                <w:b w:val="false"/>
+                <w:bCs w:val="false"/>
+                <w:color w:val="0F2A3D"/>
+                <w:sz w:val="20"/>
+                <w:szCs w:val="20"/>
+              </w:rPr>
+              <w:t xml:space="preserve">₦50 billion</w:t>
+            </w:r>
+          </w:p>
+        </w:tc>
+      </w:tr>
+      <w:tr>
+        <w:tc>
+          <w:tcPr>
+            <w:tcW w:type="dxa" w:w="6480"/>
+            <w:tcBorders>
+              <w:top w:val="single" w:color="CCCCCC" w:sz="2"/>
+              <w:left w:val="single" w:color="CCCCCC" w:sz="2"/>
+              <w:bottom w:val="single" w:color="CCCCCC" w:sz="2"/>
+              <w:right w:val="single" w:color="CCCCCC" w:sz="2"/>
+            </w:tcBorders>
+            <w:shd w:fill="F7F7F7" w:val="clear"/>
+            <w:tcMar>
+              <w:top w:type="dxa" w:w="80"/>
+              <w:left w:type="dxa" w:w="120"/>
+              <w:bottom w:type="dxa" w:w="80"/>
+              <w:right w:type="dxa" w:w="120"/>
+            </w:tcMar>
+            <w:vAlign w:val="center"/>
+          </w:tcPr>
+          <w:p>
+            <w:pPr>
+              <w:jc w:val="left"/>
+            </w:pPr>
+            <w:r>
+              <w:rPr>
+                <w:b/>
+                <w:bCs/>
+                <w:color w:val="0F2A3D"/>
+                <w:sz w:val="20"/>
+                <w:szCs w:val="20"/>
+              </w:rPr>
+              <w:t xml:space="preserve">Duplex Unit Sales (100 units)*</w:t>
+            </w:r>
+          </w:p>
+        </w:tc>
+        <w:tc>
+          <w:tcPr>
+            <w:tcW w:type="dxa" w:w="3600"/>
+            <w:tcBorders>
+              <w:top w:val="single" w:color="CCCCCC" w:sz="2"/>
+              <w:left w:val="single" w:color="CCCCCC" w:sz="2"/>
+              <w:bottom w:val="single" w:color="CCCCCC" w:sz="2"/>
+              <w:right w:val="single" w:color="CCCCCC" w:sz="2"/>
+            </w:tcBorders>
+            <w:shd w:fill="F7F7F7" w:val="clear"/>
+            <w:tcMar>
+              <w:top w:type="dxa" w:w="80"/>
+              <w:left w:type="dxa" w:w="120"/>
+              <w:bottom w:type="dxa" w:w="80"/>
+              <w:right w:type="dxa" w:w="120"/>
+            </w:tcMar>
+            <w:vAlign w:val="center"/>
+          </w:tcPr>
+          <w:p>
+            <w:pPr>
+              <w:jc w:val="left"/>
+            </w:pPr>
+            <w:r>
+              <w:rPr>
+                <w:b w:val="false"/>
+                <w:bCs w:val="false"/>
+                <w:color w:val="0F2A3D"/>
+                <w:sz w:val="20"/>
+                <w:szCs w:val="20"/>
+              </w:rPr>
+              <w:t xml:space="preserve">Additional upside — not included in base case</w:t>
+            </w:r>
+          </w:p>
+        </w:tc>
+      </w:tr>
+      <w:tr>
+        <w:tc>
+          <w:tcPr>
+            <w:tcW w:type="dxa" w:w="6480"/>
+            <w:tcBorders>
+              <w:top w:val="single" w:color="CCCCCC" w:sz="2"/>
+              <w:left w:val="single" w:color="CCCCCC" w:sz="2"/>
+              <w:bottom w:val="single" w:color="CCCCCC" w:sz="2"/>
+              <w:right w:val="single" w:color="CCCCCC" w:sz="2"/>
+            </w:tcBorders>
+            <w:shd w:fill="FFFFFF" w:val="clear"/>
+            <w:tcMar>
+              <w:top w:type="dxa" w:w="80"/>
+              <w:left w:type="dxa" w:w="120"/>
+              <w:bottom w:type="dxa" w:w="80"/>
+              <w:right w:type="dxa" w:w="120"/>
+            </w:tcMar>
+            <w:vAlign w:val="center"/>
+          </w:tcPr>
+          <w:p>
+            <w:pPr>
+              <w:jc w:val="left"/>
+            </w:pPr>
+            <w:r>
+              <w:rPr>
+                <w:b/>
+                <w:bCs/>
+                <w:color w:val="0F2A3D"/>
+                <w:sz w:val="20"/>
+                <w:szCs w:val="20"/>
+              </w:rPr>
+              <w:t xml:space="preserve">Phase 2 Hotel &amp; Shopping Village Income*</w:t>
+            </w:r>
+          </w:p>
+        </w:tc>
+        <w:tc>
+          <w:tcPr>
+            <w:tcW w:type="dxa" w:w="3600"/>
+            <w:tcBorders>
+              <w:top w:val="single" w:color="CCCCCC" w:sz="2"/>
+              <w:left w:val="single" w:color="CCCCCC" w:sz="2"/>
+              <w:bottom w:val="single" w:color="CCCCCC" w:sz="2"/>
+              <w:right w:val="single" w:color="CCCCCC" w:sz="2"/>
+            </w:tcBorders>
+            <w:shd w:fill="FFFFFF" w:val="clear"/>
+            <w:tcMar>
+              <w:top w:type="dxa" w:w="80"/>
+              <w:left w:type="dxa" w:w="120"/>
+              <w:bottom w:type="dxa" w:w="80"/>
+              <w:right w:type="dxa" w:w="120"/>
+            </w:tcMar>
+            <w:vAlign w:val="center"/>
+          </w:tcPr>
+          <w:p>
+            <w:pPr>
+              <w:jc w:val="left"/>
+            </w:pPr>
+            <w:r>
+              <w:rPr>
+                <w:b w:val="false"/>
+                <w:bCs w:val="false"/>
+                <w:color w:val="0F2A3D"/>
+                <w:sz w:val="20"/>
+                <w:szCs w:val="20"/>
+              </w:rPr>
+              <w:t xml:space="preserve">Additional upside — not included in base case</w:t>
+            </w:r>
+          </w:p>
+        </w:tc>
+      </w:tr>
+      <w:tr>
+        <w:tc>
+          <w:tcPr>
+            <w:tcW w:type="dxa" w:w="6480"/>
+            <w:tcBorders>
+              <w:top w:val="single" w:color="CCCCCC" w:sz="2"/>
+              <w:left w:val="single" w:color="CCCCCC" w:sz="2"/>
+              <w:bottom w:val="single" w:color="CCCCCC" w:sz="2"/>
+              <w:right w:val="single" w:color="CCCCCC" w:sz="2"/>
+            </w:tcBorders>
+            <w:shd w:fill="F7F7F7" w:val="clear"/>
+            <w:tcMar>
+              <w:top w:type="dxa" w:w="80"/>
+              <w:left w:type="dxa" w:w="120"/>
+              <w:bottom w:type="dxa" w:w="80"/>
+              <w:right w:type="dxa" w:w="120"/>
+            </w:tcMar>
+            <w:vAlign w:val="center"/>
+          </w:tcPr>
+          <w:p>
+            <w:pPr>
+              <w:jc w:val="left"/>
+            </w:pPr>
+            <w:r>
+              <w:rPr>
+                <w:b/>
+                <w:bCs/>
+                <w:color w:val="0F2A3D"/>
+                <w:sz w:val="20"/>
+                <w:szCs w:val="20"/>
+              </w:rPr>
+              <w:t xml:space="preserve">Phase 3 Hospital, School &amp; Apartments Income*</w:t>
+            </w:r>
+          </w:p>
+        </w:tc>
+        <w:tc>
+          <w:tcPr>
+            <w:tcW w:type="dxa" w:w="3600"/>
+            <w:tcBorders>
+              <w:top w:val="single" w:color="CCCCCC" w:sz="2"/>
+              <w:left w:val="single" w:color="CCCCCC" w:sz="2"/>
+              <w:bottom w:val="single" w:color="CCCCCC" w:sz="2"/>
+              <w:right w:val="single" w:color="CCCCCC" w:sz="2"/>
+            </w:tcBorders>
+            <w:shd w:fill="F7F7F7" w:val="clear"/>
+            <w:tcMar>
+              <w:top w:type="dxa" w:w="80"/>
+              <w:left w:type="dxa" w:w="120"/>
+              <w:bottom w:type="dxa" w:w="80"/>
+              <w:right w:type="dxa" w:w="120"/>
+            </w:tcMar>
+            <w:vAlign w:val="center"/>
+          </w:tcPr>
+          <w:p>
+            <w:pPr>
+              <w:jc w:val="left"/>
+            </w:pPr>
+            <w:r>
+              <w:rPr>
+                <w:b w:val="false"/>
+                <w:bCs w:val="false"/>
+                <w:color w:val="0F2A3D"/>
+                <w:sz w:val="20"/>
+                <w:szCs w:val="20"/>
+              </w:rPr>
+              <w:t xml:space="preserve">Additional upside — not included in base case</w:t>
+            </w:r>
+          </w:p>
+        </w:tc>
+      </w:tr>
+    </w:tbl>
+    <w:p>
+      <w:pPr>
+        <w:spacing w:after="160" w:line="300"/>
+        <w:jc w:val="both"/>
+      </w:pPr>
+      <w:r>
+        <w:rPr>
+          <w:i/>
+          <w:iCs/>
+          <w:color w:val="6B6B6B"/>
+          <w:sz w:val="18"/>
+          <w:szCs w:val="18"/>
+        </w:rPr>
+        <w:t xml:space="preserve">The ₦50 billion Phase 1 land-sale revenue figure is treated as the base-case, conservative revenue line for this plan. Duplex sales and Phase 2/3 hospitality, retail and healthcare income are real, additional revenue streams but are deliberately excluded from the base-case ROI calculation in Section 8 so that the headline return is not overstated.</w:t>
+      </w:r>
+    </w:p>
+    <w:p>
+      <w:r>
+        <w:br w:type="page"/>
+      </w:r>
+    </w:p>
+    <w:p>
+      <w:pPr>
+        <w:pStyle w:val="Heading1"/>
+        <w:spacing w:after="160" w:before="120"/>
+      </w:pPr>
+      <w:r>
+        <w:t xml:space="preserve">10. Profitability Analysis</w:t>
+      </w:r>
+    </w:p>
+    <w:p>
+      <w:pPr>
+        <w:pStyle w:val="Heading2"/>
+        <w:spacing w:after="120" w:before="200"/>
+      </w:pPr>
+      <w:r>
+        <w:t xml:space="preserve">10.1 Base-Case Return (Stated Costs Only)</w:t>
+      </w:r>
+    </w:p>
+    <w:p>
+      <w:pPr>
+        <w:spacing w:after="160" w:line="300"/>
+        <w:jc w:val="both"/>
+      </w:pPr>
+      <w:r>
+        <w:t xml:space="preserve">Using only the costs explicitly stated in the brief — land acquisition (₦2.5B) and duplex construction (₦15B), total ₦17.5B — against the ₦50B Phase 1 land-sale revenue target:</w:t>
+      </w:r>
+    </w:p>
+    <w:tbl>
+      <w:tblPr>
+        <w:tblW w:type="dxa" w:w="10080"/>
+        <w:tblBorders>
+          <w:top w:val="single" w:color="auto" w:sz="4"/>
+          <w:left w:val="single" w:color="auto" w:sz="4"/>
+          <w:bottom w:val="single" w:color="auto" w:sz="4"/>
+          <w:right w:val="single" w:color="auto" w:sz="4"/>
+          <w:insideH w:val="single" w:color="auto" w:sz="4"/>
+          <w:insideV w:val="single" w:color="auto" w:sz="4"/>
+        </w:tblBorders>
+      </w:tblPr>
+      <w:tblGrid>
+        <w:gridCol w:w="6480"/>
+        <w:gridCol w:w="3600"/>
+      </w:tblGrid>
+      <w:tr>
+        <w:tc>
+          <w:tcPr>
+            <w:tcW w:type="dxa" w:w="6480"/>
+            <w:tcBorders>
+              <w:top w:val="single" w:color="CCCCCC" w:sz="2"/>
+              <w:left w:val="single" w:color="CCCCCC" w:sz="2"/>
+              <w:bottom w:val="single" w:color="CCCCCC" w:sz="2"/>
+              <w:right w:val="single" w:color="CCCCCC" w:sz="2"/>
+            </w:tcBorders>
+            <w:shd w:fill="E8F0EA" w:val="clear"/>
+            <w:tcMar>
+              <w:top w:type="dxa" w:w="80"/>
+              <w:left w:type="dxa" w:w="120"/>
+              <w:bottom w:type="dxa" w:w="80"/>
+              <w:right w:type="dxa" w:w="120"/>
+            </w:tcMar>
+            <w:vAlign w:val="center"/>
+          </w:tcPr>
+          <w:p>
+            <w:pPr>
+              <w:jc w:val="left"/>
+            </w:pPr>
+            <w:r>
+              <w:rPr>
+                <w:b/>
+                <w:bCs/>
+                <w:color w:val="0F2A3D"/>
+                <w:sz w:val="20"/>
+                <w:szCs w:val="20"/>
+              </w:rPr>
+              <w:t xml:space="preserve">Metric</w:t>
+            </w:r>
+          </w:p>
+        </w:tc>
+        <w:tc>
+          <w:tcPr>
+            <w:tcW w:type="dxa" w:w="3600"/>
+            <w:tcBorders>
+              <w:top w:val="single" w:color="CCCCCC" w:sz="2"/>
+              <w:left w:val="single" w:color="CCCCCC" w:sz="2"/>
+              <w:bottom w:val="single" w:color="CCCCCC" w:sz="2"/>
+              <w:right w:val="single" w:color="CCCCCC" w:sz="2"/>
+            </w:tcBorders>
+            <w:shd w:fill="E8F0EA" w:val="clear"/>
+            <w:tcMar>
+              <w:top w:type="dxa" w:w="80"/>
+              <w:left w:type="dxa" w:w="120"/>
+              <w:bottom w:type="dxa" w:w="80"/>
+              <w:right w:type="dxa" w:w="120"/>
+            </w:tcMar>
+            <w:vAlign w:val="center"/>
+          </w:tcPr>
+          <w:p>
+            <w:pPr>
+              <w:jc w:val="left"/>
+            </w:pPr>
+            <w:r>
+              <w:rPr>
+                <w:b w:val="false"/>
+                <w:bCs w:val="false"/>
+                <w:color w:val="0F2A3D"/>
+                <w:sz w:val="20"/>
+                <w:szCs w:val="20"/>
+              </w:rPr>
+              <w:t xml:space="preserve">Value</w:t>
+            </w:r>
+          </w:p>
+        </w:tc>
+      </w:tr>
+      <w:tr>
+        <w:tc>
+          <w:tcPr>
+            <w:tcW w:type="dxa" w:w="6480"/>
+            <w:tcBorders>
+              <w:top w:val="single" w:color="CCCCCC" w:sz="2"/>
+              <w:left w:val="single" w:color="CCCCCC" w:sz="2"/>
+              <w:bottom w:val="single" w:color="CCCCCC" w:sz="2"/>
+              <w:right w:val="single" w:color="CCCCCC" w:sz="2"/>
+            </w:tcBorders>
+            <w:shd w:fill="FFFFFF" w:val="clear"/>
+            <w:tcMar>
+              <w:top w:type="dxa" w:w="80"/>
+              <w:left w:type="dxa" w:w="120"/>
+              <w:bottom w:type="dxa" w:w="80"/>
+              <w:right w:type="dxa" w:w="120"/>
+            </w:tcMar>
+            <w:vAlign w:val="center"/>
+          </w:tcPr>
+          <w:p>
+            <w:pPr>
+              <w:jc w:val="left"/>
+            </w:pPr>
+            <w:r>
+              <w:rPr>
+                <w:b/>
+                <w:bCs/>
+                <w:color w:val="0F2A3D"/>
+                <w:sz w:val="20"/>
+                <w:szCs w:val="20"/>
+              </w:rPr>
+              <w:t xml:space="preserve">Total Stated Cost</w:t>
+            </w:r>
+          </w:p>
+        </w:tc>
+        <w:tc>
+          <w:tcPr>
+            <w:tcW w:type="dxa" w:w="3600"/>
+            <w:tcBorders>
+              <w:top w:val="single" w:color="CCCCCC" w:sz="2"/>
+              <w:left w:val="single" w:color="CCCCCC" w:sz="2"/>
+              <w:bottom w:val="single" w:color="CCCCCC" w:sz="2"/>
+              <w:right w:val="single" w:color="CCCCCC" w:sz="2"/>
+            </w:tcBorders>
+            <w:shd w:fill="FFFFFF" w:val="clear"/>
+            <w:tcMar>
+              <w:top w:type="dxa" w:w="80"/>
+              <w:left w:type="dxa" w:w="120"/>
+              <w:bottom w:type="dxa" w:w="80"/>
+              <w:right w:type="dxa" w:w="120"/>
+            </w:tcMar>
+            <w:vAlign w:val="center"/>
+          </w:tcPr>
+          <w:p>
+            <w:pPr>
+              <w:jc w:val="left"/>
+            </w:pPr>
+            <w:r>
+              <w:rPr>
+                <w:b w:val="false"/>
+                <w:bCs w:val="false"/>
+                <w:color w:val="0F2A3D"/>
+                <w:sz w:val="20"/>
+                <w:szCs w:val="20"/>
+              </w:rPr>
+              <w:t xml:space="preserve">₦17.5 billion</w:t>
+            </w:r>
+          </w:p>
+        </w:tc>
+      </w:tr>
+      <w:tr>
+        <w:tc>
+          <w:tcPr>
+            <w:tcW w:type="dxa" w:w="6480"/>
+            <w:tcBorders>
+              <w:top w:val="single" w:color="CCCCCC" w:sz="2"/>
+              <w:left w:val="single" w:color="CCCCCC" w:sz="2"/>
+              <w:bottom w:val="single" w:color="CCCCCC" w:sz="2"/>
+              <w:right w:val="single" w:color="CCCCCC" w:sz="2"/>
+            </w:tcBorders>
+            <w:shd w:fill="F7F7F7" w:val="clear"/>
+            <w:tcMar>
+              <w:top w:type="dxa" w:w="80"/>
+              <w:left w:type="dxa" w:w="120"/>
+              <w:bottom w:type="dxa" w:w="80"/>
+              <w:right w:type="dxa" w:w="120"/>
+            </w:tcMar>
+            <w:vAlign w:val="center"/>
+          </w:tcPr>
+          <w:p>
+            <w:pPr>
+              <w:jc w:val="left"/>
+            </w:pPr>
+            <w:r>
+              <w:rPr>
+                <w:b/>
+                <w:bCs/>
+                <w:color w:val="0F2A3D"/>
+                <w:sz w:val="20"/>
+                <w:szCs w:val="20"/>
+              </w:rPr>
+              <w:t xml:space="preserve">Revenue (Site &amp; Serviced Land Sales)</w:t>
+            </w:r>
+          </w:p>
+        </w:tc>
+        <w:tc>
+          <w:tcPr>
+            <w:tcW w:type="dxa" w:w="3600"/>
+            <w:tcBorders>
+              <w:top w:val="single" w:color="CCCCCC" w:sz="2"/>
+              <w:left w:val="single" w:color="CCCCCC" w:sz="2"/>
+              <w:bottom w:val="single" w:color="CCCCCC" w:sz="2"/>
+              <w:right w:val="single" w:color="CCCCCC" w:sz="2"/>
+            </w:tcBorders>
+            <w:shd w:fill="F7F7F7" w:val="clear"/>
+            <w:tcMar>
+              <w:top w:type="dxa" w:w="80"/>
+              <w:left w:type="dxa" w:w="120"/>
+              <w:bottom w:type="dxa" w:w="80"/>
+              <w:right w:type="dxa" w:w="120"/>
+            </w:tcMar>
+            <w:vAlign w:val="center"/>
+          </w:tcPr>
+          <w:p>
+            <w:pPr>
+              <w:jc w:val="left"/>
+            </w:pPr>
+            <w:r>
+              <w:rPr>
+                <w:b w:val="false"/>
+                <w:bCs w:val="false"/>
+                <w:color w:val="0F2A3D"/>
+                <w:sz w:val="20"/>
+                <w:szCs w:val="20"/>
+              </w:rPr>
+              <w:t xml:space="preserve">₦50 billion</w:t>
+            </w:r>
+          </w:p>
+        </w:tc>
+      </w:tr>
+      <w:tr>
+        <w:tc>
+          <w:tcPr>
+            <w:tcW w:type="dxa" w:w="6480"/>
+            <w:tcBorders>
+              <w:top w:val="single" w:color="CCCCCC" w:sz="2"/>
+              <w:left w:val="single" w:color="CCCCCC" w:sz="2"/>
+              <w:bottom w:val="single" w:color="CCCCCC" w:sz="2"/>
+              <w:right w:val="single" w:color="CCCCCC" w:sz="2"/>
+            </w:tcBorders>
+            <w:shd w:fill="FFFFFF" w:val="clear"/>
+            <w:tcMar>
+              <w:top w:type="dxa" w:w="80"/>
+              <w:left w:type="dxa" w:w="120"/>
+              <w:bottom w:type="dxa" w:w="80"/>
+              <w:right w:type="dxa" w:w="120"/>
+            </w:tcMar>
+            <w:vAlign w:val="center"/>
+          </w:tcPr>
+          <w:p>
+            <w:pPr>
+              <w:jc w:val="left"/>
+            </w:pPr>
+            <w:r>
+              <w:rPr>
+                <w:b/>
+                <w:bCs/>
+                <w:color w:val="0F2A3D"/>
+                <w:sz w:val="20"/>
+                <w:szCs w:val="20"/>
+              </w:rPr>
+              <w:t xml:space="preserve">Gross Profit</w:t>
+            </w:r>
+          </w:p>
+        </w:tc>
+        <w:tc>
+          <w:tcPr>
+            <w:tcW w:type="dxa" w:w="3600"/>
+            <w:tcBorders>
+              <w:top w:val="single" w:color="CCCCCC" w:sz="2"/>
+              <w:left w:val="single" w:color="CCCCCC" w:sz="2"/>
+              <w:bottom w:val="single" w:color="CCCCCC" w:sz="2"/>
+              <w:right w:val="single" w:color="CCCCCC" w:sz="2"/>
+            </w:tcBorders>
+            <w:shd w:fill="FFFFFF" w:val="clear"/>
+            <w:tcMar>
+              <w:top w:type="dxa" w:w="80"/>
+              <w:left w:type="dxa" w:w="120"/>
+              <w:bottom w:type="dxa" w:w="80"/>
+              <w:right w:type="dxa" w:w="120"/>
+            </w:tcMar>
+            <w:vAlign w:val="center"/>
+          </w:tcPr>
+          <w:p>
+            <w:pPr>
+              <w:jc w:val="left"/>
+            </w:pPr>
+            <w:r>
+              <w:rPr>
+                <w:b w:val="false"/>
+                <w:bCs w:val="false"/>
+                <w:color w:val="0F2A3D"/>
+                <w:sz w:val="20"/>
+                <w:szCs w:val="20"/>
+              </w:rPr>
+              <w:t xml:space="preserve">₦32.5 billion</w:t>
+            </w:r>
+          </w:p>
+        </w:tc>
+      </w:tr>
+      <w:tr>
+        <w:tc>
+          <w:tcPr>
+            <w:tcW w:type="dxa" w:w="6480"/>
+            <w:tcBorders>
+              <w:top w:val="single" w:color="CCCCCC" w:sz="2"/>
+              <w:left w:val="single" w:color="CCCCCC" w:sz="2"/>
+              <w:bottom w:val="single" w:color="CCCCCC" w:sz="2"/>
+              <w:right w:val="single" w:color="CCCCCC" w:sz="2"/>
+            </w:tcBorders>
+            <w:shd w:fill="F7F7F7" w:val="clear"/>
+            <w:tcMar>
+              <w:top w:type="dxa" w:w="80"/>
+              <w:left w:type="dxa" w:w="120"/>
+              <w:bottom w:type="dxa" w:w="80"/>
+              <w:right w:type="dxa" w:w="120"/>
+            </w:tcMar>
+            <w:vAlign w:val="center"/>
+          </w:tcPr>
+          <w:p>
+            <w:pPr>
+              <w:jc w:val="left"/>
+            </w:pPr>
+            <w:r>
+              <w:rPr>
+                <w:b/>
+                <w:bCs/>
+                <w:color w:val="0F2A3D"/>
+                <w:sz w:val="20"/>
+                <w:szCs w:val="20"/>
+              </w:rPr>
+              <w:t xml:space="preserve">Return on Investment</w:t>
+            </w:r>
+          </w:p>
+        </w:tc>
+        <w:tc>
+          <w:tcPr>
+            <w:tcW w:type="dxa" w:w="3600"/>
+            <w:tcBorders>
+              <w:top w:val="single" w:color="CCCCCC" w:sz="2"/>
+              <w:left w:val="single" w:color="CCCCCC" w:sz="2"/>
+              <w:bottom w:val="single" w:color="CCCCCC" w:sz="2"/>
+              <w:right w:val="single" w:color="CCCCCC" w:sz="2"/>
+            </w:tcBorders>
+            <w:shd w:fill="F7F7F7" w:val="clear"/>
+            <w:tcMar>
+              <w:top w:type="dxa" w:w="80"/>
+              <w:left w:type="dxa" w:w="120"/>
+              <w:bottom w:type="dxa" w:w="80"/>
+              <w:right w:type="dxa" w:w="120"/>
+            </w:tcMar>
+            <w:vAlign w:val="center"/>
+          </w:tcPr>
+          <w:p>
+            <w:pPr>
+              <w:jc w:val="left"/>
+            </w:pPr>
+            <w:r>
+              <w:rPr>
+                <w:b w:val="false"/>
+                <w:bCs w:val="false"/>
+                <w:color w:val="0F2A3D"/>
+                <w:sz w:val="20"/>
+                <w:szCs w:val="20"/>
+              </w:rPr>
+              <w:t xml:space="preserve">≈185.7%</w:t>
+            </w:r>
+          </w:p>
+        </w:tc>
+      </w:tr>
+      <w:tr>
+        <w:tc>
+          <w:tcPr>
+            <w:tcW w:type="dxa" w:w="6480"/>
+            <w:tcBorders>
+              <w:top w:val="single" w:color="CCCCCC" w:sz="2"/>
+              <w:left w:val="single" w:color="CCCCCC" w:sz="2"/>
+              <w:bottom w:val="single" w:color="CCCCCC" w:sz="2"/>
+              <w:right w:val="single" w:color="CCCCCC" w:sz="2"/>
+            </w:tcBorders>
+            <w:shd w:fill="FFFFFF" w:val="clear"/>
+            <w:tcMar>
+              <w:top w:type="dxa" w:w="80"/>
+              <w:left w:type="dxa" w:w="120"/>
+              <w:bottom w:type="dxa" w:w="80"/>
+              <w:right w:type="dxa" w:w="120"/>
+            </w:tcMar>
+            <w:vAlign w:val="center"/>
+          </w:tcPr>
+          <w:p>
+            <w:pPr>
+              <w:jc w:val="left"/>
+            </w:pPr>
+            <w:r>
+              <w:rPr>
+                <w:b/>
+                <w:bCs/>
+                <w:color w:val="0F2A3D"/>
+                <w:sz w:val="20"/>
+                <w:szCs w:val="20"/>
+              </w:rPr>
+              <w:t xml:space="preserve">Profit Margin (Profit / Revenue)</w:t>
+            </w:r>
+          </w:p>
+        </w:tc>
+        <w:tc>
+          <w:tcPr>
+            <w:tcW w:type="dxa" w:w="3600"/>
+            <w:tcBorders>
+              <w:top w:val="single" w:color="CCCCCC" w:sz="2"/>
+              <w:left w:val="single" w:color="CCCCCC" w:sz="2"/>
+              <w:bottom w:val="single" w:color="CCCCCC" w:sz="2"/>
+              <w:right w:val="single" w:color="CCCCCC" w:sz="2"/>
+            </w:tcBorders>
+            <w:shd w:fill="FFFFFF" w:val="clear"/>
+            <w:tcMar>
+              <w:top w:type="dxa" w:w="80"/>
+              <w:left w:type="dxa" w:w="120"/>
+              <w:bottom w:type="dxa" w:w="80"/>
+              <w:right w:type="dxa" w:w="120"/>
+            </w:tcMar>
+            <w:vAlign w:val="center"/>
+          </w:tcPr>
+          <w:p>
+            <w:pPr>
+              <w:jc w:val="left"/>
+            </w:pPr>
+            <w:r>
+              <w:rPr>
+                <w:b w:val="false"/>
+                <w:bCs w:val="false"/>
+                <w:color w:val="0F2A3D"/>
+                <w:sz w:val="20"/>
+                <w:szCs w:val="20"/>
+              </w:rPr>
+              <w:t xml:space="preserve">65%</w:t>
+            </w:r>
+          </w:p>
+        </w:tc>
+      </w:tr>
+    </w:tbl>
+    <w:p>
+      <w:pPr>
+        <w:pStyle w:val="Heading2"/>
+        <w:spacing w:after="120" w:before="200"/>
+      </w:pPr>
+      <w:r>
+        <w:t xml:space="preserve">10.2 Stress-Tested Return (Maximum Cost Buffer)</w:t>
+      </w:r>
+    </w:p>
+    <w:p>
+      <w:pPr>
+        <w:spacing w:after="160" w:line="300"/>
+        <w:jc w:val="both"/>
+      </w:pPr>
+      <w:r>
+        <w:t xml:space="preserve">To test how much room the project has for costs not itemized in the brief — golf course construction, clubhouse, roads, drainage, power, water, marketing and contingency — the analysis solves for the maximum total cost that still clears the 20% minimum ROI, holding revenue fixed at ₦50B:</w:t>
       </w:r>
     </w:p>
     <w:p>
@@ -4084,9 +4485,9 @@
       <w:r>
         <w:drawing>
           <wp:inline distT="0" distB="0" distL="0" distR="0">
-            <wp:extent cx="4191000" cy="2857500"/>
+            <wp:extent cx="4381500" cy="3048000"/>
             <wp:effectExtent t="0" r="0" b="0" l="0"/>
-            <wp:docPr id="1" name="Revenue vs cost vs profit chart" descr="Revenue vs cost vs profit chart" title="Revenue vs cost vs profit chart"/>
+            <wp:docPr id="1" name="ROI sensitivity chart" descr="ROI sensitivity chart" title="ROI sensitivity chart"/>
             <wp:cNvGraphicFramePr>
               <a:graphicFrameLocks xmlns:a="http://schemas.openxmlformats.org/drawingml/2006/main" noChangeAspect="1"/>
             </wp:cNvGraphicFramePr>
@@ -4109,6 +4510,67 @@
                   <pic:spPr bwMode="auto">
                     <a:xfrm>
                       <a:off x="0" y="0"/>
+                      <a:ext cx="4381500" cy="3048000"/>
+                    </a:xfrm>
+                    <a:prstGeom prst="rect">
+                      <a:avLst/>
+                    </a:prstGeom>
+                  </pic:spPr>
+                </pic:pic>
+              </a:graphicData>
+            </a:graphic>
+          </wp:inline>
+        </w:drawing>
+      </w:r>
+    </w:p>
+    <w:p>
+      <w:pPr>
+        <w:spacing w:after="240" w:before="60"/>
+        <w:jc w:val="center"/>
+      </w:pPr>
+      <w:r>
+        <w:rPr>
+          <w:i/>
+          <w:iCs/>
+          <w:color w:val="6B6B6B"/>
+          <w:sz w:val="18"/>
+          <w:szCs w:val="18"/>
+        </w:rPr>
+        <w:t xml:space="preserve">Figure 5 — Total cost vs. ROI: stated-cost scenario vs. maximum cost buffer at the 20% floor</w:t>
+      </w:r>
+    </w:p>
+    <w:p>
+      <w:pPr>
+        <w:jc w:val="center"/>
+      </w:pPr>
+      <w:r>
+        <w:drawing>
+          <wp:inline distT="0" distB="0" distL="0" distR="0">
+            <wp:extent cx="4191000" cy="2857500"/>
+            <wp:effectExtent t="0" r="0" b="0" l="0"/>
+            <wp:docPr id="1" name="Revenue vs cost vs profit chart" descr="Revenue vs cost vs profit chart" title="Revenue vs cost vs profit chart"/>
+            <wp:cNvGraphicFramePr>
+              <a:graphicFrameLocks xmlns:a="http://schemas.openxmlformats.org/drawingml/2006/main" noChangeAspect="1"/>
+            </wp:cNvGraphicFramePr>
+            <a:graphic xmlns:a="http://schemas.openxmlformats.org/drawingml/2006/main">
+              <a:graphicData uri="http://schemas.openxmlformats.org/drawingml/2006/picture">
+                <pic:pic xmlns:pic="http://schemas.openxmlformats.org/drawingml/2006/picture">
+                  <pic:nvPicPr>
+                    <pic:cNvPr id="0" name="" descr=""/>
+                    <pic:cNvPicPr>
+                      <a:picLocks noChangeAspect="1" noChangeArrowheads="1"/>
+                    </pic:cNvPicPr>
+                  </pic:nvPicPr>
+                  <pic:blipFill>
+                    <a:blip r:embed="rId16" cstate="none"/>
+                    <a:srcRect/>
+                    <a:stretch>
+                      <a:fillRect/>
+                    </a:stretch>
+                  </pic:blipFill>
+                  <pic:spPr bwMode="auto">
+                    <a:xfrm>
+                      <a:off x="0" y="0"/>
                       <a:ext cx="4191000" cy="2857500"/>
                     </a:xfrm>
                     <a:prstGeom prst="rect">
@@ -4520,7 +4982,7 @@
         <w:spacing w:after="120" w:before="200"/>
       </w:pPr>
       <w:r>
-        <w:t xml:space="preserve">8.3 Payback Period</w:t>
+        <w:t xml:space="preserve">10.3 Payback Period</w:t>
       </w:r>
     </w:p>
     <w:p>
@@ -4543,7 +5005,7 @@
         <w:spacing w:after="160" w:before="120"/>
       </w:pPr>
       <w:r>
-        <w:t xml:space="preserve">9. Legal, Regulatory &amp; Land Title Framework</w:t>
+        <w:t xml:space="preserve">11. Legal, Regulatory &amp; Land Title Framework</w:t>
       </w:r>
     </w:p>
     <w:p>
@@ -4561,7 +5023,7 @@
         <w:spacing w:after="120" w:before="200"/>
       </w:pPr>
       <w:r>
-        <w:t xml:space="preserve">9.1 Land Title</w:t>
+        <w:t xml:space="preserve">11.1 Land Title</w:t>
       </w:r>
     </w:p>
     <w:p>
@@ -4609,7 +5071,7 @@
         <w:spacing w:after="120" w:before="200"/>
       </w:pPr>
       <w:r>
-        <w:t xml:space="preserve">9.2 Regulatory Approvals</w:t>
+        <w:t xml:space="preserve">11.2 Regulatory Approvals</w:t>
       </w:r>
     </w:p>
     <w:p>
@@ -4657,7 +5119,7 @@
         <w:spacing w:after="120" w:before="200"/>
       </w:pPr>
       <w:r>
-        <w:t xml:space="preserve">9.3 Sales &amp; Consumer Protection Compliance</w:t>
+        <w:t xml:space="preserve">11.3 Sales &amp; Consumer Protection Compliance</w:t>
       </w:r>
     </w:p>
     <w:p>
@@ -4706,7 +5168,7 @@
         <w:spacing w:after="160" w:before="120"/>
       </w:pPr>
       <w:r>
-        <w:t xml:space="preserve">10. Marketing &amp; Sales Strategy</w:t>
+        <w:t xml:space="preserve">12. Marketing &amp; Sales Strategy</w:t>
       </w:r>
     </w:p>
     <w:p>
@@ -4715,7 +5177,7 @@
         <w:spacing w:after="120" w:before="200"/>
       </w:pPr>
       <w:r>
-        <w:t xml:space="preserve">10.1 Positioning &amp; Messaging</w:t>
+        <w:t xml:space="preserve">12.1 Positioning &amp; Messaging</w:t>
       </w:r>
     </w:p>
     <w:p>
@@ -4733,7 +5195,7 @@
         <w:spacing w:after="120" w:before="200"/>
       </w:pPr>
       <w:r>
-        <w:t xml:space="preserve">10.2 Sales Channels</w:t>
+        <w:t xml:space="preserve">12.2 Sales Channels</w:t>
       </w:r>
     </w:p>
     <w:p>
@@ -4794,7 +5256,7 @@
         <w:spacing w:after="120" w:before="200"/>
       </w:pPr>
       <w:r>
-        <w:t xml:space="preserve">10.3 Pricing &amp; Release Strategy</w:t>
+        <w:t xml:space="preserve">12.3 Pricing &amp; Release Strategy</w:t>
       </w:r>
     </w:p>
     <w:p>
@@ -4847,7 +5309,7 @@
         <w:spacing w:after="160" w:before="120"/>
       </w:pPr>
       <w:r>
-        <w:t xml:space="preserve">11. Organizational Structure &amp; Management</w:t>
+        <w:t xml:space="preserve">13. Organizational Structure &amp; Management</w:t>
       </w:r>
     </w:p>
     <w:p>
@@ -4856,7 +5318,7 @@
         <w:spacing w:after="120" w:before="200"/>
       </w:pPr>
       <w:r>
-        <w:t xml:space="preserve">11.1 Sponsor</w:t>
+        <w:t xml:space="preserve">13.1 Sponsor</w:t>
       </w:r>
     </w:p>
     <w:p>
@@ -4874,7 +5336,7 @@
         <w:spacing w:after="120" w:before="200"/>
       </w:pPr>
       <w:r>
-        <w:t xml:space="preserve">11.2 Delivery Team</w:t>
+        <w:t xml:space="preserve">13.2 Delivery Team</w:t>
       </w:r>
     </w:p>
     <w:p>
@@ -4975,7 +5437,7 @@
         <w:spacing w:after="160" w:before="120"/>
       </w:pPr>
       <w:r>
-        <w:t xml:space="preserve">12. SWOT Analysis</w:t>
+        <w:t xml:space="preserve">14. SWOT Analysis</w:t>
       </w:r>
     </w:p>
     <w:tbl>
@@ -5346,7 +5808,7 @@
         <w:spacing w:after="160" w:before="120"/>
       </w:pPr>
       <w:r>
-        <w:t xml:space="preserve">13. Risk Analysis &amp; Mitigation</w:t>
+        <w:t xml:space="preserve">15. Risk Analysis &amp; Mitigation</w:t>
       </w:r>
     </w:p>
     <w:tbl>
@@ -6106,7 +6568,7 @@
         <w:spacing w:after="160" w:before="120"/>
       </w:pPr>
       <w:r>
-        <w:t xml:space="preserve">14. Exit Strategy &amp; Long-Term Value Creation</w:t>
+        <w:t xml:space="preserve">16. Exit Strategy &amp; Long-Term Value Creation</w:t>
       </w:r>
     </w:p>
     <w:p>
@@ -6141,7 +6603,7 @@
         <w:spacing w:after="90"/>
       </w:pPr>
       <w:r>
-        <w:t xml:space="preserve">Retained or leased income from the Phase 3 hospital/wellness facility, potentially in partnership with a healthcare operator.</w:t>
+        <w:t xml:space="preserve">Retained or leased income from the Phase 3 hospital/wellness facility and international school, potentially in partnership with a healthcare operator and an education operator respectively.</w:t>
       </w:r>
     </w:p>
     <w:p>
@@ -6190,7 +6652,7 @@
         <w:spacing w:after="160" w:before="120"/>
       </w:pPr>
       <w:r>
-        <w:t xml:space="preserve">15. Implementation Roadmap &amp; Conclusion</w:t>
+        <w:t xml:space="preserve">17. Implementation Roadmap &amp; Conclusion</w:t>
       </w:r>
     </w:p>
     <w:p>
@@ -6199,7 +6661,7 @@
         <w:spacing w:after="120" w:before="200"/>
       </w:pPr>
       <w:r>
-        <w:t xml:space="preserve">15.1 Roadmap</w:t>
+        <w:t xml:space="preserve">17.1 Roadmap</w:t>
       </w:r>
     </w:p>
     <w:p>
@@ -6277,7 +6739,7 @@
         <w:spacing w:after="90"/>
       </w:pPr>
       <w:r>
-        <w:t xml:space="preserve">Progress to Phase 2 (hotel &amp; shopping village) and Phase 3 (hospital &amp; apartments) as Phase 1 sales proceeds are realized.</w:t>
+        <w:t xml:space="preserve">Progress to Phase 2 (hotel &amp; shopping village) and Phase 3 (hospital, school &amp; apartments) as Phase 1 sales proceeds are realized.</w:t>
       </w:r>
     </w:p>
     <w:p>
@@ -6286,7 +6748,7 @@
         <w:spacing w:after="120" w:before="200"/>
       </w:pPr>
       <w:r>
-        <w:t xml:space="preserve">15.2 Conclusion</w:t>
+        <w:t xml:space="preserve">17.2 Conclusion</w:t>
       </w:r>
     </w:p>
     <w:p>

</xml_diff>

<commit_message>
Reconcile land use with Tom's ChatGPT spatial layout: 18-hole course w/ lakes, 22ha residential zone, hospital+school confirmed
</commit_message>
<xml_diff>
--- a/golf-estate/The_77_Golf_and_Country_Estate_Business_Plan.docx
+++ b/golf-estate/The_77_Golf_and_Country_Estate_Business_Plan.docx
@@ -817,7 +817,7 @@
                 <w:sz w:val="20"/>
                 <w:szCs w:val="20"/>
               </w:rPr>
-              <w:t xml:space="preserve">27 hectares (18-hole executive-style layout)</w:t>
+              <w:t xml:space="preserve">27 hectares — 18-hole, with lakes, fairways &amp; greens</w:t>
             </w:r>
           </w:p>
         </w:tc>
@@ -1467,7 +1467,7 @@
         <w:jc w:val="both"/>
       </w:pPr>
       <w:r>
-        <w:t xml:space="preserve">The full 77-hectare site is allocated across residential, recreational, commercial and infrastructure uses as summarized below and illustrated in Figure 1.</w:t>
+        <w:t xml:space="preserve">The full 77-hectare site is allocated across residential, recreational, commercial, healthcare, education and infrastructure uses as summarized below and illustrated in Figure 1. This allocation has been cross-checked against an independent conceptual spatial layout and matches it closely, with the golf course, hotel and shopping village areas confirmed at identical hectare figures.</w:t>
       </w:r>
     </w:p>
     <w:p>
@@ -1657,7 +1657,7 @@
                 <w:sz w:val="20"/>
                 <w:szCs w:val="20"/>
               </w:rPr>
-              <w:t xml:space="preserve">Golf Course</w:t>
+              <w:t xml:space="preserve">18-Hole Golf Course (Lakes, Fairways &amp; Greens)</w:t>
             </w:r>
           </w:p>
         </w:tc>
@@ -1727,7 +1727,7 @@
                 <w:sz w:val="20"/>
                 <w:szCs w:val="20"/>
               </w:rPr>
-              <w:t xml:space="preserve">Site &amp; Serviced Plots (for direct sale)</w:t>
+              <w:t xml:space="preserve">Golf Estate Residential (100 duplexes + serviced plots)</w:t>
             </w:r>
           </w:p>
         </w:tc>
@@ -1761,7 +1761,7 @@
                 <w:sz w:val="20"/>
                 <w:szCs w:val="20"/>
               </w:rPr>
-              <w:t xml:space="preserve">27 ha</w:t>
+              <w:t xml:space="preserve">22 ha</w:t>
             </w:r>
           </w:p>
         </w:tc>
@@ -1797,7 +1797,7 @@
                 <w:sz w:val="20"/>
                 <w:szCs w:val="20"/>
               </w:rPr>
-              <w:t xml:space="preserve">Phase 2 — Clubhouse, Hotel &amp; Shopping Village</w:t>
+              <w:t xml:space="preserve">Clubhouse, Sports &amp; Golf Academy</w:t>
             </w:r>
           </w:p>
         </w:tc>
@@ -1831,7 +1831,7 @@
                 <w:sz w:val="20"/>
                 <w:szCs w:val="20"/>
               </w:rPr>
-              <w:t xml:space="preserve">8 ha</w:t>
+              <w:t xml:space="preserve">6 ha</w:t>
             </w:r>
           </w:p>
         </w:tc>
@@ -1867,7 +1867,7 @@
                 <w:sz w:val="20"/>
                 <w:szCs w:val="20"/>
               </w:rPr>
-              <w:t xml:space="preserve">Phase 3 — Hospital, School &amp; Apartments</w:t>
+              <w:t xml:space="preserve">Hotel &amp; Resort</w:t>
             </w:r>
           </w:p>
         </w:tc>
@@ -1901,7 +1901,7 @@
                 <w:sz w:val="20"/>
                 <w:szCs w:val="20"/>
               </w:rPr>
-              <w:t xml:space="preserve">6 ha</w:t>
+              <w:t xml:space="preserve">4 ha</w:t>
             </w:r>
           </w:p>
         </w:tc>
@@ -1937,7 +1937,7 @@
                 <w:sz w:val="20"/>
                 <w:szCs w:val="20"/>
               </w:rPr>
-              <w:t xml:space="preserve">Residential Duplexes (100 units)</w:t>
+              <w:t xml:space="preserve">Shopping &amp; Lifestyle Village</w:t>
             </w:r>
           </w:p>
         </w:tc>
@@ -1971,7 +1971,7 @@
                 <w:sz w:val="20"/>
                 <w:szCs w:val="20"/>
               </w:rPr>
-              <w:t xml:space="preserve">5 ha</w:t>
+              <w:t xml:space="preserve">4 ha</w:t>
             </w:r>
           </w:p>
         </w:tc>
@@ -2007,7 +2007,7 @@
                 <w:sz w:val="20"/>
                 <w:szCs w:val="20"/>
               </w:rPr>
-              <w:t xml:space="preserve">Roads, Utilities &amp; Green Buffer</w:t>
+              <w:t xml:space="preserve">Hospital &amp; Wellness</w:t>
             </w:r>
           </w:p>
         </w:tc>
@@ -2041,7 +2041,7 @@
                 <w:sz w:val="20"/>
                 <w:szCs w:val="20"/>
               </w:rPr>
-              <w:t xml:space="preserve">4 ha</w:t>
+              <w:t xml:space="preserve">3 ha</w:t>
             </w:r>
           </w:p>
         </w:tc>
@@ -2077,6 +2077,216 @@
                 <w:sz w:val="20"/>
                 <w:szCs w:val="20"/>
               </w:rPr>
+              <w:t xml:space="preserve">International School</w:t>
+            </w:r>
+          </w:p>
+        </w:tc>
+        <w:tc>
+          <w:tcPr>
+            <w:tcW w:type="dxa" w:w="3600"/>
+            <w:tcBorders>
+              <w:top w:val="single" w:color="CCCCCC" w:sz="2"/>
+              <w:left w:val="single" w:color="CCCCCC" w:sz="2"/>
+              <w:bottom w:val="single" w:color="CCCCCC" w:sz="2"/>
+              <w:right w:val="single" w:color="CCCCCC" w:sz="2"/>
+            </w:tcBorders>
+            <w:shd w:fill="FFFFFF" w:val="clear"/>
+            <w:tcMar>
+              <w:top w:type="dxa" w:w="80"/>
+              <w:left w:type="dxa" w:w="120"/>
+              <w:bottom w:type="dxa" w:w="80"/>
+              <w:right w:type="dxa" w:w="120"/>
+            </w:tcMar>
+            <w:vAlign w:val="center"/>
+          </w:tcPr>
+          <w:p>
+            <w:pPr>
+              <w:jc w:val="left"/>
+            </w:pPr>
+            <w:r>
+              <w:rPr>
+                <w:b w:val="false"/>
+                <w:bCs w:val="false"/>
+                <w:color w:val="0F2A3D"/>
+                <w:sz w:val="20"/>
+                <w:szCs w:val="20"/>
+              </w:rPr>
+              <w:t xml:space="preserve">3 ha</w:t>
+            </w:r>
+          </w:p>
+        </w:tc>
+      </w:tr>
+      <w:tr>
+        <w:tc>
+          <w:tcPr>
+            <w:tcW w:type="dxa" w:w="6480"/>
+            <w:tcBorders>
+              <w:top w:val="single" w:color="CCCCCC" w:sz="2"/>
+              <w:left w:val="single" w:color="CCCCCC" w:sz="2"/>
+              <w:bottom w:val="single" w:color="CCCCCC" w:sz="2"/>
+              <w:right w:val="single" w:color="CCCCCC" w:sz="2"/>
+            </w:tcBorders>
+            <w:shd w:fill="F7F7F7" w:val="clear"/>
+            <w:tcMar>
+              <w:top w:type="dxa" w:w="80"/>
+              <w:left w:type="dxa" w:w="120"/>
+              <w:bottom w:type="dxa" w:w="80"/>
+              <w:right w:type="dxa" w:w="120"/>
+            </w:tcMar>
+            <w:vAlign w:val="center"/>
+          </w:tcPr>
+          <w:p>
+            <w:pPr>
+              <w:jc w:val="left"/>
+            </w:pPr>
+            <w:r>
+              <w:rPr>
+                <w:b/>
+                <w:bCs/>
+                <w:color w:val="0F2A3D"/>
+                <w:sz w:val="20"/>
+                <w:szCs w:val="20"/>
+              </w:rPr>
+              <w:t xml:space="preserve">Main Gate, Security &amp; Services</w:t>
+            </w:r>
+          </w:p>
+        </w:tc>
+        <w:tc>
+          <w:tcPr>
+            <w:tcW w:type="dxa" w:w="3600"/>
+            <w:tcBorders>
+              <w:top w:val="single" w:color="CCCCCC" w:sz="2"/>
+              <w:left w:val="single" w:color="CCCCCC" w:sz="2"/>
+              <w:bottom w:val="single" w:color="CCCCCC" w:sz="2"/>
+              <w:right w:val="single" w:color="CCCCCC" w:sz="2"/>
+            </w:tcBorders>
+            <w:shd w:fill="F7F7F7" w:val="clear"/>
+            <w:tcMar>
+              <w:top w:type="dxa" w:w="80"/>
+              <w:left w:type="dxa" w:w="120"/>
+              <w:bottom w:type="dxa" w:w="80"/>
+              <w:right w:type="dxa" w:w="120"/>
+            </w:tcMar>
+            <w:vAlign w:val="center"/>
+          </w:tcPr>
+          <w:p>
+            <w:pPr>
+              <w:jc w:val="left"/>
+            </w:pPr>
+            <w:r>
+              <w:rPr>
+                <w:b w:val="false"/>
+                <w:bCs w:val="false"/>
+                <w:color w:val="0F2A3D"/>
+                <w:sz w:val="20"/>
+                <w:szCs w:val="20"/>
+              </w:rPr>
+              <w:t xml:space="preserve">2 ha</w:t>
+            </w:r>
+          </w:p>
+        </w:tc>
+      </w:tr>
+      <w:tr>
+        <w:tc>
+          <w:tcPr>
+            <w:tcW w:type="dxa" w:w="6480"/>
+            <w:tcBorders>
+              <w:top w:val="single" w:color="CCCCCC" w:sz="2"/>
+              <w:left w:val="single" w:color="CCCCCC" w:sz="2"/>
+              <w:bottom w:val="single" w:color="CCCCCC" w:sz="2"/>
+              <w:right w:val="single" w:color="CCCCCC" w:sz="2"/>
+            </w:tcBorders>
+            <w:shd w:fill="FFFFFF" w:val="clear"/>
+            <w:tcMar>
+              <w:top w:type="dxa" w:w="80"/>
+              <w:left w:type="dxa" w:w="120"/>
+              <w:bottom w:type="dxa" w:w="80"/>
+              <w:right w:type="dxa" w:w="120"/>
+            </w:tcMar>
+            <w:vAlign w:val="center"/>
+          </w:tcPr>
+          <w:p>
+            <w:pPr>
+              <w:jc w:val="left"/>
+            </w:pPr>
+            <w:r>
+              <w:rPr>
+                <w:b/>
+                <w:bCs/>
+                <w:color w:val="0F2A3D"/>
+                <w:sz w:val="20"/>
+                <w:szCs w:val="20"/>
+              </w:rPr>
+              <w:t xml:space="preserve">Roads &amp; Green Buffer</w:t>
+            </w:r>
+          </w:p>
+        </w:tc>
+        <w:tc>
+          <w:tcPr>
+            <w:tcW w:type="dxa" w:w="3600"/>
+            <w:tcBorders>
+              <w:top w:val="single" w:color="CCCCCC" w:sz="2"/>
+              <w:left w:val="single" w:color="CCCCCC" w:sz="2"/>
+              <w:bottom w:val="single" w:color="CCCCCC" w:sz="2"/>
+              <w:right w:val="single" w:color="CCCCCC" w:sz="2"/>
+            </w:tcBorders>
+            <w:shd w:fill="FFFFFF" w:val="clear"/>
+            <w:tcMar>
+              <w:top w:type="dxa" w:w="80"/>
+              <w:left w:type="dxa" w:w="120"/>
+              <w:bottom w:type="dxa" w:w="80"/>
+              <w:right w:type="dxa" w:w="120"/>
+            </w:tcMar>
+            <w:vAlign w:val="center"/>
+          </w:tcPr>
+          <w:p>
+            <w:pPr>
+              <w:jc w:val="left"/>
+            </w:pPr>
+            <w:r>
+              <w:rPr>
+                <w:b w:val="false"/>
+                <w:bCs w:val="false"/>
+                <w:color w:val="0F2A3D"/>
+                <w:sz w:val="20"/>
+                <w:szCs w:val="20"/>
+              </w:rPr>
+              <w:t xml:space="preserve">6 ha</w:t>
+            </w:r>
+          </w:p>
+        </w:tc>
+      </w:tr>
+      <w:tr>
+        <w:tc>
+          <w:tcPr>
+            <w:tcW w:type="dxa" w:w="6480"/>
+            <w:tcBorders>
+              <w:top w:val="single" w:color="CCCCCC" w:sz="2"/>
+              <w:left w:val="single" w:color="CCCCCC" w:sz="2"/>
+              <w:bottom w:val="single" w:color="CCCCCC" w:sz="2"/>
+              <w:right w:val="single" w:color="CCCCCC" w:sz="2"/>
+            </w:tcBorders>
+            <w:shd w:fill="F7F7F7" w:val="clear"/>
+            <w:tcMar>
+              <w:top w:type="dxa" w:w="80"/>
+              <w:left w:type="dxa" w:w="120"/>
+              <w:bottom w:type="dxa" w:w="80"/>
+              <w:right w:type="dxa" w:w="120"/>
+            </w:tcMar>
+            <w:vAlign w:val="center"/>
+          </w:tcPr>
+          <w:p>
+            <w:pPr>
+              <w:jc w:val="left"/>
+            </w:pPr>
+            <w:r>
+              <w:rPr>
+                <w:b/>
+                <w:bCs/>
+                <w:color w:val="0F2A3D"/>
+                <w:sz w:val="20"/>
+                <w:szCs w:val="20"/>
+              </w:rPr>
               <w:t xml:space="preserve">Total</w:t>
             </w:r>
           </w:p>
@@ -2090,7 +2300,7 @@
               <w:bottom w:val="single" w:color="CCCCCC" w:sz="2"/>
               <w:right w:val="single" w:color="CCCCCC" w:sz="2"/>
             </w:tcBorders>
-            <w:shd w:fill="FFFFFF" w:val="clear"/>
+            <w:shd w:fill="F7F7F7" w:val="clear"/>
             <w:tcMar>
               <w:top w:type="dxa" w:w="80"/>
               <w:left w:type="dxa" w:w="120"/>
@@ -2130,7 +2340,7 @@
           <w:sz w:val="18"/>
           <w:szCs w:val="18"/>
         </w:rPr>
-        <w:t xml:space="preserve">Note: the land use split above is an illustrative allocation consistent with the parameters provided; the precise boundaries will be finalized once the topographical survey and architectural masterplan are completed.</w:t>
+        <w:t xml:space="preserve">Note: the golf course, golf estate residential zone, hotel and shopping village figures match Tom's independently produced conceptual spatial layout exactly (27 ha / 22 ha / 4 ha / 4 ha). The clubhouse &amp; sports, hospital, international school, gatehouse/security and roads figures are reasonable planning allocations for the remaining land and should be confirmed once the topographical survey and architectural masterplan are completed.</w:t>
       </w:r>
     </w:p>
     <w:p>
@@ -2162,7 +2372,7 @@
         <w:jc w:val="both"/>
       </w:pPr>
       <w:r>
-        <w:t xml:space="preserve">The 27-hectare allocation is designed as a full 18-hole golf course, using a compact executive-style layout (shorter par-3/par-4 holes and tighter routing) rather than a full championship-length course, which typically needs 45–60+ hectares. This design approach keeps all 18 holes on-site within the confirmed land parcel, alongside a signature clubhouse, practice range and pro-shop, without compromising playability or the safety buffers required around residential plots.</w:t>
+        <w:t xml:space="preserve">The 27-hectare allocation is a full 18-hole golf course featuring lakes, fairways and greens, confirmed against Tom’s own conceptual spatial layout. Fitting all 18 holes into 27 hectares is achieved through a resort-style routing — shorter fairway lengths and strategic use of the lakes as water hazards — rather than a full long-championship layout, which would typically require 45–60+ ha. The adjoining 6-hectare zone houses the clubhouse, sports facilities and a golf academy (practice range, teaching pro, pro-shop), kept as a distinct precinct from the fairways themselves.</w:t>
       </w:r>
     </w:p>
     <w:p>
@@ -2180,7 +2390,7 @@
         <w:jc w:val="both"/>
       </w:pPr>
       <w:r>
-        <w:t xml:space="preserve">Phase 1 residential product is 100 units of 4-bedroom luxury duplexes, each on a 500 sqm plot, including:</w:t>
+        <w:t xml:space="preserve">The 22-hectare Golf Estate Residential zone houses the Phase 1 duplex product together with additional site-and-serviced plots released for direct sale (Section 9). Phase 1 residential product itself is 100 units of 4-bedroom luxury duplexes, each on a 500 sqm plot, including:</w:t>
       </w:r>
     </w:p>
     <w:p>
@@ -2359,7 +2569,7 @@
         <w:jc w:val="both"/>
       </w:pPr>
       <w:r>
-        <w:t xml:space="preserve">A private hospital/wellness facility, an international-standard school, and additional apartment blocks complete the estate's four-pillar concept, extending the addressable market to healthcare users, families with school-age children, and smaller-household buyers not served by the Phase 1 duplex product. Together with the golf course, clubhouse and hotel, this gives the estate the full amenity set expected of a world-class luxury community rather than a purely residential development.</w:t>
+        <w:t xml:space="preserve">A 3-hectare private hospital/wellness facility and a 3-hectare international-standard school complete the estate's four-pillar concept, extending the addressable market to healthcare users and families with school-age children who would not otherwise be served by the Phase 1 duplex product alone. Together with the golf course, clubhouse, hotel and shopping village, this gives the estate the full amenity set expected of a world-class luxury community rather than a purely residential development.</w:t>
       </w:r>
     </w:p>
     <w:p>
@@ -5362,7 +5572,7 @@
         <w:spacing w:after="90"/>
       </w:pPr>
       <w:r>
-        <w:t xml:space="preserve">Golf Course Architect — to be engaged for the 18-hole executive-layout design referenced in Section 4.</w:t>
+        <w:t xml:space="preserve">Golf Course Architect — to be engaged for the 18-hole, lakes-and-fairways layout referenced in Section 4.</w:t>
       </w:r>
     </w:p>
     <w:p>
@@ -5587,7 +5797,7 @@
                 <w:sz w:val="19"/>
                 <w:szCs w:val="19"/>
               </w:rPr>
-              <w:t xml:space="preserve">27 ha golf course requires a compact executive design, not full championship length</w:t>
+              <w:t xml:space="preserve">27 ha golf course uses a resort-style routing, not full championship length</w:t>
             </w:r>
           </w:p>
           <w:p>
@@ -6797,7 +7007,7 @@
         <w:spacing w:after="90"/>
       </w:pPr>
       <w:r>
-        <w:t xml:space="preserve">Land use allocation (Section 3) is an illustrative split consistent with the stated parameters; it is not yet based on a surveyed site plan.</w:t>
+        <w:t xml:space="preserve">Land use allocation (Section 3) matches Tom’s own conceptual spatial layout for the golf course, golf estate residential zone, hotel and shopping village (27 ha / 22 ha / 4 ha / 4 ha); the clubhouse &amp; sports, hospital, school, gatehouse/security and roads figures are planning allocations for the remaining land, not yet based on a surveyed site plan.</w:t>
       </w:r>
     </w:p>
     <w:p>
@@ -6810,7 +7020,7 @@
         <w:spacing w:after="90"/>
       </w:pPr>
       <w:r>
-        <w:t xml:space="preserve">The golf course is designed as a full 18-hole course fitted onto the confirmed 27 hectares using a compact, executive-style routing (shorter holes, tighter layout) rather than a full championship-length course, which would typically require 45–60+ ha. This keeps the 18-hole feature the user requires while remaining honest about the land-area trade-off; final hole-by-hole routing should be confirmed by a golf course architect.</w:t>
+        <w:t xml:space="preserve">The golf course is a full 18-hole course fitted onto the confirmed 27 hectares (lakes, fairways &amp; greens), matching Tom’s own conceptual spatial layout, using a resort-style routing (shorter fairway lengths, water features as hazards) rather than a full championship-length course, which would typically require 45–60+ ha. Final hole-by-hole routing should be confirmed by a golf course architect.</w:t>
       </w:r>
     </w:p>
     <w:p>

</xml_diff>

<commit_message>
Add combined cost/revenue stress-test matrix, market benchmark cross-check, and structural safeguards to make viability bulletproof (27 pages)
</commit_message>
<xml_diff>
--- a/golf-estate/The_77_Golf_and_Country_Estate_Business_Plan.docx
+++ b/golf-estate/The_77_Golf_and_Country_Estate_Business_Plan.docx
@@ -5202,6 +5202,1205 @@
       </w:pPr>
       <w:r>
         <w:t xml:space="preserve">Given the phased sales strategy — with site-and-serviced plot sales beginning early in Phase 1 (months 0–12) — initial capital recovery on the land-sale revenue stream is expected within approximately 12–18 months of launch, well ahead of the Phase 2 and Phase 3 capital commitments, which are themselves designed to be substantially self-funded from Phase 1 proceeds.</w:t>
+      </w:r>
+    </w:p>
+    <w:p>
+      <w:pPr>
+        <w:pStyle w:val="Heading2"/>
+        <w:spacing w:after="120" w:before="200"/>
+      </w:pPr>
+      <w:r>
+        <w:t xml:space="preserve">10.4 Combined Sensitivity: Cost Overrun × Revenue Shortfall</w:t>
+      </w:r>
+    </w:p>
+    <w:p>
+      <w:pPr>
+        <w:spacing w:after="160" w:line="300"/>
+        <w:jc w:val="both"/>
+      </w:pPr>
+      <w:r>
+        <w:t xml:space="preserve">Sections 10.1–10.2 stress-test cost and revenue one variable at a time. To make the viability case robust to scrutiny, the matrix below tests both simultaneously — what happens if costs run over the stated budget AND land-sale revenue falls short of the ₦50B target at the same time. Green cells clear the 20% ROI floor; amber cells are still profitable but below the floor; red cells are loss-making.</w:t>
+      </w:r>
+    </w:p>
+    <w:tbl>
+      <w:tblPr>
+        <w:tblW w:type="dxa" w:w="10080"/>
+        <w:tblBorders>
+          <w:top w:val="single" w:color="auto" w:sz="4"/>
+          <w:left w:val="single" w:color="auto" w:sz="4"/>
+          <w:bottom w:val="single" w:color="auto" w:sz="4"/>
+          <w:right w:val="single" w:color="auto" w:sz="4"/>
+          <w:insideH w:val="single" w:color="auto" w:sz="4"/>
+          <w:insideV w:val="single" w:color="auto" w:sz="4"/>
+        </w:tblBorders>
+      </w:tblPr>
+      <w:tblGrid>
+        <w:gridCol w:w="2280"/>
+        <w:gridCol w:w="1950"/>
+        <w:gridCol w:w="1950"/>
+        <w:gridCol w:w="1950"/>
+        <w:gridCol w:w="1950"/>
+      </w:tblGrid>
+      <w:tr>
+        <w:tc>
+          <w:tcPr>
+            <w:tcW w:type="dxa" w:w="2280"/>
+            <w:tcBorders>
+              <w:top w:val="single" w:color="CCCCCC" w:sz="2"/>
+              <w:left w:val="single" w:color="CCCCCC" w:sz="2"/>
+              <w:bottom w:val="single" w:color="CCCCCC" w:sz="2"/>
+              <w:right w:val="single" w:color="CCCCCC" w:sz="2"/>
+            </w:tcBorders>
+            <w:shd w:fill="0F2A3D" w:val="clear"/>
+            <w:tcMar>
+              <w:top w:type="dxa" w:w="80"/>
+              <w:left w:type="dxa" w:w="120"/>
+              <w:bottom w:type="dxa" w:w="80"/>
+              <w:right w:type="dxa" w:w="120"/>
+            </w:tcMar>
+            <w:vAlign w:val="center"/>
+          </w:tcPr>
+          <w:p>
+            <w:pPr>
+              <w:jc w:val="left"/>
+            </w:pPr>
+            <w:r>
+              <w:rPr>
+                <w:b/>
+                <w:bCs/>
+                <w:color w:val="FFFFFF"/>
+                <w:sz w:val="16"/>
+                <w:szCs w:val="16"/>
+              </w:rPr>
+              <w:t xml:space="preserve">Revenue Achieved  vs.  Total Cost</w:t>
+            </w:r>
+          </w:p>
+        </w:tc>
+        <w:tc>
+          <w:tcPr>
+            <w:tcW w:type="dxa" w:w="1950"/>
+            <w:tcBorders>
+              <w:top w:val="single" w:color="CCCCCC" w:sz="2"/>
+              <w:left w:val="single" w:color="CCCCCC" w:sz="2"/>
+              <w:bottom w:val="single" w:color="CCCCCC" w:sz="2"/>
+              <w:right w:val="single" w:color="CCCCCC" w:sz="2"/>
+            </w:tcBorders>
+            <w:shd w:fill="0F2A3D" w:val="clear"/>
+            <w:tcMar>
+              <w:top w:type="dxa" w:w="80"/>
+              <w:left w:type="dxa" w:w="120"/>
+              <w:bottom w:type="dxa" w:w="80"/>
+              <w:right w:type="dxa" w:w="120"/>
+            </w:tcMar>
+            <w:vAlign w:val="center"/>
+          </w:tcPr>
+          <w:p>
+            <w:pPr>
+              <w:jc w:val="center"/>
+            </w:pPr>
+            <w:r>
+              <w:rPr>
+                <w:b/>
+                <w:bCs/>
+                <w:color w:val="FFFFFF"/>
+                <w:sz w:val="16"/>
+                <w:szCs w:val="16"/>
+              </w:rPr>
+              <w:t xml:space="preserve">Stated Cost ₦17.5B</w:t>
+            </w:r>
+          </w:p>
+        </w:tc>
+        <w:tc>
+          <w:tcPr>
+            <w:tcW w:type="dxa" w:w="1950"/>
+            <w:tcBorders>
+              <w:top w:val="single" w:color="CCCCCC" w:sz="2"/>
+              <w:left w:val="single" w:color="CCCCCC" w:sz="2"/>
+              <w:bottom w:val="single" w:color="CCCCCC" w:sz="2"/>
+              <w:right w:val="single" w:color="CCCCCC" w:sz="2"/>
+            </w:tcBorders>
+            <w:shd w:fill="0F2A3D" w:val="clear"/>
+            <w:tcMar>
+              <w:top w:type="dxa" w:w="80"/>
+              <w:left w:type="dxa" w:w="120"/>
+              <w:bottom w:type="dxa" w:w="80"/>
+              <w:right w:type="dxa" w:w="120"/>
+            </w:tcMar>
+            <w:vAlign w:val="center"/>
+          </w:tcPr>
+          <w:p>
+            <w:pPr>
+              <w:jc w:val="center"/>
+            </w:pPr>
+            <w:r>
+              <w:rPr>
+                <w:b/>
+                <w:bCs/>
+                <w:color w:val="FFFFFF"/>
+                <w:sz w:val="16"/>
+                <w:szCs w:val="16"/>
+              </w:rPr>
+              <w:t xml:space="preserve">+50% Cost ₦26.25B</w:t>
+            </w:r>
+          </w:p>
+        </w:tc>
+        <w:tc>
+          <w:tcPr>
+            <w:tcW w:type="dxa" w:w="1950"/>
+            <w:tcBorders>
+              <w:top w:val="single" w:color="CCCCCC" w:sz="2"/>
+              <w:left w:val="single" w:color="CCCCCC" w:sz="2"/>
+              <w:bottom w:val="single" w:color="CCCCCC" w:sz="2"/>
+              <w:right w:val="single" w:color="CCCCCC" w:sz="2"/>
+            </w:tcBorders>
+            <w:shd w:fill="0F2A3D" w:val="clear"/>
+            <w:tcMar>
+              <w:top w:type="dxa" w:w="80"/>
+              <w:left w:type="dxa" w:w="120"/>
+              <w:bottom w:type="dxa" w:w="80"/>
+              <w:right w:type="dxa" w:w="120"/>
+            </w:tcMar>
+            <w:vAlign w:val="center"/>
+          </w:tcPr>
+          <w:p>
+            <w:pPr>
+              <w:jc w:val="center"/>
+            </w:pPr>
+            <w:r>
+              <w:rPr>
+                <w:b/>
+                <w:bCs/>
+                <w:color w:val="FFFFFF"/>
+                <w:sz w:val="16"/>
+                <w:szCs w:val="16"/>
+              </w:rPr>
+              <w:t xml:space="preserve">+100% Cost ₦35B</w:t>
+            </w:r>
+          </w:p>
+        </w:tc>
+        <w:tc>
+          <w:tcPr>
+            <w:tcW w:type="dxa" w:w="1950"/>
+            <w:tcBorders>
+              <w:top w:val="single" w:color="CCCCCC" w:sz="2"/>
+              <w:left w:val="single" w:color="CCCCCC" w:sz="2"/>
+              <w:bottom w:val="single" w:color="CCCCCC" w:sz="2"/>
+              <w:right w:val="single" w:color="CCCCCC" w:sz="2"/>
+            </w:tcBorders>
+            <w:shd w:fill="0F2A3D" w:val="clear"/>
+            <w:tcMar>
+              <w:top w:type="dxa" w:w="80"/>
+              <w:left w:type="dxa" w:w="120"/>
+              <w:bottom w:type="dxa" w:w="80"/>
+              <w:right w:type="dxa" w:w="120"/>
+            </w:tcMar>
+            <w:vAlign w:val="center"/>
+          </w:tcPr>
+          <w:p>
+            <w:pPr>
+              <w:jc w:val="center"/>
+            </w:pPr>
+            <w:r>
+              <w:rPr>
+                <w:b/>
+                <w:bCs/>
+                <w:color w:val="FFFFFF"/>
+                <w:sz w:val="16"/>
+                <w:szCs w:val="16"/>
+              </w:rPr>
+              <w:t xml:space="preserve">Max Buffer ₦41.67B</w:t>
+            </w:r>
+          </w:p>
+        </w:tc>
+      </w:tr>
+      <w:tr>
+        <w:tc>
+          <w:tcPr>
+            <w:tcW w:type="dxa" w:w="2280"/>
+            <w:tcBorders>
+              <w:top w:val="single" w:color="CCCCCC" w:sz="2"/>
+              <w:left w:val="single" w:color="CCCCCC" w:sz="2"/>
+              <w:bottom w:val="single" w:color="CCCCCC" w:sz="2"/>
+              <w:right w:val="single" w:color="CCCCCC" w:sz="2"/>
+            </w:tcBorders>
+            <w:shd w:fill="F0F0F0" w:val="clear"/>
+            <w:tcMar>
+              <w:top w:type="dxa" w:w="80"/>
+              <w:left w:type="dxa" w:w="120"/>
+              <w:bottom w:type="dxa" w:w="80"/>
+              <w:right w:type="dxa" w:w="120"/>
+            </w:tcMar>
+            <w:vAlign w:val="center"/>
+          </w:tcPr>
+          <w:p>
+            <w:pPr>
+              <w:jc w:val="left"/>
+            </w:pPr>
+            <w:r>
+              <w:rPr>
+                <w:b/>
+                <w:bCs/>
+                <w:color w:val="0F2A3D"/>
+                <w:sz w:val="17"/>
+                <w:szCs w:val="17"/>
+              </w:rPr>
+              <w:t xml:space="preserve">Revenue 100% (₦50B)</w:t>
+            </w:r>
+          </w:p>
+        </w:tc>
+        <w:tc>
+          <w:tcPr>
+            <w:tcW w:type="dxa" w:w="1950"/>
+            <w:tcBorders>
+              <w:top w:val="single" w:color="CCCCCC" w:sz="2"/>
+              <w:left w:val="single" w:color="CCCCCC" w:sz="2"/>
+              <w:bottom w:val="single" w:color="CCCCCC" w:sz="2"/>
+              <w:right w:val="single" w:color="CCCCCC" w:sz="2"/>
+            </w:tcBorders>
+            <w:shd w:fill="E8F0EA" w:val="clear"/>
+            <w:tcMar>
+              <w:top w:type="dxa" w:w="80"/>
+              <w:left w:type="dxa" w:w="120"/>
+              <w:bottom w:type="dxa" w:w="80"/>
+              <w:right w:type="dxa" w:w="120"/>
+            </w:tcMar>
+            <w:vAlign w:val="center"/>
+          </w:tcPr>
+          <w:p>
+            <w:pPr>
+              <w:jc w:val="center"/>
+            </w:pPr>
+            <w:r>
+              <w:rPr>
+                <w:b w:val="false"/>
+                <w:bCs w:val="false"/>
+                <w:color w:val="0F2A3D"/>
+                <w:sz w:val="16"/>
+                <w:szCs w:val="16"/>
+              </w:rPr>
+              <w:t xml:space="preserve">+185.7% PASS</w:t>
+            </w:r>
+          </w:p>
+        </w:tc>
+        <w:tc>
+          <w:tcPr>
+            <w:tcW w:type="dxa" w:w="1950"/>
+            <w:tcBorders>
+              <w:top w:val="single" w:color="CCCCCC" w:sz="2"/>
+              <w:left w:val="single" w:color="CCCCCC" w:sz="2"/>
+              <w:bottom w:val="single" w:color="CCCCCC" w:sz="2"/>
+              <w:right w:val="single" w:color="CCCCCC" w:sz="2"/>
+            </w:tcBorders>
+            <w:shd w:fill="E8F0EA" w:val="clear"/>
+            <w:tcMar>
+              <w:top w:type="dxa" w:w="80"/>
+              <w:left w:type="dxa" w:w="120"/>
+              <w:bottom w:type="dxa" w:w="80"/>
+              <w:right w:type="dxa" w:w="120"/>
+            </w:tcMar>
+            <w:vAlign w:val="center"/>
+          </w:tcPr>
+          <w:p>
+            <w:pPr>
+              <w:jc w:val="center"/>
+            </w:pPr>
+            <w:r>
+              <w:rPr>
+                <w:b w:val="false"/>
+                <w:bCs w:val="false"/>
+                <w:color w:val="0F2A3D"/>
+                <w:sz w:val="16"/>
+                <w:szCs w:val="16"/>
+              </w:rPr>
+              <w:t xml:space="preserve">+90.5% PASS</w:t>
+            </w:r>
+          </w:p>
+        </w:tc>
+        <w:tc>
+          <w:tcPr>
+            <w:tcW w:type="dxa" w:w="1950"/>
+            <w:tcBorders>
+              <w:top w:val="single" w:color="CCCCCC" w:sz="2"/>
+              <w:left w:val="single" w:color="CCCCCC" w:sz="2"/>
+              <w:bottom w:val="single" w:color="CCCCCC" w:sz="2"/>
+              <w:right w:val="single" w:color="CCCCCC" w:sz="2"/>
+            </w:tcBorders>
+            <w:shd w:fill="E8F0EA" w:val="clear"/>
+            <w:tcMar>
+              <w:top w:type="dxa" w:w="80"/>
+              <w:left w:type="dxa" w:w="120"/>
+              <w:bottom w:type="dxa" w:w="80"/>
+              <w:right w:type="dxa" w:w="120"/>
+            </w:tcMar>
+            <w:vAlign w:val="center"/>
+          </w:tcPr>
+          <w:p>
+            <w:pPr>
+              <w:jc w:val="center"/>
+            </w:pPr>
+            <w:r>
+              <w:rPr>
+                <w:b w:val="false"/>
+                <w:bCs w:val="false"/>
+                <w:color w:val="0F2A3D"/>
+                <w:sz w:val="16"/>
+                <w:szCs w:val="16"/>
+              </w:rPr>
+              <w:t xml:space="preserve">+42.9% PASS</w:t>
+            </w:r>
+          </w:p>
+        </w:tc>
+        <w:tc>
+          <w:tcPr>
+            <w:tcW w:type="dxa" w:w="1950"/>
+            <w:tcBorders>
+              <w:top w:val="single" w:color="CCCCCC" w:sz="2"/>
+              <w:left w:val="single" w:color="CCCCCC" w:sz="2"/>
+              <w:bottom w:val="single" w:color="CCCCCC" w:sz="2"/>
+              <w:right w:val="single" w:color="CCCCCC" w:sz="2"/>
+            </w:tcBorders>
+            <w:shd w:fill="FBF3DD" w:val="clear"/>
+            <w:tcMar>
+              <w:top w:type="dxa" w:w="80"/>
+              <w:left w:type="dxa" w:w="120"/>
+              <w:bottom w:type="dxa" w:w="80"/>
+              <w:right w:type="dxa" w:w="120"/>
+            </w:tcMar>
+            <w:vAlign w:val="center"/>
+          </w:tcPr>
+          <w:p>
+            <w:pPr>
+              <w:jc w:val="center"/>
+            </w:pPr>
+            <w:r>
+              <w:rPr>
+                <w:b w:val="false"/>
+                <w:bCs w:val="false"/>
+                <w:color w:val="0F2A3D"/>
+                <w:sz w:val="16"/>
+                <w:szCs w:val="16"/>
+              </w:rPr>
+              <w:t xml:space="preserve">+20.0% MARGINAL</w:t>
+            </w:r>
+          </w:p>
+        </w:tc>
+      </w:tr>
+      <w:tr>
+        <w:tc>
+          <w:tcPr>
+            <w:tcW w:type="dxa" w:w="2280"/>
+            <w:tcBorders>
+              <w:top w:val="single" w:color="CCCCCC" w:sz="2"/>
+              <w:left w:val="single" w:color="CCCCCC" w:sz="2"/>
+              <w:bottom w:val="single" w:color="CCCCCC" w:sz="2"/>
+              <w:right w:val="single" w:color="CCCCCC" w:sz="2"/>
+            </w:tcBorders>
+            <w:shd w:fill="F0F0F0" w:val="clear"/>
+            <w:tcMar>
+              <w:top w:type="dxa" w:w="80"/>
+              <w:left w:type="dxa" w:w="120"/>
+              <w:bottom w:type="dxa" w:w="80"/>
+              <w:right w:type="dxa" w:w="120"/>
+            </w:tcMar>
+            <w:vAlign w:val="center"/>
+          </w:tcPr>
+          <w:p>
+            <w:pPr>
+              <w:jc w:val="left"/>
+            </w:pPr>
+            <w:r>
+              <w:rPr>
+                <w:b/>
+                <w:bCs/>
+                <w:color w:val="0F2A3D"/>
+                <w:sz w:val="17"/>
+                <w:szCs w:val="17"/>
+              </w:rPr>
+              <w:t xml:space="preserve">Revenue 90% (₦45B)</w:t>
+            </w:r>
+          </w:p>
+        </w:tc>
+        <w:tc>
+          <w:tcPr>
+            <w:tcW w:type="dxa" w:w="1950"/>
+            <w:tcBorders>
+              <w:top w:val="single" w:color="CCCCCC" w:sz="2"/>
+              <w:left w:val="single" w:color="CCCCCC" w:sz="2"/>
+              <w:bottom w:val="single" w:color="CCCCCC" w:sz="2"/>
+              <w:right w:val="single" w:color="CCCCCC" w:sz="2"/>
+            </w:tcBorders>
+            <w:shd w:fill="E8F0EA" w:val="clear"/>
+            <w:tcMar>
+              <w:top w:type="dxa" w:w="80"/>
+              <w:left w:type="dxa" w:w="120"/>
+              <w:bottom w:type="dxa" w:w="80"/>
+              <w:right w:type="dxa" w:w="120"/>
+            </w:tcMar>
+            <w:vAlign w:val="center"/>
+          </w:tcPr>
+          <w:p>
+            <w:pPr>
+              <w:jc w:val="center"/>
+            </w:pPr>
+            <w:r>
+              <w:rPr>
+                <w:b w:val="false"/>
+                <w:bCs w:val="false"/>
+                <w:color w:val="0F2A3D"/>
+                <w:sz w:val="16"/>
+                <w:szCs w:val="16"/>
+              </w:rPr>
+              <w:t xml:space="preserve">+157.1% PASS</w:t>
+            </w:r>
+          </w:p>
+        </w:tc>
+        <w:tc>
+          <w:tcPr>
+            <w:tcW w:type="dxa" w:w="1950"/>
+            <w:tcBorders>
+              <w:top w:val="single" w:color="CCCCCC" w:sz="2"/>
+              <w:left w:val="single" w:color="CCCCCC" w:sz="2"/>
+              <w:bottom w:val="single" w:color="CCCCCC" w:sz="2"/>
+              <w:right w:val="single" w:color="CCCCCC" w:sz="2"/>
+            </w:tcBorders>
+            <w:shd w:fill="E8F0EA" w:val="clear"/>
+            <w:tcMar>
+              <w:top w:type="dxa" w:w="80"/>
+              <w:left w:type="dxa" w:w="120"/>
+              <w:bottom w:type="dxa" w:w="80"/>
+              <w:right w:type="dxa" w:w="120"/>
+            </w:tcMar>
+            <w:vAlign w:val="center"/>
+          </w:tcPr>
+          <w:p>
+            <w:pPr>
+              <w:jc w:val="center"/>
+            </w:pPr>
+            <w:r>
+              <w:rPr>
+                <w:b w:val="false"/>
+                <w:bCs w:val="false"/>
+                <w:color w:val="0F2A3D"/>
+                <w:sz w:val="16"/>
+                <w:szCs w:val="16"/>
+              </w:rPr>
+              <w:t xml:space="preserve">+71.4% PASS</w:t>
+            </w:r>
+          </w:p>
+        </w:tc>
+        <w:tc>
+          <w:tcPr>
+            <w:tcW w:type="dxa" w:w="1950"/>
+            <w:tcBorders>
+              <w:top w:val="single" w:color="CCCCCC" w:sz="2"/>
+              <w:left w:val="single" w:color="CCCCCC" w:sz="2"/>
+              <w:bottom w:val="single" w:color="CCCCCC" w:sz="2"/>
+              <w:right w:val="single" w:color="CCCCCC" w:sz="2"/>
+            </w:tcBorders>
+            <w:shd w:fill="E8F0EA" w:val="clear"/>
+            <w:tcMar>
+              <w:top w:type="dxa" w:w="80"/>
+              <w:left w:type="dxa" w:w="120"/>
+              <w:bottom w:type="dxa" w:w="80"/>
+              <w:right w:type="dxa" w:w="120"/>
+            </w:tcMar>
+            <w:vAlign w:val="center"/>
+          </w:tcPr>
+          <w:p>
+            <w:pPr>
+              <w:jc w:val="center"/>
+            </w:pPr>
+            <w:r>
+              <w:rPr>
+                <w:b w:val="false"/>
+                <w:bCs w:val="false"/>
+                <w:color w:val="0F2A3D"/>
+                <w:sz w:val="16"/>
+                <w:szCs w:val="16"/>
+              </w:rPr>
+              <w:t xml:space="preserve">+28.6% PASS</w:t>
+            </w:r>
+          </w:p>
+        </w:tc>
+        <w:tc>
+          <w:tcPr>
+            <w:tcW w:type="dxa" w:w="1950"/>
+            <w:tcBorders>
+              <w:top w:val="single" w:color="CCCCCC" w:sz="2"/>
+              <w:left w:val="single" w:color="CCCCCC" w:sz="2"/>
+              <w:bottom w:val="single" w:color="CCCCCC" w:sz="2"/>
+              <w:right w:val="single" w:color="CCCCCC" w:sz="2"/>
+            </w:tcBorders>
+            <w:shd w:fill="FBF3DD" w:val="clear"/>
+            <w:tcMar>
+              <w:top w:type="dxa" w:w="80"/>
+              <w:left w:type="dxa" w:w="120"/>
+              <w:bottom w:type="dxa" w:w="80"/>
+              <w:right w:type="dxa" w:w="120"/>
+            </w:tcMar>
+            <w:vAlign w:val="center"/>
+          </w:tcPr>
+          <w:p>
+            <w:pPr>
+              <w:jc w:val="center"/>
+            </w:pPr>
+            <w:r>
+              <w:rPr>
+                <w:b w:val="false"/>
+                <w:bCs w:val="false"/>
+                <w:color w:val="0F2A3D"/>
+                <w:sz w:val="16"/>
+                <w:szCs w:val="16"/>
+              </w:rPr>
+              <w:t xml:space="preserve">+8.0% MARGINAL</w:t>
+            </w:r>
+          </w:p>
+        </w:tc>
+      </w:tr>
+      <w:tr>
+        <w:tc>
+          <w:tcPr>
+            <w:tcW w:type="dxa" w:w="2280"/>
+            <w:tcBorders>
+              <w:top w:val="single" w:color="CCCCCC" w:sz="2"/>
+              <w:left w:val="single" w:color="CCCCCC" w:sz="2"/>
+              <w:bottom w:val="single" w:color="CCCCCC" w:sz="2"/>
+              <w:right w:val="single" w:color="CCCCCC" w:sz="2"/>
+            </w:tcBorders>
+            <w:shd w:fill="F0F0F0" w:val="clear"/>
+            <w:tcMar>
+              <w:top w:type="dxa" w:w="80"/>
+              <w:left w:type="dxa" w:w="120"/>
+              <w:bottom w:type="dxa" w:w="80"/>
+              <w:right w:type="dxa" w:w="120"/>
+            </w:tcMar>
+            <w:vAlign w:val="center"/>
+          </w:tcPr>
+          <w:p>
+            <w:pPr>
+              <w:jc w:val="left"/>
+            </w:pPr>
+            <w:r>
+              <w:rPr>
+                <w:b/>
+                <w:bCs/>
+                <w:color w:val="0F2A3D"/>
+                <w:sz w:val="17"/>
+                <w:szCs w:val="17"/>
+              </w:rPr>
+              <w:t xml:space="preserve">Revenue 80% (₦40B)</w:t>
+            </w:r>
+          </w:p>
+        </w:tc>
+        <w:tc>
+          <w:tcPr>
+            <w:tcW w:type="dxa" w:w="1950"/>
+            <w:tcBorders>
+              <w:top w:val="single" w:color="CCCCCC" w:sz="2"/>
+              <w:left w:val="single" w:color="CCCCCC" w:sz="2"/>
+              <w:bottom w:val="single" w:color="CCCCCC" w:sz="2"/>
+              <w:right w:val="single" w:color="CCCCCC" w:sz="2"/>
+            </w:tcBorders>
+            <w:shd w:fill="E8F0EA" w:val="clear"/>
+            <w:tcMar>
+              <w:top w:type="dxa" w:w="80"/>
+              <w:left w:type="dxa" w:w="120"/>
+              <w:bottom w:type="dxa" w:w="80"/>
+              <w:right w:type="dxa" w:w="120"/>
+            </w:tcMar>
+            <w:vAlign w:val="center"/>
+          </w:tcPr>
+          <w:p>
+            <w:pPr>
+              <w:jc w:val="center"/>
+            </w:pPr>
+            <w:r>
+              <w:rPr>
+                <w:b w:val="false"/>
+                <w:bCs w:val="false"/>
+                <w:color w:val="0F2A3D"/>
+                <w:sz w:val="16"/>
+                <w:szCs w:val="16"/>
+              </w:rPr>
+              <w:t xml:space="preserve">+128.6% PASS</w:t>
+            </w:r>
+          </w:p>
+        </w:tc>
+        <w:tc>
+          <w:tcPr>
+            <w:tcW w:type="dxa" w:w="1950"/>
+            <w:tcBorders>
+              <w:top w:val="single" w:color="CCCCCC" w:sz="2"/>
+              <w:left w:val="single" w:color="CCCCCC" w:sz="2"/>
+              <w:bottom w:val="single" w:color="CCCCCC" w:sz="2"/>
+              <w:right w:val="single" w:color="CCCCCC" w:sz="2"/>
+            </w:tcBorders>
+            <w:shd w:fill="E8F0EA" w:val="clear"/>
+            <w:tcMar>
+              <w:top w:type="dxa" w:w="80"/>
+              <w:left w:type="dxa" w:w="120"/>
+              <w:bottom w:type="dxa" w:w="80"/>
+              <w:right w:type="dxa" w:w="120"/>
+            </w:tcMar>
+            <w:vAlign w:val="center"/>
+          </w:tcPr>
+          <w:p>
+            <w:pPr>
+              <w:jc w:val="center"/>
+            </w:pPr>
+            <w:r>
+              <w:rPr>
+                <w:b w:val="false"/>
+                <w:bCs w:val="false"/>
+                <w:color w:val="0F2A3D"/>
+                <w:sz w:val="16"/>
+                <w:szCs w:val="16"/>
+              </w:rPr>
+              <w:t xml:space="preserve">+52.4% PASS</w:t>
+            </w:r>
+          </w:p>
+        </w:tc>
+        <w:tc>
+          <w:tcPr>
+            <w:tcW w:type="dxa" w:w="1950"/>
+            <w:tcBorders>
+              <w:top w:val="single" w:color="CCCCCC" w:sz="2"/>
+              <w:left w:val="single" w:color="CCCCCC" w:sz="2"/>
+              <w:bottom w:val="single" w:color="CCCCCC" w:sz="2"/>
+              <w:right w:val="single" w:color="CCCCCC" w:sz="2"/>
+            </w:tcBorders>
+            <w:shd w:fill="FBF3DD" w:val="clear"/>
+            <w:tcMar>
+              <w:top w:type="dxa" w:w="80"/>
+              <w:left w:type="dxa" w:w="120"/>
+              <w:bottom w:type="dxa" w:w="80"/>
+              <w:right w:type="dxa" w:w="120"/>
+            </w:tcMar>
+            <w:vAlign w:val="center"/>
+          </w:tcPr>
+          <w:p>
+            <w:pPr>
+              <w:jc w:val="center"/>
+            </w:pPr>
+            <w:r>
+              <w:rPr>
+                <w:b w:val="false"/>
+                <w:bCs w:val="false"/>
+                <w:color w:val="0F2A3D"/>
+                <w:sz w:val="16"/>
+                <w:szCs w:val="16"/>
+              </w:rPr>
+              <w:t xml:space="preserve">+14.3% MARGINAL</w:t>
+            </w:r>
+          </w:p>
+        </w:tc>
+        <w:tc>
+          <w:tcPr>
+            <w:tcW w:type="dxa" w:w="1950"/>
+            <w:tcBorders>
+              <w:top w:val="single" w:color="CCCCCC" w:sz="2"/>
+              <w:left w:val="single" w:color="CCCCCC" w:sz="2"/>
+              <w:bottom w:val="single" w:color="CCCCCC" w:sz="2"/>
+              <w:right w:val="single" w:color="CCCCCC" w:sz="2"/>
+            </w:tcBorders>
+            <w:shd w:fill="FBE9E9" w:val="clear"/>
+            <w:tcMar>
+              <w:top w:type="dxa" w:w="80"/>
+              <w:left w:type="dxa" w:w="120"/>
+              <w:bottom w:type="dxa" w:w="80"/>
+              <w:right w:type="dxa" w:w="120"/>
+            </w:tcMar>
+            <w:vAlign w:val="center"/>
+          </w:tcPr>
+          <w:p>
+            <w:pPr>
+              <w:jc w:val="center"/>
+            </w:pPr>
+            <w:r>
+              <w:rPr>
+                <w:b w:val="false"/>
+                <w:bCs w:val="false"/>
+                <w:color w:val="0F2A3D"/>
+                <w:sz w:val="16"/>
+                <w:szCs w:val="16"/>
+              </w:rPr>
+              <w:t xml:space="preserve">-4.0% LOSS</w:t>
+            </w:r>
+          </w:p>
+        </w:tc>
+      </w:tr>
+      <w:tr>
+        <w:tc>
+          <w:tcPr>
+            <w:tcW w:type="dxa" w:w="2280"/>
+            <w:tcBorders>
+              <w:top w:val="single" w:color="CCCCCC" w:sz="2"/>
+              <w:left w:val="single" w:color="CCCCCC" w:sz="2"/>
+              <w:bottom w:val="single" w:color="CCCCCC" w:sz="2"/>
+              <w:right w:val="single" w:color="CCCCCC" w:sz="2"/>
+            </w:tcBorders>
+            <w:shd w:fill="F0F0F0" w:val="clear"/>
+            <w:tcMar>
+              <w:top w:type="dxa" w:w="80"/>
+              <w:left w:type="dxa" w:w="120"/>
+              <w:bottom w:type="dxa" w:w="80"/>
+              <w:right w:type="dxa" w:w="120"/>
+            </w:tcMar>
+            <w:vAlign w:val="center"/>
+          </w:tcPr>
+          <w:p>
+            <w:pPr>
+              <w:jc w:val="left"/>
+            </w:pPr>
+            <w:r>
+              <w:rPr>
+                <w:b/>
+                <w:bCs/>
+                <w:color w:val="0F2A3D"/>
+                <w:sz w:val="17"/>
+                <w:szCs w:val="17"/>
+              </w:rPr>
+              <w:t xml:space="preserve">Revenue 70% (₦35B)</w:t>
+            </w:r>
+          </w:p>
+        </w:tc>
+        <w:tc>
+          <w:tcPr>
+            <w:tcW w:type="dxa" w:w="1950"/>
+            <w:tcBorders>
+              <w:top w:val="single" w:color="CCCCCC" w:sz="2"/>
+              <w:left w:val="single" w:color="CCCCCC" w:sz="2"/>
+              <w:bottom w:val="single" w:color="CCCCCC" w:sz="2"/>
+              <w:right w:val="single" w:color="CCCCCC" w:sz="2"/>
+            </w:tcBorders>
+            <w:shd w:fill="E8F0EA" w:val="clear"/>
+            <w:tcMar>
+              <w:top w:type="dxa" w:w="80"/>
+              <w:left w:type="dxa" w:w="120"/>
+              <w:bottom w:type="dxa" w:w="80"/>
+              <w:right w:type="dxa" w:w="120"/>
+            </w:tcMar>
+            <w:vAlign w:val="center"/>
+          </w:tcPr>
+          <w:p>
+            <w:pPr>
+              <w:jc w:val="center"/>
+            </w:pPr>
+            <w:r>
+              <w:rPr>
+                <w:b w:val="false"/>
+                <w:bCs w:val="false"/>
+                <w:color w:val="0F2A3D"/>
+                <w:sz w:val="16"/>
+                <w:szCs w:val="16"/>
+              </w:rPr>
+              <w:t xml:space="preserve">+100.0% PASS</w:t>
+            </w:r>
+          </w:p>
+        </w:tc>
+        <w:tc>
+          <w:tcPr>
+            <w:tcW w:type="dxa" w:w="1950"/>
+            <w:tcBorders>
+              <w:top w:val="single" w:color="CCCCCC" w:sz="2"/>
+              <w:left w:val="single" w:color="CCCCCC" w:sz="2"/>
+              <w:bottom w:val="single" w:color="CCCCCC" w:sz="2"/>
+              <w:right w:val="single" w:color="CCCCCC" w:sz="2"/>
+            </w:tcBorders>
+            <w:shd w:fill="E8F0EA" w:val="clear"/>
+            <w:tcMar>
+              <w:top w:type="dxa" w:w="80"/>
+              <w:left w:type="dxa" w:w="120"/>
+              <w:bottom w:type="dxa" w:w="80"/>
+              <w:right w:type="dxa" w:w="120"/>
+            </w:tcMar>
+            <w:vAlign w:val="center"/>
+          </w:tcPr>
+          <w:p>
+            <w:pPr>
+              <w:jc w:val="center"/>
+            </w:pPr>
+            <w:r>
+              <w:rPr>
+                <w:b w:val="false"/>
+                <w:bCs w:val="false"/>
+                <w:color w:val="0F2A3D"/>
+                <w:sz w:val="16"/>
+                <w:szCs w:val="16"/>
+              </w:rPr>
+              <w:t xml:space="preserve">+33.3% PASS</w:t>
+            </w:r>
+          </w:p>
+        </w:tc>
+        <w:tc>
+          <w:tcPr>
+            <w:tcW w:type="dxa" w:w="1950"/>
+            <w:tcBorders>
+              <w:top w:val="single" w:color="CCCCCC" w:sz="2"/>
+              <w:left w:val="single" w:color="CCCCCC" w:sz="2"/>
+              <w:bottom w:val="single" w:color="CCCCCC" w:sz="2"/>
+              <w:right w:val="single" w:color="CCCCCC" w:sz="2"/>
+            </w:tcBorders>
+            <w:shd w:fill="FBF3DD" w:val="clear"/>
+            <w:tcMar>
+              <w:top w:type="dxa" w:w="80"/>
+              <w:left w:type="dxa" w:w="120"/>
+              <w:bottom w:type="dxa" w:w="80"/>
+              <w:right w:type="dxa" w:w="120"/>
+            </w:tcMar>
+            <w:vAlign w:val="center"/>
+          </w:tcPr>
+          <w:p>
+            <w:pPr>
+              <w:jc w:val="center"/>
+            </w:pPr>
+            <w:r>
+              <w:rPr>
+                <w:b w:val="false"/>
+                <w:bCs w:val="false"/>
+                <w:color w:val="0F2A3D"/>
+                <w:sz w:val="16"/>
+                <w:szCs w:val="16"/>
+              </w:rPr>
+              <w:t xml:space="preserve">+0.0% MARGINAL</w:t>
+            </w:r>
+          </w:p>
+        </w:tc>
+        <w:tc>
+          <w:tcPr>
+            <w:tcW w:type="dxa" w:w="1950"/>
+            <w:tcBorders>
+              <w:top w:val="single" w:color="CCCCCC" w:sz="2"/>
+              <w:left w:val="single" w:color="CCCCCC" w:sz="2"/>
+              <w:bottom w:val="single" w:color="CCCCCC" w:sz="2"/>
+              <w:right w:val="single" w:color="CCCCCC" w:sz="2"/>
+            </w:tcBorders>
+            <w:shd w:fill="FBE9E9" w:val="clear"/>
+            <w:tcMar>
+              <w:top w:type="dxa" w:w="80"/>
+              <w:left w:type="dxa" w:w="120"/>
+              <w:bottom w:type="dxa" w:w="80"/>
+              <w:right w:type="dxa" w:w="120"/>
+            </w:tcMar>
+            <w:vAlign w:val="center"/>
+          </w:tcPr>
+          <w:p>
+            <w:pPr>
+              <w:jc w:val="center"/>
+            </w:pPr>
+            <w:r>
+              <w:rPr>
+                <w:b w:val="false"/>
+                <w:bCs w:val="false"/>
+                <w:color w:val="0F2A3D"/>
+                <w:sz w:val="16"/>
+                <w:szCs w:val="16"/>
+              </w:rPr>
+              <w:t xml:space="preserve">-16.0% LOSS</w:t>
+            </w:r>
+          </w:p>
+        </w:tc>
+      </w:tr>
+      <w:tr>
+        <w:tc>
+          <w:tcPr>
+            <w:tcW w:type="dxa" w:w="2280"/>
+            <w:tcBorders>
+              <w:top w:val="single" w:color="CCCCCC" w:sz="2"/>
+              <w:left w:val="single" w:color="CCCCCC" w:sz="2"/>
+              <w:bottom w:val="single" w:color="CCCCCC" w:sz="2"/>
+              <w:right w:val="single" w:color="CCCCCC" w:sz="2"/>
+            </w:tcBorders>
+            <w:shd w:fill="F0F0F0" w:val="clear"/>
+            <w:tcMar>
+              <w:top w:type="dxa" w:w="80"/>
+              <w:left w:type="dxa" w:w="120"/>
+              <w:bottom w:type="dxa" w:w="80"/>
+              <w:right w:type="dxa" w:w="120"/>
+            </w:tcMar>
+            <w:vAlign w:val="center"/>
+          </w:tcPr>
+          <w:p>
+            <w:pPr>
+              <w:jc w:val="left"/>
+            </w:pPr>
+            <w:r>
+              <w:rPr>
+                <w:b/>
+                <w:bCs/>
+                <w:color w:val="0F2A3D"/>
+                <w:sz w:val="17"/>
+                <w:szCs w:val="17"/>
+              </w:rPr>
+              <w:t xml:space="preserve">Revenue 60% (₦30B)</w:t>
+            </w:r>
+          </w:p>
+        </w:tc>
+        <w:tc>
+          <w:tcPr>
+            <w:tcW w:type="dxa" w:w="1950"/>
+            <w:tcBorders>
+              <w:top w:val="single" w:color="CCCCCC" w:sz="2"/>
+              <w:left w:val="single" w:color="CCCCCC" w:sz="2"/>
+              <w:bottom w:val="single" w:color="CCCCCC" w:sz="2"/>
+              <w:right w:val="single" w:color="CCCCCC" w:sz="2"/>
+            </w:tcBorders>
+            <w:shd w:fill="E8F0EA" w:val="clear"/>
+            <w:tcMar>
+              <w:top w:type="dxa" w:w="80"/>
+              <w:left w:type="dxa" w:w="120"/>
+              <w:bottom w:type="dxa" w:w="80"/>
+              <w:right w:type="dxa" w:w="120"/>
+            </w:tcMar>
+            <w:vAlign w:val="center"/>
+          </w:tcPr>
+          <w:p>
+            <w:pPr>
+              <w:jc w:val="center"/>
+            </w:pPr>
+            <w:r>
+              <w:rPr>
+                <w:b w:val="false"/>
+                <w:bCs w:val="false"/>
+                <w:color w:val="0F2A3D"/>
+                <w:sz w:val="16"/>
+                <w:szCs w:val="16"/>
+              </w:rPr>
+              <w:t xml:space="preserve">+71.4% PASS</w:t>
+            </w:r>
+          </w:p>
+        </w:tc>
+        <w:tc>
+          <w:tcPr>
+            <w:tcW w:type="dxa" w:w="1950"/>
+            <w:tcBorders>
+              <w:top w:val="single" w:color="CCCCCC" w:sz="2"/>
+              <w:left w:val="single" w:color="CCCCCC" w:sz="2"/>
+              <w:bottom w:val="single" w:color="CCCCCC" w:sz="2"/>
+              <w:right w:val="single" w:color="CCCCCC" w:sz="2"/>
+            </w:tcBorders>
+            <w:shd w:fill="FBF3DD" w:val="clear"/>
+            <w:tcMar>
+              <w:top w:type="dxa" w:w="80"/>
+              <w:left w:type="dxa" w:w="120"/>
+              <w:bottom w:type="dxa" w:w="80"/>
+              <w:right w:type="dxa" w:w="120"/>
+            </w:tcMar>
+            <w:vAlign w:val="center"/>
+          </w:tcPr>
+          <w:p>
+            <w:pPr>
+              <w:jc w:val="center"/>
+            </w:pPr>
+            <w:r>
+              <w:rPr>
+                <w:b w:val="false"/>
+                <w:bCs w:val="false"/>
+                <w:color w:val="0F2A3D"/>
+                <w:sz w:val="16"/>
+                <w:szCs w:val="16"/>
+              </w:rPr>
+              <w:t xml:space="preserve">+14.3% MARGINAL</w:t>
+            </w:r>
+          </w:p>
+        </w:tc>
+        <w:tc>
+          <w:tcPr>
+            <w:tcW w:type="dxa" w:w="1950"/>
+            <w:tcBorders>
+              <w:top w:val="single" w:color="CCCCCC" w:sz="2"/>
+              <w:left w:val="single" w:color="CCCCCC" w:sz="2"/>
+              <w:bottom w:val="single" w:color="CCCCCC" w:sz="2"/>
+              <w:right w:val="single" w:color="CCCCCC" w:sz="2"/>
+            </w:tcBorders>
+            <w:shd w:fill="FBE9E9" w:val="clear"/>
+            <w:tcMar>
+              <w:top w:type="dxa" w:w="80"/>
+              <w:left w:type="dxa" w:w="120"/>
+              <w:bottom w:type="dxa" w:w="80"/>
+              <w:right w:type="dxa" w:w="120"/>
+            </w:tcMar>
+            <w:vAlign w:val="center"/>
+          </w:tcPr>
+          <w:p>
+            <w:pPr>
+              <w:jc w:val="center"/>
+            </w:pPr>
+            <w:r>
+              <w:rPr>
+                <w:b w:val="false"/>
+                <w:bCs w:val="false"/>
+                <w:color w:val="0F2A3D"/>
+                <w:sz w:val="16"/>
+                <w:szCs w:val="16"/>
+              </w:rPr>
+              <w:t xml:space="preserve">-14.3% LOSS</w:t>
+            </w:r>
+          </w:p>
+        </w:tc>
+        <w:tc>
+          <w:tcPr>
+            <w:tcW w:type="dxa" w:w="1950"/>
+            <w:tcBorders>
+              <w:top w:val="single" w:color="CCCCCC" w:sz="2"/>
+              <w:left w:val="single" w:color="CCCCCC" w:sz="2"/>
+              <w:bottom w:val="single" w:color="CCCCCC" w:sz="2"/>
+              <w:right w:val="single" w:color="CCCCCC" w:sz="2"/>
+            </w:tcBorders>
+            <w:shd w:fill="FBE9E9" w:val="clear"/>
+            <w:tcMar>
+              <w:top w:type="dxa" w:w="80"/>
+              <w:left w:type="dxa" w:w="120"/>
+              <w:bottom w:type="dxa" w:w="80"/>
+              <w:right w:type="dxa" w:w="120"/>
+            </w:tcMar>
+            <w:vAlign w:val="center"/>
+          </w:tcPr>
+          <w:p>
+            <w:pPr>
+              <w:jc w:val="center"/>
+            </w:pPr>
+            <w:r>
+              <w:rPr>
+                <w:b w:val="false"/>
+                <w:bCs w:val="false"/>
+                <w:color w:val="0F2A3D"/>
+                <w:sz w:val="16"/>
+                <w:szCs w:val="16"/>
+              </w:rPr>
+              <w:t xml:space="preserve">-28.0% LOSS</w:t>
+            </w:r>
+          </w:p>
+        </w:tc>
+      </w:tr>
+    </w:tbl>
+    <w:p>
+      <w:pPr>
+        <w:spacing w:after="240" w:before="60"/>
+        <w:jc w:val="center"/>
+      </w:pPr>
+      <w:r>
+        <w:rPr>
+          <w:i/>
+          <w:iCs/>
+          <w:color w:val="6B6B6B"/>
+          <w:sz w:val="18"/>
+          <w:szCs w:val="18"/>
+        </w:rPr>
+        <w:t xml:space="preserve">Figure 6b — ROI outcome by combined cost-overrun and revenue-shortfall scenario</w:t>
+      </w:r>
+    </w:p>
+    <w:p>
+      <w:pPr>
+        <w:spacing w:after="160" w:line="300"/>
+        <w:jc w:val="both"/>
+      </w:pPr>
+      <w:r>
+        <w:t xml:space="preserve">Reading the matrix: with only stated costs (₦17.5B), the project clears the 20% floor even if revenue falls all the way to ₦30B (60% of target) — a wide margin of safety. The floor is only breached when BOTH shocks compound: cost overruns of 50%+ combined with revenue shortfalls of 30%+ simultaneously. The precise combined break-even point (ROI = 0%, i.e. the project stops losing money but also stops profiting) sits at Revenue ≈ Total Cost — for example ₦35B revenue against ₦35B cost (a 100% cost overrun exactly matched by a 30% revenue shortfall).</w:t>
+      </w:r>
+    </w:p>
+    <w:p>
+      <w:pPr>
+        <w:pStyle w:val="Heading2"/>
+        <w:spacing w:after="120" w:before="200"/>
+      </w:pPr>
+      <w:r>
+        <w:t xml:space="preserve">10.5 Market Benchmark Cross-Check</w:t>
+      </w:r>
+    </w:p>
+    <w:p>
+      <w:pPr>
+        <w:spacing w:after="160" w:line="300"/>
+        <w:jc w:val="both"/>
+      </w:pPr>
+      <w:r>
+        <w:t xml:space="preserve">The ₦50 billion Phase 1 land-sale target implies an average price of roughly ₦294,000 per sqm across the estimated 17 hectares of site-and-serviced plots being sold directly (the remaining ~5 hectares of the 22-hectare residential zone is the footprint of the 100 duplexes themselves). On a standard 500 sqm plot, that is approximately ₦147 million per plot — in the same order of magnitude as the ₦150M duplex carcass-construction cost used elsewhere in this plan, which is an internally consistent planning assumption.</w:t>
+      </w:r>
+    </w:p>
+    <w:p>
+      <w:pPr>
+        <w:spacing w:after="160" w:line="300"/>
+        <w:jc w:val="both"/>
+      </w:pPr>
+      <w:r>
+        <w:rPr>
+          <w:i/>
+          <w:iCs/>
+          <w:color w:val="6B6B6B"/>
+          <w:sz w:val="18"/>
+          <w:szCs w:val="18"/>
+        </w:rPr>
+        <w:t xml:space="preserve">Against the broader FCT land market, raw/unserviced land in peri-urban corridors like Bwari typically trades far below this (roughly ₦20,000–₦80,000/sqm), while prime central districts (Maitama, Asokoro, Wuse 2) trade well above it (₦300,000–₦600,000+/sqm). The ₦294,000/sqm assumption sits in between — consistent with premium, amenity-anchored estates (golf course, hospital, school, hotel, full security) commanding a significant premium over raw surrounding land, a pattern also seen in comparable golf-anchored estates elsewhere in Nigeria. This is the core commercial logic behind the pricing, but it should be confirmed against actual Bwari-corridor comparables by a licensed valuer before the plots are priced and released.</w:t>
+      </w:r>
+    </w:p>
+    <w:p>
+      <w:pPr>
+        <w:pStyle w:val="Heading2"/>
+        <w:spacing w:after="120" w:before="200"/>
+      </w:pPr>
+      <w:r>
+        <w:t xml:space="preserve">10.6 Structural Safeguards Behind the Viability Case</w:t>
+      </w:r>
+    </w:p>
+    <w:p>
+      <w:pPr>
+        <w:pStyle w:val="ListParagraph"/>
+        <w:numPr>
+          <w:ilvl w:val="0"/>
+          <w:numId w:val="2"/>
+        </w:numPr>
+        <w:spacing w:after="90"/>
+      </w:pPr>
+      <w:r>
+        <w:t xml:space="preserve">The realistic base case, even allowing for a 50% cost overrun (≈90%–186% ROI, first two columns of the matrix above), sits far above the 20% survival floor — the floor is a stress-test boundary, not the expected outcome.</w:t>
+      </w:r>
+    </w:p>
+    <w:p>
+      <w:pPr>
+        <w:pStyle w:val="ListParagraph"/>
+        <w:numPr>
+          <w:ilvl w:val="0"/>
+          <w:numId w:val="2"/>
+        </w:numPr>
+        <w:spacing w:after="90"/>
+      </w:pPr>
+      <w:r>
+        <w:t xml:space="preserve">Phased, tranche-based land release (Section 12.3) means capital is not all at risk at once: early tranches fund later construction, so a slow sales start can be managed by pacing spend rather than committing the full cost buffer up front.</w:t>
+      </w:r>
+    </w:p>
+    <w:p>
+      <w:pPr>
+        <w:pStyle w:val="ListParagraph"/>
+        <w:numPr>
+          <w:ilvl w:val="0"/>
+          <w:numId w:val="2"/>
+        </w:numPr>
+        <w:spacing w:after="90"/>
+      </w:pPr>
+      <w:r>
+        <w:t xml:space="preserve">Duplex sales and Phase 2/3 hotel, retail, hospital and school income are real revenue streams held back entirely from the base case — they exist purely as additional margin of safety on top of every scenario modeled above.</w:t>
+      </w:r>
+    </w:p>
+    <w:p>
+      <w:pPr>
+        <w:pStyle w:val="ListParagraph"/>
+        <w:numPr>
+          <w:ilvl w:val="0"/>
+          <w:numId w:val="2"/>
+        </w:numPr>
+        <w:spacing w:after="90"/>
+      </w:pPr>
+      <w:r>
+        <w:t xml:space="preserve">The land-sale revenue stream is realized within 12–18 months (Section 10.3), well before major Phase 2/3 capital is committed, limiting the window in which a combined cost/revenue shock could actually occur.</w:t>
+      </w:r>
+    </w:p>
+    <w:p>
+      <w:pPr>
+        <w:spacing w:after="160" w:line="300"/>
+        <w:jc w:val="both"/>
+      </w:pPr>
+      <w:r>
+        <w:t xml:space="preserve">Taken together — a wide realistic-case margin, phased capital exposure, uncounted upside streams, and an early revenue-recovery window — the project's viability is not dependent on any single favorable assumption holding true. It is designed to remain investable across a wide range of adverse outcomes, with the specific combined-shock threshold in Section 10.4 given transparently rather than glossed over.</w:t>
       </w:r>
     </w:p>
     <w:p>

</xml_diff>

<commit_message>
Correct roles (AVM Morgan Founder & Exec VC, Tom MD this project), add confirmed N100M/500sqm plot unit economics to revenue/profitability/SWOT, fix stale section cross-refs
</commit_message>
<xml_diff>
--- a/golf-estate/The_77_Golf_and_Country_Estate_Business_Plan.docx
+++ b/golf-estate/The_77_Golf_and_Country_Estate_Business_Plan.docx
@@ -163,10 +163,10 @@
       <w:r>
         <w:rPr>
           <w:color w:val="0F2A3D"/>
-          <w:sz w:val="20"/>
-          <w:szCs w:val="20"/>
+          <w:sz w:val="18"/>
+          <w:szCs w:val="18"/>
         </w:rPr>
-        <w:t xml:space="preserve">Sponsor: Tom Ugbodaga, Shareholder &amp; CEO</w:t>
+        <w:t xml:space="preserve">Founder &amp; Executive Vice Chairman: Air Vice Marshal Monday Riku Morgan (Rtd)  |  Managing Director (this project): Tom Ugbodaga</w:t>
       </w:r>
     </w:p>
     <w:p>
@@ -1273,7 +1273,7 @@
                 <w:sz w:val="20"/>
                 <w:szCs w:val="20"/>
               </w:rPr>
-              <w:t xml:space="preserve">Sponsor</w:t>
+              <w:t xml:space="preserve">Founder &amp; Executive Vice Chairman</w:t>
             </w:r>
           </w:p>
         </w:tc>
@@ -1307,7 +1307,77 @@
                 <w:sz w:val="20"/>
                 <w:szCs w:val="20"/>
               </w:rPr>
-              <w:t xml:space="preserve">BETONIQ WEST LTD — Tom Ugbodaga, Shareholder &amp; CEO</w:t>
+              <w:t xml:space="preserve">Air Vice Marshal Monday Riku Morgan (Rtd), BETONIQ WEST LTD</w:t>
+            </w:r>
+          </w:p>
+        </w:tc>
+      </w:tr>
+      <w:tr>
+        <w:tc>
+          <w:tcPr>
+            <w:tcW w:type="dxa" w:w="4680"/>
+            <w:tcBorders>
+              <w:top w:val="single" w:color="CCCCCC" w:sz="2"/>
+              <w:left w:val="single" w:color="CCCCCC" w:sz="2"/>
+              <w:bottom w:val="single" w:color="CCCCCC" w:sz="2"/>
+              <w:right w:val="single" w:color="CCCCCC" w:sz="2"/>
+            </w:tcBorders>
+            <w:shd w:fill="FFFFFF" w:val="clear"/>
+            <w:tcMar>
+              <w:top w:type="dxa" w:w="80"/>
+              <w:left w:type="dxa" w:w="120"/>
+              <w:bottom w:type="dxa" w:w="80"/>
+              <w:right w:type="dxa" w:w="120"/>
+            </w:tcMar>
+            <w:vAlign w:val="center"/>
+          </w:tcPr>
+          <w:p>
+            <w:pPr>
+              <w:jc w:val="left"/>
+            </w:pPr>
+            <w:r>
+              <w:rPr>
+                <w:b/>
+                <w:bCs/>
+                <w:color w:val="0F2A3D"/>
+                <w:sz w:val="20"/>
+                <w:szCs w:val="20"/>
+              </w:rPr>
+              <w:t xml:space="preserve">Managing Director (this project)</w:t>
+            </w:r>
+          </w:p>
+        </w:tc>
+        <w:tc>
+          <w:tcPr>
+            <w:tcW w:type="dxa" w:w="5400"/>
+            <w:tcBorders>
+              <w:top w:val="single" w:color="CCCCCC" w:sz="2"/>
+              <w:left w:val="single" w:color="CCCCCC" w:sz="2"/>
+              <w:bottom w:val="single" w:color="CCCCCC" w:sz="2"/>
+              <w:right w:val="single" w:color="CCCCCC" w:sz="2"/>
+            </w:tcBorders>
+            <w:shd w:fill="FFFFFF" w:val="clear"/>
+            <w:tcMar>
+              <w:top w:type="dxa" w:w="80"/>
+              <w:left w:type="dxa" w:w="120"/>
+              <w:bottom w:type="dxa" w:w="80"/>
+              <w:right w:type="dxa" w:w="120"/>
+            </w:tcMar>
+            <w:vAlign w:val="center"/>
+          </w:tcPr>
+          <w:p>
+            <w:pPr>
+              <w:jc w:val="left"/>
+            </w:pPr>
+            <w:r>
+              <w:rPr>
+                <w:b w:val="false"/>
+                <w:bCs w:val="false"/>
+                <w:color w:val="0F2A3D"/>
+                <w:sz w:val="20"/>
+                <w:szCs w:val="20"/>
+              </w:rPr>
+              <w:t xml:space="preserve">Tom Ugbodaga</w:t>
             </w:r>
           </w:p>
         </w:tc>
@@ -1324,7 +1394,7 @@
         <w:jc w:val="both"/>
       </w:pPr>
       <w:r>
-        <w:t xml:space="preserve">Even under a conservative scenario that allocates the maximum possible buffer toward golf course construction, clubhouse, site infrastructure and contingency, the project comfortably clears the 20% minimum return threshold on Phase 1 land sales alone — before counting additional upside from duplex sales, hospitality and healthcare revenue introduced in later phases (see Section 8, Profitability Analysis).</w:t>
+        <w:t xml:space="preserve">Even under a conservative scenario that allocates the maximum possible buffer toward golf course construction, clubhouse, site infrastructure and contingency, the project comfortably clears the 20% minimum return threshold on Phase 1 land sales alone — before counting additional upside from duplex sales, hospitality and healthcare revenue introduced in later phases (see Section 10, Profitability Analysis).</w:t>
       </w:r>
     </w:p>
     <w:p>
@@ -2390,7 +2460,7 @@
         <w:jc w:val="both"/>
       </w:pPr>
       <w:r>
-        <w:t xml:space="preserve">The 22-hectare Golf Estate Residential zone houses the Phase 1 duplex product together with additional site-and-serviced plots released for direct sale (Section 9). Phase 1 residential product itself is 100 units of 4-bedroom luxury duplexes, each on a 500 sqm plot, including:</w:t>
+        <w:t xml:space="preserve">The 22-hectare Golf Estate Residential zone houses the Phase 1 duplex product together with additional site-and-serviced plots released for direct sale (Section 12). Phase 1 residential product itself is 100 units of 4-bedroom luxury duplexes, each on a 500 sqm plot, including:</w:t>
       </w:r>
     </w:p>
     <w:p>
@@ -2948,7 +3018,7 @@
         <w:spacing w:after="90"/>
       </w:pPr>
       <w:r>
-        <w:t xml:space="preserve">Direct plot and duplex sales (Section 7) remain the primary entry point for both audiences.</w:t>
+        <w:t xml:space="preserve">Direct plot and duplex sales (Section 9) remain the primary entry point for both audiences.</w:t>
       </w:r>
     </w:p>
     <w:p>
@@ -2970,7 +3040,7 @@
         <w:jc w:val="both"/>
       </w:pPr>
       <w:r>
-        <w:t xml:space="preserve">This dual-track approach lets the project raise capital broadly across retail buyers (plots/duplexes) and larger investors (Phase 2/3 income assets) without relying on any single investor class to reach the ₦50 billion Phase 1 revenue target in Section 7.</w:t>
+        <w:t xml:space="preserve">This dual-track approach lets the project raise capital broadly across retail buyers (plots/duplexes) and larger investors (Phase 2/3 income assets) without relying on any single investor class to reach the ₦50 billion Phase 1 revenue target in Section 9.</w:t>
       </w:r>
     </w:p>
     <w:p>
@@ -4198,7 +4268,7 @@
           <w:sz w:val="18"/>
           <w:szCs w:val="18"/>
         </w:rPr>
-        <w:t xml:space="preserve">The ₦50 billion Phase 1 land-sale revenue figure is treated as the base-case, conservative revenue line for this plan. Duplex sales and Phase 2/3 hospitality, retail and healthcare income are real, additional revenue streams but are deliberately excluded from the base-case ROI calculation in Section 8 so that the headline return is not overstated.</w:t>
+        <w:t xml:space="preserve">The ₦50 billion Phase 1 land-sale revenue figure is treated as the base-case, conservative revenue line for this plan. Duplex sales and Phase 2/3 hospitality, retail and healthcare income are real, additional revenue streams but are deliberately excluded from the base-case ROI calculation in Section 10 so that the headline return is not overstated.</w:t>
       </w:r>
     </w:p>
     <w:p>
@@ -4230,7 +4300,7 @@
         <w:jc w:val="both"/>
       </w:pPr>
       <w:r>
-        <w:t xml:space="preserve">Using only the costs explicitly stated in the brief — land acquisition (₦2.5B) and duplex construction (₦15B), total ₦17.5B — against the ₦50B Phase 1 land-sale revenue target:</w:t>
+        <w:t xml:space="preserve">Using only the costs explicitly stated in the brief — land acquisition (₦2.5B) and duplex construction (₦15B), total ₦17.5B — against the ₦50B Phase 1 land-sale revenue target (500 plots × ₦100M per 500 sqm plot, Section 9.2):</w:t>
       </w:r>
     </w:p>
     <w:tbl>
@@ -6314,7 +6384,7 @@
         <w:jc w:val="both"/>
       </w:pPr>
       <w:r>
-        <w:t xml:space="preserve">The ₦50 billion Phase 1 land-sale target implies an average price of roughly ₦294,000 per sqm across the estimated 17 hectares of site-and-serviced plots being sold directly (the remaining ~5 hectares of the 22-hectare residential zone is the footprint of the 100 duplexes themselves). On a standard 500 sqm plot, that is approximately ₦147 million per plot — in the same order of magnitude as the ₦150M duplex carcass-construction cost used elsewhere in this plan, which is an internally consistent planning assumption.</w:t>
+        <w:t xml:space="preserve">The confirmed ₦100,000,000 price for a 500 sqm site-and-serviced plot (₦200,000/sqm, Section 9.2) is the basis for the ₦50 billion Phase 1 revenue target: 500 such plots sold across roughly 25 hectares of the residential zone. This is a firmer basis than a top-line revenue figure alone, and is comfortably below the ₦150M duplex carcass-construction cost used elsewhere in this plan for a similarly-sized 500 sqm plot — as expected, since raw serviced land should price below a fully-built structure on the same footprint.</w:t>
       </w:r>
     </w:p>
     <w:p>
@@ -6330,7 +6400,7 @@
           <w:sz w:val="18"/>
           <w:szCs w:val="18"/>
         </w:rPr>
-        <w:t xml:space="preserve">Against the broader FCT land market, raw/unserviced land in peri-urban corridors like Bwari typically trades far below this (roughly ₦20,000–₦80,000/sqm), while prime central districts (Maitama, Asokoro, Wuse 2) trade well above it (₦300,000–₦600,000+/sqm). The ₦294,000/sqm assumption sits in between — consistent with premium, amenity-anchored estates (golf course, hospital, school, hotel, full security) commanding a significant premium over raw surrounding land, a pattern also seen in comparable golf-anchored estates elsewhere in Nigeria. This is the core commercial logic behind the pricing, but it should be confirmed against actual Bwari-corridor comparables by a licensed valuer before the plots are priced and released.</w:t>
+        <w:t xml:space="preserve">Against the broader FCT land market, raw/unserviced land in peri-urban corridors like Bwari typically trades far below this (roughly ₦20,000–₦80,000/sqm), while prime central districts (Maitama, Asokoro, Wuse 2) trade well above it (₦300,000–₦600,000+/sqm). The ₦200,000/sqm assumption sits comfortably within the premium, amenity-anchored estate band — well below prime-district pricing, yet a credible premium over raw peri-urban land, consistent with golf course, hospital, school, hotel and full security driving the pricing rather than location alone. This is the core commercial logic behind the pricing, and it is a more conservative figure than initial estimates suggested, but it should still be confirmed against actual Bwari-corridor comparables by a licensed valuer before the plots are priced and released.</w:t>
       </w:r>
     </w:p>
     <w:p>
@@ -6563,7 +6633,7 @@
         <w:jc w:val="both"/>
       </w:pPr>
       <w:r>
-        <w:t xml:space="preserve">These items are treated as pre-conditions to the Phase 1 launch date used in the timeline in Section 5, and should be tracked on a dedicated compliance checklist owned by the project's legal counsel.</w:t>
+        <w:t xml:space="preserve">These items are treated as pre-conditions to the Phase 1 launch date used in the timeline in Section 7, and should be tracked on a dedicated compliance checklist owned by the project's legal counsel.</w:t>
       </w:r>
     </w:p>
     <w:p>
@@ -6704,7 +6774,7 @@
         <w:spacing w:after="90"/>
       </w:pPr>
       <w:r>
-        <w:t xml:space="preserve">Flexible payment plans (deposit plus installments tied to construction milestones) to widen the buyer pool and support the phased self-funding structure described in Section 5.</w:t>
+        <w:t xml:space="preserve">Flexible payment plans (deposit plus installments tied to construction milestones) to widen the buyer pool and support the phased self-funding structure described in Section 7.</w:t>
       </w:r>
     </w:p>
     <w:p>
@@ -6727,7 +6797,7 @@
         <w:spacing w:after="120" w:before="200"/>
       </w:pPr>
       <w:r>
-        <w:t xml:space="preserve">13.1 Sponsor</w:t>
+        <w:t xml:space="preserve">13.1 Founder &amp; Executive Vice Chairman</w:t>
       </w:r>
     </w:p>
     <w:p>
@@ -6736,7 +6806,7 @@
         <w:jc w:val="both"/>
       </w:pPr>
       <w:r>
-        <w:t xml:space="preserve">The project is sponsored by BETONIQ WEST LTD, led by Tom Ugbodaga, Shareholder &amp; CEO. Tom holds an MSc in Computer Systems Security from the University of Gloucestershire, England (2011), and brings a technology-and-execution-led management approach to BETONIQ WEST LTD's ventures, of which this estate forms the flagship real estate development.</w:t>
+        <w:t xml:space="preserve">Air Vice Marshal Monday Riku Morgan (Rtd) is the Founder and Executive Vice Chairman of BETONIQ WEST LTD. His military and institutional pedigree provides board-level authority and credibility for the estate's investor and partnership engagements.</w:t>
       </w:r>
     </w:p>
     <w:p>
@@ -6745,7 +6815,25 @@
         <w:spacing w:after="120" w:before="200"/>
       </w:pPr>
       <w:r>
-        <w:t xml:space="preserve">13.2 Delivery Team</w:t>
+        <w:t xml:space="preserve">13.2 Managing Director (This Project)</w:t>
+      </w:r>
+    </w:p>
+    <w:p>
+      <w:pPr>
+        <w:spacing w:after="160" w:line="300"/>
+        <w:jc w:val="both"/>
+      </w:pPr>
+      <w:r>
+        <w:t xml:space="preserve">Tom Ugbodaga serves as Managing Director (MD) for this project, overseeing day-to-day execution, investor engagement and delivery on behalf of BETONIQ WEST LTD. Tom holds an MSc in Computer Systems Security from the University of Gloucestershire, England (2011), and brings a technology-and-execution-led management approach to BETONIQ WEST LTD's ventures, of which this estate forms the flagship real estate development.</w:t>
+      </w:r>
+    </w:p>
+    <w:p>
+      <w:pPr>
+        <w:pStyle w:val="Heading2"/>
+        <w:spacing w:after="120" w:before="200"/>
+      </w:pPr>
+      <w:r>
+        <w:t xml:space="preserve">13.3 Delivery Team</w:t>
       </w:r>
     </w:p>
     <w:p>
@@ -6758,7 +6846,7 @@
         <w:spacing w:after="90"/>
       </w:pPr>
       <w:r>
-        <w:t xml:space="preserve">Project Sponsor / Development Lead — BETONIQ WEST LTD (Tom Ugbodaga, Shareholder &amp; CEO).</w:t>
+        <w:t xml:space="preserve">Founder &amp; Executive Vice Chairman, BETONIQ WEST LTD — Air Vice Marshal Monday Riku Morgan (Rtd).</w:t>
       </w:r>
     </w:p>
     <w:p>
@@ -6771,7 +6859,7 @@
         <w:spacing w:after="90"/>
       </w:pPr>
       <w:r>
-        <w:t xml:space="preserve">Golf Course Architect — to be engaged for the 18-hole, lakes-and-fairways layout referenced in Section 4.</w:t>
+        <w:t xml:space="preserve">Managing Director (this project) — Tom Ugbodaga.</w:t>
       </w:r>
     </w:p>
     <w:p>
@@ -6784,7 +6872,7 @@
         <w:spacing w:after="90"/>
       </w:pPr>
       <w:r>
-        <w:t xml:space="preserve">Masterplanning &amp; Architectural Consultant — responsible for the residential, hospitality and healthcare typologies across all three phases.</w:t>
+        <w:t xml:space="preserve">Golf Course Architect — to be engaged for the 18-hole, lakes-and-fairways layout referenced in Section 4.</w:t>
       </w:r>
     </w:p>
     <w:p>
@@ -6797,7 +6885,7 @@
         <w:spacing w:after="90"/>
       </w:pPr>
       <w:r>
-        <w:t xml:space="preserve">Quantity Surveyor / Cost Consultant — responsible for firming up the cost buffer identified in Section 8.</w:t>
+        <w:t xml:space="preserve">Masterplanning &amp; Architectural Consultant — responsible for the residential, hospitality and healthcare typologies across all three phases.</w:t>
       </w:r>
     </w:p>
     <w:p>
@@ -6810,7 +6898,7 @@
         <w:spacing w:after="90"/>
       </w:pPr>
       <w:r>
-        <w:t xml:space="preserve">Legal Counsel — responsible for the land title and regulatory workstream in Section 9.</w:t>
+        <w:t xml:space="preserve">Quantity Surveyor / Cost Consultant — responsible for firming up the cost buffer identified in Section 10.</w:t>
       </w:r>
     </w:p>
     <w:p>
@@ -6823,7 +6911,20 @@
         <w:spacing w:after="90"/>
       </w:pPr>
       <w:r>
-        <w:t xml:space="preserve">Sales &amp; Marketing Lead — responsible for executing the strategy in Section 10.</w:t>
+        <w:t xml:space="preserve">Legal Counsel — responsible for the land title and regulatory workstream in Section 11.</w:t>
+      </w:r>
+    </w:p>
+    <w:p>
+      <w:pPr>
+        <w:pStyle w:val="ListParagraph"/>
+        <w:numPr>
+          <w:ilvl w:val="0"/>
+          <w:numId w:val="2"/>
+        </w:numPr>
+        <w:spacing w:after="90"/>
+      </w:pPr>
+      <w:r>
+        <w:t xml:space="preserve">Sales &amp; Marketing Lead — responsible for executing the strategy in Section 12.</w:t>
       </w:r>
     </w:p>
     <w:p>
@@ -6949,39 +7050,6 @@
               <w:t xml:space="preserve">Four-pillar concept (Live/Work/Heal/Relax) broadens the buyer base</w:t>
             </w:r>
           </w:p>
-        </w:tc>
-        <w:tc>
-          <w:tcPr>
-            <w:tcW w:type="dxa" w:w="5040"/>
-            <w:tcBorders>
-              <w:top w:val="single" w:color="CCCCCC" w:sz="2"/>
-              <w:left w:val="single" w:color="CCCCCC" w:sz="2"/>
-              <w:bottom w:val="single" w:color="CCCCCC" w:sz="2"/>
-              <w:right w:val="single" w:color="CCCCCC" w:sz="2"/>
-            </w:tcBorders>
-            <w:shd w:fill="FBE9E9" w:val="clear"/>
-            <w:tcMar>
-              <w:top w:type="dxa" w:w="120"/>
-              <w:left w:type="dxa" w:w="140"/>
-              <w:bottom w:type="dxa" w:w="120"/>
-              <w:right w:type="dxa" w:w="140"/>
-            </w:tcMar>
-          </w:tcPr>
-          <w:p>
-            <w:pPr>
-              <w:spacing w:after="100"/>
-            </w:pPr>
-            <w:r>
-              <w:rPr>
-                <w:b/>
-                <w:bCs/>
-                <w:color w:val="0F2A3D"/>
-                <w:sz w:val="22"/>
-                <w:szCs w:val="22"/>
-              </w:rPr>
-              <w:t xml:space="preserve">Weaknesses</w:t>
-            </w:r>
-          </w:p>
           <w:p>
             <w:pPr>
               <w:pStyle w:val="ListParagraph"/>
@@ -6996,7 +7064,40 @@
                 <w:sz w:val="19"/>
                 <w:szCs w:val="19"/>
               </w:rPr>
-              <w:t xml:space="preserve">27 ha golf course uses a resort-style routing, not full championship length</w:t>
+              <w:t xml:space="preserve">₦50B revenue target is anchored in a concrete, benchmarked unit price (₦100M / ₦200,000 per sqm for a 500 sqm serviced plot, Section 9.2), not an unsupported top-line figure</w:t>
+            </w:r>
+          </w:p>
+        </w:tc>
+        <w:tc>
+          <w:tcPr>
+            <w:tcW w:type="dxa" w:w="5040"/>
+            <w:tcBorders>
+              <w:top w:val="single" w:color="CCCCCC" w:sz="2"/>
+              <w:left w:val="single" w:color="CCCCCC" w:sz="2"/>
+              <w:bottom w:val="single" w:color="CCCCCC" w:sz="2"/>
+              <w:right w:val="single" w:color="CCCCCC" w:sz="2"/>
+            </w:tcBorders>
+            <w:shd w:fill="FBE9E9" w:val="clear"/>
+            <w:tcMar>
+              <w:top w:type="dxa" w:w="120"/>
+              <w:left w:type="dxa" w:w="140"/>
+              <w:bottom w:type="dxa" w:w="120"/>
+              <w:right w:type="dxa" w:w="140"/>
+            </w:tcMar>
+          </w:tcPr>
+          <w:p>
+            <w:pPr>
+              <w:spacing w:after="100"/>
+            </w:pPr>
+            <w:r>
+              <w:rPr>
+                <w:b/>
+                <w:bCs/>
+                <w:color w:val="0F2A3D"/>
+                <w:sz w:val="22"/>
+                <w:szCs w:val="22"/>
+              </w:rPr>
+              <w:t xml:space="preserve">Weaknesses</w:t>
             </w:r>
           </w:p>
           <w:p>
@@ -7013,7 +7114,7 @@
                 <w:sz w:val="19"/>
                 <w:szCs w:val="19"/>
               </w:rPr>
-              <w:t xml:space="preserve">Several revenue lines (duplex sales, Phase 2/3 income) are not yet priced</w:t>
+              <w:t xml:space="preserve">27 ha golf course uses a resort-style routing, not full championship length</w:t>
             </w:r>
           </w:p>
           <w:p>
@@ -7030,7 +7131,41 @@
                 <w:sz w:val="19"/>
                 <w:szCs w:val="19"/>
               </w:rPr>
+              <w:t xml:space="preserve">Several revenue lines (duplex sales, Phase 2/3 income) are not yet priced</w:t>
+            </w:r>
+          </w:p>
+          <w:p>
+            <w:pPr>
+              <w:pStyle w:val="ListParagraph"/>
+              <w:numPr>
+                <w:ilvl w:val="0"/>
+                <w:numId w:val="2"/>
+              </w:numPr>
+              <w:spacing w:after="60"/>
+            </w:pPr>
+            <w:r>
+              <w:rPr>
+                <w:sz w:val="19"/>
+                <w:szCs w:val="19"/>
+              </w:rPr>
               <w:t xml:space="preserve">Dependent on land title perfection and FCDA approvals before launch</w:t>
+            </w:r>
+          </w:p>
+          <w:p>
+            <w:pPr>
+              <w:pStyle w:val="ListParagraph"/>
+              <w:numPr>
+                <w:ilvl w:val="0"/>
+                <w:numId w:val="2"/>
+              </w:numPr>
+              <w:spacing w:after="60"/>
+            </w:pPr>
+            <w:r>
+              <w:rPr>
+                <w:sz w:val="19"/>
+                <w:szCs w:val="19"/>
+              </w:rPr>
+              <w:t xml:space="preserve">500 modeled plots (~25 ha) plus the 100 duplexes (~5 ha) run slightly above the 22 ha residential zone in Section 3 — final plot count/zoning needs survey confirmation</w:t>
             </w:r>
           </w:p>
         </w:tc>
@@ -8047,7 +8182,7 @@
         <w:jc w:val="both"/>
       </w:pPr>
       <w:r>
-        <w:t xml:space="preserve">Because the residential land-sale program (Section 7–8) is designed to clear the 20% ROI floor on its own, the sponsor retains full flexibility on the timing and structure of any exit from the Phase 2/3 income-producing assets, rather than needing to sell them to meet the project's core return target.</w:t>
+        <w:t xml:space="preserve">Because the residential land-sale program (Section 9–10) is designed to clear the 20% ROI floor on its own, the sponsor retains full flexibility on the timing and structure of any exit from the Phase 2/3 income-producing assets, rather than needing to sell them to meet the project's core return target.</w:t>
       </w:r>
     </w:p>
     <w:p>
@@ -8109,7 +8244,7 @@
         <w:spacing w:after="90"/>
       </w:pPr>
       <w:r>
-        <w:t xml:space="preserve">Commission detailed QS costing for golf course, clubhouse and site infrastructure to firm up the cost buffer in Section 8.</w:t>
+        <w:t xml:space="preserve">Commission detailed QS costing for golf course, clubhouse and site infrastructure to firm up the cost buffer in Section 10.</w:t>
       </w:r>
     </w:p>
     <w:p>
@@ -8245,7 +8380,7 @@
         <w:spacing w:after="90"/>
       </w:pPr>
       <w:r>
-        <w:t xml:space="preserve">Duplex sale prices and Phase 2/3 (hotel, shopping village, hospital, apartments) revenue were not specified in the brief and are therefore excluded from the base-case ROI in Section 8, and should be added once pricing is defined.</w:t>
+        <w:t xml:space="preserve">Duplex sale prices and Phase 2/3 (hotel, shopping village, hospital, apartments) revenue were not specified in the brief and are therefore excluded from the base-case ROI in Section 10, and should be added once pricing is defined.</w:t>
       </w:r>
     </w:p>
     <w:p>

</xml_diff>